<commit_message>
Added ruff and ty
</commit_message>
<xml_diff>
--- a/docs/pdfs/Abstract_TFM_GerardPascualFontanilles.docx
+++ b/docs/pdfs/Abstract_TFM_GerardPascualFontanilles.docx
@@ -4,7 +4,7 @@
   <w:body>
     <w:p>
       <w:pPr>
-        <w:pStyle w:val="141"/>
+        <w:pStyle w:val="839"/>
         <w:pBdr>
           <w:top w:val="none" w:color="000000" w:sz="4" w:space="0"/>
           <w:left w:val="none" w:color="000000" w:sz="4" w:space="0"/>
@@ -66,10 +66,16 @@
           <w:szCs w:val="24"/>
         </w:rPr>
       </w:r>
+      <w:r>
+        <w:rPr>
+          <w:sz w:val="28"/>
+          <w:szCs w:val="24"/>
+        </w:rPr>
+      </w:r>
     </w:p>
     <w:p>
       <w:pPr>
-        <w:pStyle w:val="141"/>
+        <w:pStyle w:val="839"/>
         <w:pBdr>
           <w:top w:val="none" w:color="000000" w:sz="4" w:space="0"/>
           <w:left w:val="none" w:color="000000" w:sz="4" w:space="0"/>
@@ -136,13 +142,6 @@
           <w:sz w:val="24"/>
         </w:rPr>
         <w:t xml:space="preserve"> </w:t>
-      </w:r>
-      <w:r>
-        <w:rPr>
-          <w:rFonts w:ascii="Arial" w:hAnsi="Arial" w:eastAsia="Arial" w:cs="Arial"/>
-          <w:color w:val="1f1f1f"/>
-          <w:sz w:val="24"/>
-        </w:rPr>
       </w:r>
       <w:r>
         <w:rPr>
@@ -227,6 +226,14 @@
           <w:u w:val="single"/>
         </w:rPr>
       </w:r>
+      <w:r>
+        <w:rPr>
+          <w:rFonts w:ascii="Arial" w:hAnsi="Arial" w:eastAsia="Arial" w:cs="Arial"/>
+          <w:color w:val="1f1f1f"/>
+          <w:sz w:val="24"/>
+          <w:szCs w:val="24"/>
+        </w:rPr>
+      </w:r>
     </w:p>
     <w:p>
       <w:pPr>
@@ -242,7 +249,7 @@
           <w:rFonts w:ascii="Arial" w:hAnsi="Arial" w:eastAsia="Arial" w:cs="Arial"/>
           <w:sz w:val="24"/>
           <w:szCs w:val="24"/>
-          <w:u w:val="single"/>
+          <w:u w:val="none"/>
         </w:rPr>
       </w:pPr>
       <w:r>
@@ -258,7 +265,7 @@
           <w:rFonts w:ascii="Arial" w:hAnsi="Arial" w:eastAsia="Arial" w:cs="Arial"/>
           <w:color w:val="1f1f1f"/>
           <w:sz w:val="24"/>
-          <w:u w:val="single"/>
+          <w:u w:val="none"/>
         </w:rPr>
         <w:t xml:space="preserve"> </w:t>
       </w:r>
@@ -267,7 +274,7 @@
           <w:rFonts w:ascii="Arial" w:hAnsi="Arial" w:eastAsia="Arial" w:cs="Arial"/>
           <w:color w:val="1f1f1f"/>
           <w:sz w:val="24"/>
-          <w:u w:val="single"/>
+          <w:u w:val="none"/>
         </w:rPr>
         <w:t xml:space="preserve">una representació vectorial de l'estat que inclo</w:t>
       </w:r>
@@ -276,7 +283,7 @@
           <w:rFonts w:ascii="Arial" w:hAnsi="Arial" w:eastAsia="Arial" w:cs="Arial"/>
           <w:color w:val="1f1f1f"/>
           <w:sz w:val="24"/>
-          <w:u w:val="single"/>
+          <w:u w:val="none"/>
         </w:rPr>
         <w:t xml:space="preserve">u estadístiques, tipus, condicions de camp i historial d'accions</w:t>
       </w:r>
@@ -285,7 +292,7 @@
           <w:rFonts w:ascii="Arial" w:hAnsi="Arial" w:eastAsia="Arial" w:cs="Arial"/>
           <w:color w:val="1f1f1f"/>
           <w:sz w:val="24"/>
-          <w:u w:val="single"/>
+          <w:u w:val="none"/>
         </w:rPr>
         <w:t xml:space="preserve">; (2) una arquitectura neuronal (p. ex., xarxa recurrent o </w:t>
       </w:r>
@@ -295,7 +302,7 @@
           <w:i/>
           <w:color w:val="1f1f1f"/>
           <w:sz w:val="24"/>
-          <w:u w:val="single"/>
+          <w:u w:val="none"/>
         </w:rPr>
         <w:t xml:space="preserve">encoder</w:t>
       </w:r>
@@ -304,7 +311,7 @@
           <w:rFonts w:ascii="Arial" w:hAnsi="Arial" w:eastAsia="Arial" w:cs="Arial"/>
           <w:color w:val="1f1f1f"/>
           <w:sz w:val="24"/>
-          <w:u w:val="single"/>
+          <w:u w:val="none"/>
         </w:rPr>
         <w:t xml:space="preserve"> + </w:t>
       </w:r>
@@ -314,7 +321,7 @@
           <w:i/>
           <w:color w:val="1f1f1f"/>
           <w:sz w:val="24"/>
-          <w:u w:val="single"/>
+          <w:u w:val="none"/>
         </w:rPr>
         <w:t xml:space="preserve">policy network</w:t>
       </w:r>
@@ -323,7 +330,7 @@
           <w:rFonts w:ascii="Arial" w:hAnsi="Arial" w:eastAsia="Arial" w:cs="Arial"/>
           <w:color w:val="1f1f1f"/>
           <w:sz w:val="24"/>
-          <w:u w:val="single"/>
+          <w:u w:val="none"/>
         </w:rPr>
         <w:t xml:space="preserve">) per captar dependències temporals i la parcialitat de la informació; i (3) estratègies d'entrenament basades en </w:t>
       </w:r>
@@ -333,7 +340,7 @@
           <w:i/>
           <w:color w:val="1f1f1f"/>
           <w:sz w:val="24"/>
-          <w:u w:val="single"/>
+          <w:u w:val="none"/>
         </w:rPr>
         <w:t xml:space="preserve">self-play</w:t>
       </w:r>
@@ -342,7 +349,7 @@
           <w:rFonts w:ascii="Arial" w:hAnsi="Arial" w:eastAsia="Arial" w:cs="Arial"/>
           <w:color w:val="1f1f1f"/>
           <w:sz w:val="24"/>
-          <w:u w:val="single"/>
+          <w:u w:val="none"/>
         </w:rPr>
         <w:t xml:space="preserve"> i algorismes </w:t>
       </w:r>
@@ -352,7 +359,7 @@
           <w:i/>
           <w:color w:val="1f1f1f"/>
           <w:sz w:val="24"/>
-          <w:u w:val="single"/>
+          <w:u w:val="none"/>
         </w:rPr>
         <w:t xml:space="preserve">actor-crític</w:t>
       </w:r>
@@ -361,16 +368,23 @@
           <w:rFonts w:ascii="Arial" w:hAnsi="Arial" w:eastAsia="Arial" w:cs="Arial"/>
           <w:color w:val="1f1f1f"/>
           <w:sz w:val="24"/>
-          <w:u w:val="single"/>
+          <w:u w:val="none"/>
         </w:rPr>
         <w:t xml:space="preserve"> (com PPO), complementats potencialment amb components d'aprenentatge supervisat per a la predicció de moviments rivals.</w:t>
       </w:r>
       <w:r>
         <w:rPr>
-          <w:u w:val="single"/>
+          <w:u w:val="none"/>
         </w:rPr>
       </w:r>
-      <w:r/>
+      <w:r>
+        <w:rPr>
+          <w:rFonts w:ascii="Arial" w:hAnsi="Arial" w:eastAsia="Arial" w:cs="Arial"/>
+          <w:sz w:val="24"/>
+          <w:szCs w:val="24"/>
+          <w:u w:val="none"/>
+        </w:rPr>
+      </w:r>
     </w:p>
     <w:p>
       <w:pPr>
@@ -383,7 +397,7 @@
         <w:spacing w:after="240" w:before="0" w:line="276" w:lineRule="auto"/>
         <w:ind w:right="0" w:firstLine="0" w:left="0"/>
         <w:rPr>
-          <w:u w:val="single"/>
+          <w:u w:val="none"/>
         </w:rPr>
       </w:pPr>
       <w:r>
@@ -391,7 +405,7 @@
           <w:rFonts w:ascii="Arial" w:hAnsi="Arial" w:eastAsia="Arial" w:cs="Arial"/>
           <w:color w:val="1f1f1f"/>
           <w:sz w:val="24"/>
-          <w:u w:val="single"/>
+          <w:u w:val="none"/>
         </w:rPr>
       </w:r>
       <w:r>
@@ -399,39 +413,54 @@
           <w:rFonts w:ascii="Arial" w:hAnsi="Arial" w:eastAsia="Arial" w:cs="Arial"/>
           <w:color w:val="1f1f1f"/>
           <w:sz w:val="24"/>
-          <w:u w:val="single"/>
+          <w:u w:val="none"/>
         </w:rPr>
-        <w:t xml:space="preserve">L'avaluació es durà a terme en un entorn de simulació local controlat. S'analitzarà el rendiment quantitatiu de l'agent (taxa de victòries i recompensa mitjana acumulada) enfront d'una bateria d'agents basats en regles (scripted baselines) que implementen h</w:t>
+        <w:t xml:space="preserve">L</w:t>
       </w:r>
       <w:r>
         <w:rPr>
           <w:rFonts w:ascii="Arial" w:hAnsi="Arial" w:eastAsia="Arial" w:cs="Arial"/>
           <w:color w:val="1f1f1f"/>
           <w:sz w:val="24"/>
-          <w:u w:val="single"/>
+          <w:u w:val="none"/>
         </w:rPr>
-        <w:t xml:space="preserve">eurístiques competitives estàndard. Addicionalment, es realitzaran estudis d'ablació (ablation studies) per determinar la contribució de cada mòdul de l'arquitectura. Qualitativament, s'examinarà l'emergència de comportaments avançats com la predicció de ca</w:t>
+        <w:t xml:space="preserve">'avaluació es durà a terme en un entorn de simulació local controlat. S'analitzarà el rendiment quantitatiu de l'agent (taxa de victòries i recompensa mitjana acumulada) enfront d'una bateria d'agents basats en regles (scripted baselines) que implementen h</w:t>
       </w:r>
       <w:r>
         <w:rPr>
           <w:rFonts w:ascii="Arial" w:hAnsi="Arial" w:eastAsia="Arial" w:cs="Arial"/>
           <w:color w:val="1f1f1f"/>
           <w:sz w:val="24"/>
-          <w:u w:val="single"/>
+          <w:u w:val="none"/>
         </w:rPr>
-        <w:t xml:space="preserve">nvis de Pokémon (switch prediction) i la gestió del risc, discutint finalment la viabilitat computacional i les limitacions del model proposat.</w:t>
+        <w:t xml:space="preserve">e</w:t>
       </w:r>
       <w:r>
         <w:rPr>
           <w:rFonts w:ascii="Arial" w:hAnsi="Arial" w:eastAsia="Arial" w:cs="Arial"/>
           <w:color w:val="1f1f1f"/>
           <w:sz w:val="24"/>
-          <w:u w:val="single"/>
+          <w:u w:val="none"/>
+        </w:rPr>
+        <w:t xml:space="preserve">urístiques competitives estàndard. Addicionalment, es realitzaran estudis d'ablació (ablation studies) per determinar la contribució de cada mòdul de l'arquitectura. Qualitativament, s'examinarà l'emergència de comportaments avançats com la predicció de ca</w:t>
+      </w:r>
+      <w:r>
+        <w:rPr>
+          <w:rFonts w:ascii="Arial" w:hAnsi="Arial" w:eastAsia="Arial" w:cs="Arial"/>
+          <w:color w:val="1f1f1f"/>
+          <w:sz w:val="24"/>
+          <w:u w:val="none"/>
+        </w:rPr>
+        <w:t xml:space="preserve">nvis de Pokémon (switch prediction) i la gestió del risc, discutint finalment la viabilitat computacional i les limitacions del model proposat.</w:t>
+      </w:r>
+      <w:r>
+        <w:rPr>
+          <w:u w:val="none"/>
         </w:rPr>
       </w:r>
       <w:r>
         <w:rPr>
-          <w:u w:val="single"/>
+          <w:u w:val="none"/>
         </w:rPr>
       </w:r>
     </w:p>
@@ -466,34 +495,9 @@
         </w:rPr>
         <w:t xml:space="preserve"> Deep Reinforcement Learning (DRL), POMDP, Teoria de Jocs, Sistemes Estocàstics, Pokémon VGC, Xarxes Neuronals.</w:t>
       </w:r>
-      <w:r/>
-      <w:r/>
-      <w:r/>
       <w:r>
         <w:rPr>
-          <w:rFonts w:ascii="Arial" w:hAnsi="Arial" w:eastAsia="Arial" w:cs="Arial"/>
-          <w:sz w:val="24"/>
-        </w:rPr>
-      </w:r>
-      <w:r>
-        <w:rPr>
-          <w:rFonts w:ascii="Arial" w:hAnsi="Arial" w:eastAsia="Arial" w:cs="Arial"/>
-          <w:sz w:val="24"/>
-          <w:szCs w:val="24"/>
-        </w:rPr>
-      </w:r>
-      <w:r>
-        <w:rPr>
-          <w:rFonts w:ascii="Arial" w:hAnsi="Arial" w:eastAsia="Arial" w:cs="Arial"/>
-          <w:sz w:val="24"/>
-          <w:szCs w:val="24"/>
-        </w:rPr>
-      </w:r>
-      <w:r>
-        <w:rPr>
-          <w:rFonts w:ascii="Arial" w:hAnsi="Arial" w:eastAsia="Arial" w:cs="Arial"/>
-          <w:sz w:val="24"/>
-          <w:szCs w:val="24"/>
+          <w:highlight w:val="none"/>
         </w:rPr>
       </w:r>
       <w:r>
@@ -548,6 +552,14 @@
           <w:u w:val="single"/>
         </w:rPr>
       </w:r>
+      <w:r>
+        <w:rPr>
+          <w:rFonts w:ascii="Arial" w:hAnsi="Arial" w:eastAsia="Arial" w:cs="Arial"/>
+          <w:sz w:val="24"/>
+          <w:szCs w:val="24"/>
+          <w:u w:val="single"/>
+        </w:rPr>
+      </w:r>
     </w:p>
     <w:p>
       <w:pPr>
@@ -574,7 +586,7 @@
           <w:szCs w:val="24"/>
           <w:u w:val="single"/>
         </w:rPr>
-        <w:t xml:space="preserve">La proposta integra una arquitectura escalable estructurada en diversos nivells de sofisticació. En primer lloc, (1) una representació d’estat rica i estructurada que combina vectorització explícita de variables del joc (estadístiques, tipus, objectes, cond</w:t>
+        <w:t xml:space="preserve">L</w:t>
       </w:r>
       <w:r>
         <w:rPr>
@@ -583,7 +595,25 @@
           <w:szCs w:val="24"/>
           <w:u w:val="single"/>
         </w:rPr>
-        <w:t xml:space="preserve">icions de camp, estat de salut, velocitat efectiva, etc.) amb embeddings apresos per a moviments i espècies, així com una codificació de l’historial d’accions per capturar dependències temporals. Aquesta representació permet tractar l’entorn competitiu de P</w:t>
+        <w:t xml:space="preserve">a proposta integra una arquitectura escalable estructurada en diversos nivells de sofisticació. En primer lloc, (1) una representació d’estat rica i estructurada que combina vectorització explícita de variables del joc (estadístiques, tipus, objectes, cond</w:t>
+      </w:r>
+      <w:r>
+        <w:rPr>
+          <w:rFonts w:ascii="Arial" w:hAnsi="Arial" w:eastAsia="Arial" w:cs="Arial"/>
+          <w:sz w:val="24"/>
+          <w:szCs w:val="24"/>
+          <w:u w:val="single"/>
+        </w:rPr>
+        <w:t xml:space="preserve">i</w:t>
+      </w:r>
+      <w:r>
+        <w:rPr>
+          <w:rFonts w:ascii="Arial" w:hAnsi="Arial" w:eastAsia="Arial" w:cs="Arial"/>
+          <w:sz w:val="24"/>
+          <w:szCs w:val="24"/>
+          <w:u w:val="single"/>
+        </w:rPr>
+        <w:t xml:space="preserve">cions de camp, estat de salut, velocitat efectiva, etc.) amb embeddings apresos per a moviments i espècies, així com una codificació de l’historial d’accions per capturar dependències temporals. Aquesta representació permet tractar l’entorn competitiu de P</w:t>
       </w:r>
       <w:r>
         <w:rPr>
@@ -596,8 +626,80 @@
       </w:r>
       <w:r>
         <w:rPr>
+          <w:rFonts w:ascii="Arial" w:hAnsi="Arial" w:eastAsia="Arial" w:cs="Arial"/>
+          <w:sz w:val="24"/>
+          <w:szCs w:val="24"/>
           <w:u w:val="single"/>
         </w:rPr>
+      </w:r>
+      <w:r>
+        <w:rPr>
+          <w:rFonts w:ascii="Arial" w:hAnsi="Arial" w:eastAsia="Arial" w:cs="Arial"/>
+          <w:sz w:val="24"/>
+          <w:szCs w:val="24"/>
+          <w:highlight w:val="none"/>
+          <w:u w:val="single"/>
+        </w:rPr>
+      </w:r>
+    </w:p>
+    <w:p>
+      <w:pPr>
+        <w:pBdr>
+          <w:top w:val="none" w:color="000000" w:sz="4" w:space="0"/>
+          <w:left w:val="none" w:color="000000" w:sz="4" w:space="0"/>
+          <w:bottom w:val="none" w:color="000000" w:sz="4" w:space="0"/>
+          <w:right w:val="none" w:color="000000" w:sz="4" w:space="0"/>
+        </w:pBdr>
+        <w:spacing w:after="240" w:before="0" w:line="276" w:lineRule="auto"/>
+        <w:ind w:right="0" w:firstLine="0" w:left="0"/>
+        <w:rPr>
+          <w:u w:val="single"/>
+        </w:rPr>
+      </w:pPr>
+      <w:r>
+        <w:rPr>
+          <w:rFonts w:ascii="Arial" w:hAnsi="Arial" w:eastAsia="Arial" w:cs="Arial"/>
+          <w:sz w:val="24"/>
+          <w:szCs w:val="24"/>
+          <w:u w:val="single"/>
+        </w:rPr>
+        <w:t xml:space="preserve">E</w:t>
+      </w:r>
+      <w:r>
+        <w:rPr>
+          <w:rFonts w:ascii="Arial" w:hAnsi="Arial" w:eastAsia="Arial" w:cs="Arial"/>
+          <w:sz w:val="24"/>
+          <w:szCs w:val="24"/>
+          <w:u w:val="single"/>
+        </w:rPr>
+        <w:t xml:space="preserve">n segon lloc, (2) una arquitectura neuronal basada en un esquema actor-crític profund que pot evolucionar des d’una xarxa feed-forward inicial fins a un model amb components recurrents (p. ex., LSTM o GRU) o mecanismes d’atenció, amb l’objectiu de capturar</w:t>
+      </w:r>
+      <w:r>
+        <w:rPr>
+          <w:rFonts w:ascii="Arial" w:hAnsi="Arial" w:eastAsia="Arial" w:cs="Arial"/>
+          <w:sz w:val="24"/>
+          <w:szCs w:val="24"/>
+          <w:u w:val="single"/>
+        </w:rPr>
+        <w:t xml:space="preserve"> </w:t>
+      </w:r>
+      <w:r>
+        <w:rPr>
+          <w:rFonts w:ascii="Arial" w:hAnsi="Arial" w:eastAsia="Arial" w:cs="Arial"/>
+          <w:sz w:val="24"/>
+          <w:szCs w:val="24"/>
+          <w:u w:val="single"/>
+        </w:rPr>
+        <w:t xml:space="preserve">la parcialitat de la informació i la dinàmica temporal del combat. En la versió més avançada, s’explora la incorporació explícita d’un mòdul d’“opponent modeling” capaç d’estimar una distribució sobre possibles equips i moviments rivals, integrat dins la p</w:t>
+      </w:r>
+      <w:r>
+        <w:rPr>
+          <w:rFonts w:ascii="Arial" w:hAnsi="Arial" w:eastAsia="Arial" w:cs="Arial"/>
+          <w:sz w:val="24"/>
+          <w:szCs w:val="24"/>
+          <w:u w:val="single"/>
+        </w:rPr>
+        <w:t xml:space="preserve">olítica mitjançant aprenentatge multi-tasca.</w:t>
       </w:r>
       <w:r>
         <w:rPr>
@@ -612,14 +714,6 @@
           <w:u w:val="single"/>
         </w:rPr>
       </w:r>
-      <w:r>
-        <w:rPr>
-          <w:rFonts w:ascii="Arial" w:hAnsi="Arial" w:eastAsia="Arial" w:cs="Arial"/>
-          <w:sz w:val="24"/>
-          <w:szCs w:val="24"/>
-          <w:u w:val="single"/>
-        </w:rPr>
-      </w:r>
     </w:p>
     <w:p>
       <w:pPr>
@@ -642,7 +736,7 @@
           <w:szCs w:val="24"/>
           <w:u w:val="single"/>
         </w:rPr>
-        <w:t xml:space="preserve">En segon lloc, (2) una arquitectura neuronal basada en un esquema actor-crític profund que pot evolucionar des d’una xarxa feed-forward inicial fins a un model amb components recurrents (p. ex., LSTM o GRU) o mecanismes d’atenció, amb l’objectiu de capturar</w:t>
+        <w:t xml:space="preserve">F</w:t>
       </w:r>
       <w:r>
         <w:rPr>
@@ -651,7 +745,7 @@
           <w:szCs w:val="24"/>
           <w:u w:val="single"/>
         </w:rPr>
-        <w:t xml:space="preserve"> la parcialitat de la informació i la dinàmica temporal del combat. En la versió més avançada, s’explora la incorporació explícita d’un mòdul d’“opponent modeling” capaç d’estimar una distribució sobre possibles equips i moviments rivals, integrat dins la p</w:t>
+        <w:t xml:space="preserve">inalment, (3) el procés d’entrenament es basa en tècniques de Deep Reinforcement Learning amb algoritmes actor-crític com Proximal Policy Optimization (PPO), combinant self-play progressiu, poblacions d’agents per evitar col·lapse estratègic i estratègies </w:t>
       </w:r>
       <w:r>
         <w:rPr>
@@ -660,12 +754,7 @@
           <w:szCs w:val="24"/>
           <w:u w:val="single"/>
         </w:rPr>
-        <w:t xml:space="preserve">olítica mitjançant aprenentatge multi-tasca.</w:t>
-      </w:r>
-      <w:r>
-        <w:rPr>
-          <w:u w:val="single"/>
-        </w:rPr>
+        <w:t xml:space="preserve">d</w:t>
       </w:r>
       <w:r>
         <w:rPr>
@@ -674,52 +763,7 @@
           <w:szCs w:val="24"/>
           <w:u w:val="single"/>
         </w:rPr>
-      </w:r>
-      <w:r>
-        <w:rPr>
-          <w:u w:val="single"/>
-        </w:rPr>
-      </w:r>
-      <w:r>
-        <w:rPr>
-          <w:rFonts w:ascii="Arial" w:hAnsi="Arial" w:eastAsia="Arial" w:cs="Arial"/>
-          <w:sz w:val="24"/>
-          <w:szCs w:val="24"/>
-          <w:u w:val="single"/>
-        </w:rPr>
-      </w:r>
-    </w:p>
-    <w:p>
-      <w:pPr>
-        <w:pBdr>
-          <w:top w:val="none" w:color="000000" w:sz="4" w:space="0"/>
-          <w:left w:val="none" w:color="000000" w:sz="4" w:space="0"/>
-          <w:bottom w:val="none" w:color="000000" w:sz="4" w:space="0"/>
-          <w:right w:val="none" w:color="000000" w:sz="4" w:space="0"/>
-        </w:pBdr>
-        <w:spacing w:after="240" w:before="0" w:line="276" w:lineRule="auto"/>
-        <w:ind w:right="0" w:firstLine="0" w:left="0"/>
-        <w:rPr>
-          <w:u w:val="single"/>
-        </w:rPr>
-      </w:pPr>
-      <w:r>
-        <w:rPr>
-          <w:rFonts w:ascii="Arial" w:hAnsi="Arial" w:eastAsia="Arial" w:cs="Arial"/>
-          <w:sz w:val="24"/>
-          <w:szCs w:val="24"/>
-          <w:u w:val="single"/>
-        </w:rPr>
-        <w:t xml:space="preserve">Finalment, (3) el procés d’entrenament es basa en tècniques de Deep Reinforcement Learning amb algoritmes actor-crític com Proximal Policy Optimization (PPO), combinant self-play progressiu, poblacions d’agents per evitar col·lapse estratègic i estratègies </w:t>
-      </w:r>
-      <w:r>
-        <w:rPr>
-          <w:rFonts w:ascii="Arial" w:hAnsi="Arial" w:eastAsia="Arial" w:cs="Arial"/>
-          <w:sz w:val="24"/>
-          <w:szCs w:val="24"/>
-          <w:u w:val="single"/>
-        </w:rPr>
-        <w:t xml:space="preserve">de curriculum learning. En una versió ampliada, el sistema pot inicialitzar-se mitjançant aprenentatge supervisat a partir de dades de combats reals del simulador Pokémon Showdown (behavioral cloning), amb posterior fine-tuning per reforç, així com integrar</w:t>
+        <w:t xml:space="preserve">e curriculum learning. En una versió ampliada, el sistema pot inicialitzar-se mitjançant aprenentatge supervisat a partir de dades de combats reals del simulador Pokémon Showdown (behavioral cloning), amb posterior fine-tuning per reforç, així com integrar</w:t>
       </w:r>
       <w:r>
         <w:rPr>
@@ -732,11 +776,6 @@
       </w:r>
       <w:r>
         <w:rPr>
-          <w:u w:val="single"/>
-        </w:rPr>
-      </w:r>
-      <w:r>
-        <w:rPr>
           <w:rFonts w:ascii="Arial" w:hAnsi="Arial" w:eastAsia="Arial" w:cs="Arial"/>
           <w:sz w:val="24"/>
           <w:szCs w:val="24"/>
@@ -745,14 +784,6 @@
       </w:r>
       <w:r>
         <w:rPr>
-          <w:u w:val="single"/>
-        </w:rPr>
-      </w:r>
-      <w:r>
-        <w:rPr>
-          <w:rFonts w:ascii="Arial" w:hAnsi="Arial" w:eastAsia="Arial" w:cs="Arial"/>
-          <w:sz w:val="24"/>
-          <w:szCs w:val="24"/>
           <w:u w:val="single"/>
         </w:rPr>
       </w:r>
@@ -1045,6 +1076,12 @@
           <w:u w:val="single"/>
         </w:rPr>
       </w:r>
+      <w:r>
+        <w:rPr>
+          <w:highlight w:val="none"/>
+          <w:u w:val="single"/>
+        </w:rPr>
+      </w:r>
     </w:p>
     <w:p>
       <w:pPr>
@@ -1063,7 +1100,14 @@
           <w:highlight w:val="none"/>
           <w:u w:val="single"/>
         </w:rPr>
-        <w:t xml:space="preserve">L'avaluació es durà a terme en un entorn de simulació local controlat utilitzant el motor de batalla de Pokémon Showdown, permetent executar partides de manera automatitzada i reproductible. L’anàlisi quantitativa del rendiment es basarà principalment en la</w:t>
+        <w:t xml:space="preserve">L</w:t>
+      </w:r>
+      <w:r>
+        <w:rPr>
+          <w:highlight w:val="none"/>
+          <w:u w:val="single"/>
+        </w:rPr>
+        <w:t xml:space="preserve">'avaluació es durà a terme en un entorn de simulació local controlat utilitzant el motor de batalla de Pokémon Showdown, permetent executar partides de manera automatitzada i reproductible. L’anàlisi quantitativa del rendiment es basarà principalment en la</w:t>
       </w:r>
       <w:r>
         <w:rPr>
@@ -1113,7 +1157,6 @@
         </w:rPr>
         <w:t xml:space="preserve">La bateria de comparació inclourà:</w:t>
       </w:r>
-      <w:r/>
       <w:r>
         <w:rPr>
           <w:highlight w:val="none"/>
@@ -1121,16 +1164,10 @@
         </w:rPr>
       </w:r>
       <w:r/>
-      <w:r>
-        <w:rPr>
-          <w:highlight w:val="none"/>
-          <w:u w:val="single"/>
-        </w:rPr>
-      </w:r>
     </w:p>
     <w:p>
       <w:pPr>
-        <w:pStyle w:val="668"/>
+        <w:pStyle w:val="900"/>
         <w:numPr>
           <w:ilvl w:val="0"/>
           <w:numId w:val="5"/>
@@ -1161,10 +1198,16 @@
           <w:u w:val="single"/>
         </w:rPr>
       </w:r>
+      <w:r>
+        <w:rPr>
+          <w:highlight w:val="none"/>
+          <w:u w:val="single"/>
+        </w:rPr>
+      </w:r>
     </w:p>
     <w:p>
       <w:pPr>
-        <w:pStyle w:val="668"/>
+        <w:pStyle w:val="900"/>
         <w:numPr>
           <w:ilvl w:val="0"/>
           <w:numId w:val="4"/>
@@ -1195,10 +1238,16 @@
           <w:u w:val="single"/>
         </w:rPr>
       </w:r>
+      <w:r>
+        <w:rPr>
+          <w:highlight w:val="none"/>
+          <w:u w:val="single"/>
+        </w:rPr>
+      </w:r>
     </w:p>
     <w:p>
       <w:pPr>
-        <w:pStyle w:val="668"/>
+        <w:pStyle w:val="900"/>
         <w:numPr>
           <w:ilvl w:val="0"/>
           <w:numId w:val="3"/>
@@ -1229,14 +1278,6 @@
           <w:u w:val="single"/>
         </w:rPr>
       </w:r>
-      <w:r/>
-      <w:r>
-        <w:rPr>
-          <w:highlight w:val="none"/>
-          <w:u w:val="single"/>
-        </w:rPr>
-      </w:r>
-      <w:r/>
       <w:r>
         <w:rPr>
           <w:highlight w:val="none"/>
@@ -1261,7 +1302,14 @@
           <w:highlight w:val="none"/>
           <w:u w:val="single"/>
         </w:rPr>
-        <w:t xml:space="preserve">Els estudis d’ablació consistiran en entrenar variants reduïdes del model eliminant un únic component cada vegada (p. ex., sense historial d’accions o sense recompensa intermèdia) i mesurar la diferència de rendiment respecte al model complet. Això permetrà</w:t>
+        <w:t xml:space="preserve">E</w:t>
+      </w:r>
+      <w:r>
+        <w:rPr>
+          <w:highlight w:val="none"/>
+          <w:u w:val="single"/>
+        </w:rPr>
+        <w:t xml:space="preserve">ls estudis d’ablació consistiran en entrenar variants reduïdes del model eliminant un únic component cada vegada (p. ex., sense historial d’accions o sense recompensa intermèdia) i mesurar la diferència de rendiment respecte al model complet. Això permetrà</w:t>
       </w:r>
       <w:r>
         <w:rPr>
@@ -1270,7 +1318,6 @@
         </w:rPr>
         <w:t xml:space="preserve"> quantificar l’impacte real de cada decisió de disseny dins del marc experimental disponible.</w:t>
       </w:r>
-      <w:r/>
       <w:r>
         <w:rPr>
           <w:highlight w:val="none"/>
@@ -1278,12 +1325,6 @@
         </w:rPr>
       </w:r>
       <w:r/>
-      <w:r>
-        <w:rPr>
-          <w:highlight w:val="none"/>
-          <w:u w:val="single"/>
-        </w:rPr>
-      </w:r>
     </w:p>
     <w:p>
       <w:pPr>
@@ -1302,14 +1343,28 @@
           <w:highlight w:val="none"/>
           <w:u w:val="single"/>
         </w:rPr>
-        <w:t xml:space="preserve">L’anàlisi qualitativa es basarà en la inspecció d’un subconjunt representatiu de combats, identificant patrons estratègics com la realització de canvis predictius (switch prediction) o la presa de decisions de risc condicionades a l’estat del combat (p. ex.</w:t>
+        <w:t xml:space="preserve">L</w:t>
       </w:r>
       <w:r>
         <w:rPr>
           <w:highlight w:val="none"/>
           <w:u w:val="single"/>
         </w:rPr>
-        <w:t xml:space="preserve">, elecció de moviments amb menor precisió en situacions de desavantatge). Aquest anàlisi es complementarà amb mètriques simples, com la freqüència de canvis en situacions de pressió o el percentatge d’accions d’alt risc en funció del diferencial de recursos</w:t>
+        <w:t xml:space="preserve">’anàlisi qualitativa es basarà en la inspecció d’un subconjunt representatiu de combats, identificant patrons estratègics com la realització de canvis predictius (switch prediction) o la presa de decisions de risc condicionades a l’estat del combat (p. ex.</w:t>
+      </w:r>
+      <w:r>
+        <w:rPr>
+          <w:highlight w:val="none"/>
+          <w:u w:val="single"/>
+        </w:rPr>
+        <w:t xml:space="preserve">,</w:t>
+      </w:r>
+      <w:r>
+        <w:rPr>
+          <w:highlight w:val="none"/>
+          <w:u w:val="single"/>
+        </w:rPr>
+        <w:t xml:space="preserve"> elecció de moviments amb menor precisió en situacions de desavantatge). Aquest anàlisi es complementarà amb mètriques simples, com la freqüència de canvis en situacions de pressió o el percentatge d’accions d’alt risc en funció del diferencial de recursos</w:t>
       </w:r>
       <w:r>
         <w:rPr>
@@ -1318,7 +1373,6 @@
         </w:rPr>
         <w:t xml:space="preserve">.</w:t>
       </w:r>
-      <w:r/>
       <w:r>
         <w:rPr>
           <w:highlight w:val="none"/>
@@ -1326,12 +1380,6 @@
         </w:rPr>
       </w:r>
       <w:r/>
-      <w:r>
-        <w:rPr>
-          <w:highlight w:val="none"/>
-          <w:u w:val="single"/>
-        </w:rPr>
-      </w:r>
     </w:p>
     <w:p>
       <w:pPr>
@@ -1355,7 +1403,14 @@
           <w:highlight w:val="none"/>
           <w:u w:val="single"/>
         </w:rPr>
-        <w:t xml:space="preserve">Finalment, es documentaran els requisits computacionals (temps d’entrenament, nombre de partides simulades, recursos CPU/GPU utilitzats) i es discutiran les limitacions experimentals, incloent la possible falta de generalització a metagames diferents o a op</w:t>
+        <w:t xml:space="preserve">F</w:t>
+      </w:r>
+      <w:r>
+        <w:rPr>
+          <w:highlight w:val="none"/>
+          <w:u w:val="single"/>
+        </w:rPr>
+        <w:t xml:space="preserve">inalment, es documentaran els requisits computacionals (temps d’entrenament, nombre de partides simulades, recursos CPU/GPU utilitzats) i es discutiran les limitacions experimentals, incloent la possible falta de generalització a metagames diferents o a op</w:t>
       </w:r>
       <w:r>
         <w:rPr>
@@ -1363,13 +1418,6 @@
           <w:u w:val="single"/>
         </w:rPr>
         <w:t xml:space="preserve">onents humans no vistos durant l’entrenament.</w:t>
-      </w:r>
-      <w:r/>
-      <w:r>
-        <w:rPr>
-          <w:highlight w:val="none"/>
-          <w:u w:val="single"/>
-        </w:rPr>
       </w:r>
       <w:r>
         <w:rPr>
@@ -1379,7 +1427,9 @@
       </w:r>
       <w:r>
         <w:rPr>
-          <w:highlight w:val="none"/>
+          <w:rFonts w:ascii="Arial" w:hAnsi="Arial" w:eastAsia="Arial" w:cs="Arial"/>
+          <w:sz w:val="24"/>
+          <w:szCs w:val="24"/>
           <w:u w:val="single"/>
         </w:rPr>
       </w:r>
@@ -1406,7 +1456,6 @@
         <w:ind/>
         <w:rPr/>
       </w:pPr>
-      <w:r/>
       <w:r>
         <w:separator/>
       </w:r>
@@ -1421,7 +1470,6 @@
         <w:ind/>
         <w:rPr/>
       </w:pPr>
-      <w:r/>
       <w:r>
         <w:continuationSeparator/>
       </w:r>
@@ -1441,7 +1489,6 @@
         <w:ind/>
         <w:rPr/>
       </w:pPr>
-      <w:r/>
       <w:r>
         <w:separator/>
       </w:r>
@@ -1456,7 +1503,6 @@
         <w:ind/>
         <w:rPr/>
       </w:pPr>
-      <w:r/>
       <w:r>
         <w:continuationSeparator/>
       </w:r>
@@ -2361,9 +2407,9 @@
     <w:lsdException w:name="Bibliography" w:uiPriority="37"/>
     <w:lsdException w:name="TOC Heading" w:uiPriority="39" w:qFormat="1"/>
   </w:latentStyles>
-  <w:style w:type="table" w:styleId="12">
+  <w:style w:type="table" w:styleId="711">
     <w:name w:val="Table Grid"/>
-    <w:basedOn w:val="665"/>
+    <w:basedOn w:val="897"/>
     <w:uiPriority w:val="59"/>
     <w:pPr>
       <w:pBdr/>
@@ -2560,9 +2606,9 @@
       </w:tcPr>
     </w:tblStylePr>
   </w:style>
-  <w:style w:type="table" w:styleId="13">
+  <w:style w:type="table" w:styleId="712">
     <w:name w:val="Table Grid Light"/>
-    <w:basedOn w:val="665"/>
+    <w:basedOn w:val="897"/>
     <w:uiPriority w:val="59"/>
     <w:pPr>
       <w:pBdr/>
@@ -2759,9 +2805,9 @@
       </w:tcPr>
     </w:tblStylePr>
   </w:style>
-  <w:style w:type="table" w:styleId="14">
+  <w:style w:type="table" w:styleId="713">
     <w:name w:val="Plain Table 1"/>
-    <w:basedOn w:val="665"/>
+    <w:basedOn w:val="897"/>
     <w:uiPriority w:val="59"/>
     <w:pPr>
       <w:pBdr/>
@@ -2984,9 +3030,9 @@
       </w:tcPr>
     </w:tblStylePr>
   </w:style>
-  <w:style w:type="table" w:styleId="15">
+  <w:style w:type="table" w:styleId="714">
     <w:name w:val="Plain Table 2"/>
-    <w:basedOn w:val="665"/>
+    <w:basedOn w:val="897"/>
     <w:uiPriority w:val="59"/>
     <w:pPr>
       <w:pBdr/>
@@ -3217,9 +3263,9 @@
       </w:tcPr>
     </w:tblStylePr>
   </w:style>
-  <w:style w:type="table" w:styleId="16">
+  <w:style w:type="table" w:styleId="715">
     <w:name w:val="Plain Table 3"/>
-    <w:basedOn w:val="665"/>
+    <w:basedOn w:val="897"/>
     <w:uiPriority w:val="99"/>
     <w:pPr>
       <w:pBdr/>
@@ -3447,9 +3493,9 @@
       </w:tcPr>
     </w:tblStylePr>
   </w:style>
-  <w:style w:type="table" w:styleId="17">
+  <w:style w:type="table" w:styleId="716">
     <w:name w:val="Plain Table 4"/>
-    <w:basedOn w:val="665"/>
+    <w:basedOn w:val="897"/>
     <w:uiPriority w:val="99"/>
     <w:pPr>
       <w:pBdr/>
@@ -3663,9 +3709,9 @@
       </w:tcPr>
     </w:tblStylePr>
   </w:style>
-  <w:style w:type="table" w:styleId="18">
+  <w:style w:type="table" w:styleId="717">
     <w:name w:val="Plain Table 5"/>
-    <w:basedOn w:val="665"/>
+    <w:basedOn w:val="897"/>
     <w:uiPriority w:val="99"/>
     <w:pPr>
       <w:pBdr/>
@@ -3896,9 +3942,9 @@
       </w:tcPr>
     </w:tblStylePr>
   </w:style>
-  <w:style w:type="table" w:styleId="19">
+  <w:style w:type="table" w:styleId="718">
     <w:name w:val="Grid Table 1 Light"/>
-    <w:basedOn w:val="665"/>
+    <w:basedOn w:val="897"/>
     <w:uiPriority w:val="99"/>
     <w:pPr>
       <w:pBdr/>
@@ -4119,9 +4165,9 @@
       </w:tcPr>
     </w:tblStylePr>
   </w:style>
-  <w:style w:type="table" w:styleId="20">
+  <w:style w:type="table" w:styleId="719">
     <w:name w:val="Grid Table 1 Light - Accent 1"/>
-    <w:basedOn w:val="665"/>
+    <w:basedOn w:val="897"/>
     <w:uiPriority w:val="99"/>
     <w:pPr>
       <w:pBdr/>
@@ -4342,9 +4388,9 @@
       </w:tcPr>
     </w:tblStylePr>
   </w:style>
-  <w:style w:type="table" w:styleId="21">
+  <w:style w:type="table" w:styleId="720">
     <w:name w:val="Grid Table 1 Light - Accent 2"/>
-    <w:basedOn w:val="665"/>
+    <w:basedOn w:val="897"/>
     <w:uiPriority w:val="99"/>
     <w:pPr>
       <w:pBdr/>
@@ -4565,9 +4611,9 @@
       </w:tcPr>
     </w:tblStylePr>
   </w:style>
-  <w:style w:type="table" w:styleId="22">
+  <w:style w:type="table" w:styleId="721">
     <w:name w:val="Grid Table 1 Light - Accent 3"/>
-    <w:basedOn w:val="665"/>
+    <w:basedOn w:val="897"/>
     <w:uiPriority w:val="99"/>
     <w:pPr>
       <w:pBdr/>
@@ -4788,9 +4834,9 @@
       </w:tcPr>
     </w:tblStylePr>
   </w:style>
-  <w:style w:type="table" w:styleId="23">
+  <w:style w:type="table" w:styleId="722">
     <w:name w:val="Grid Table 1 Light - Accent 4"/>
-    <w:basedOn w:val="665"/>
+    <w:basedOn w:val="897"/>
     <w:uiPriority w:val="99"/>
     <w:pPr>
       <w:pBdr/>
@@ -5011,9 +5057,9 @@
       </w:tcPr>
     </w:tblStylePr>
   </w:style>
-  <w:style w:type="table" w:styleId="24">
+  <w:style w:type="table" w:styleId="723">
     <w:name w:val="Grid Table 1 Light - Accent 5"/>
-    <w:basedOn w:val="665"/>
+    <w:basedOn w:val="897"/>
     <w:uiPriority w:val="99"/>
     <w:pPr>
       <w:pBdr/>
@@ -5234,9 +5280,9 @@
       </w:tcPr>
     </w:tblStylePr>
   </w:style>
-  <w:style w:type="table" w:styleId="25">
+  <w:style w:type="table" w:styleId="724">
     <w:name w:val="Grid Table 1 Light - Accent 6"/>
-    <w:basedOn w:val="665"/>
+    <w:basedOn w:val="897"/>
     <w:uiPriority w:val="99"/>
     <w:pPr>
       <w:pBdr/>
@@ -5457,9 +5503,9 @@
       </w:tcPr>
     </w:tblStylePr>
   </w:style>
-  <w:style w:type="table" w:styleId="26">
+  <w:style w:type="table" w:styleId="725">
     <w:name w:val="Grid Table 2"/>
-    <w:basedOn w:val="665"/>
+    <w:basedOn w:val="897"/>
     <w:uiPriority w:val="99"/>
     <w:pPr>
       <w:pBdr/>
@@ -5689,9 +5735,9 @@
       </w:tcPr>
     </w:tblStylePr>
   </w:style>
-  <w:style w:type="table" w:styleId="27">
+  <w:style w:type="table" w:styleId="726">
     <w:name w:val="Grid Table 2 - Accent 1"/>
-    <w:basedOn w:val="665"/>
+    <w:basedOn w:val="897"/>
     <w:uiPriority w:val="99"/>
     <w:pPr>
       <w:pBdr/>
@@ -5921,9 +5967,9 @@
       </w:tcPr>
     </w:tblStylePr>
   </w:style>
-  <w:style w:type="table" w:styleId="28">
+  <w:style w:type="table" w:styleId="727">
     <w:name w:val="Grid Table 2 - Accent 2"/>
-    <w:basedOn w:val="665"/>
+    <w:basedOn w:val="897"/>
     <w:uiPriority w:val="99"/>
     <w:pPr>
       <w:pBdr/>
@@ -6153,9 +6199,9 @@
       </w:tcPr>
     </w:tblStylePr>
   </w:style>
-  <w:style w:type="table" w:styleId="29">
+  <w:style w:type="table" w:styleId="728">
     <w:name w:val="Grid Table 2 - Accent 3"/>
-    <w:basedOn w:val="665"/>
+    <w:basedOn w:val="897"/>
     <w:uiPriority w:val="99"/>
     <w:pPr>
       <w:pBdr/>
@@ -6385,9 +6431,9 @@
       </w:tcPr>
     </w:tblStylePr>
   </w:style>
-  <w:style w:type="table" w:styleId="30">
+  <w:style w:type="table" w:styleId="729">
     <w:name w:val="Grid Table 2 - Accent 4"/>
-    <w:basedOn w:val="665"/>
+    <w:basedOn w:val="897"/>
     <w:uiPriority w:val="99"/>
     <w:pPr>
       <w:pBdr/>
@@ -6617,9 +6663,9 @@
       </w:tcPr>
     </w:tblStylePr>
   </w:style>
-  <w:style w:type="table" w:styleId="31">
+  <w:style w:type="table" w:styleId="730">
     <w:name w:val="Grid Table 2 - Accent 5"/>
-    <w:basedOn w:val="665"/>
+    <w:basedOn w:val="897"/>
     <w:uiPriority w:val="99"/>
     <w:pPr>
       <w:pBdr/>
@@ -6849,9 +6895,9 @@
       </w:tcPr>
     </w:tblStylePr>
   </w:style>
-  <w:style w:type="table" w:styleId="32">
+  <w:style w:type="table" w:styleId="731">
     <w:name w:val="Grid Table 2 - Accent 6"/>
-    <w:basedOn w:val="665"/>
+    <w:basedOn w:val="897"/>
     <w:uiPriority w:val="99"/>
     <w:pPr>
       <w:pBdr/>
@@ -7081,9 +7127,9 @@
       </w:tcPr>
     </w:tblStylePr>
   </w:style>
-  <w:style w:type="table" w:styleId="33">
+  <w:style w:type="table" w:styleId="732">
     <w:name w:val="Grid Table 3"/>
-    <w:basedOn w:val="665"/>
+    <w:basedOn w:val="897"/>
     <w:uiPriority w:val="99"/>
     <w:pPr>
       <w:pBdr/>
@@ -7182,29 +7228,6 @@
         <w:tblBorders/>
       </w:tblPr>
       <w:tcPr>
-        <w:shd w:color="ffffff"/>
-        <w:tcBorders>
-          <w:top w:val="none" w:color="000000" w:sz="4" w:space="0"/>
-          <w:left w:val="none" w:color="000000" w:sz="4" w:space="0"/>
-          <w:bottom w:val="none" w:color="000000" w:sz="4" w:space="0"/>
-          <w:right w:val="none" w:color="000000" w:sz="4" w:space="0"/>
-        </w:tcBorders>
-      </w:tcPr>
-    </w:tblStylePr>
-    <w:tblStylePr w:type="firstRow">
-      <w:rPr>
-        <w:b/>
-        <w:color w:val="404040"/>
-      </w:rPr>
-      <w:pPr>
-        <w:pBdr/>
-        <w:spacing/>
-        <w:ind/>
-      </w:pPr>
-      <w:tblPr>
-        <w:tblBorders/>
-      </w:tblPr>
-      <w:tcPr>
         <w:shd w:val="clear" w:color="ffffff"/>
         <w:tcBorders>
           <w:top w:val="none" w:color="000000" w:sz="4" w:space="0"/>
@@ -7214,30 +7237,7 @@
         </w:tcBorders>
       </w:tcPr>
     </w:tblStylePr>
-    <w:tblStylePr w:type="lastCol">
-      <w:rPr>
-        <w:i/>
-        <w:color w:val="404040"/>
-      </w:rPr>
-      <w:pPr>
-        <w:pBdr/>
-        <w:spacing/>
-        <w:ind/>
-      </w:pPr>
-      <w:tblPr>
-        <w:tblBorders/>
-      </w:tblPr>
-      <w:tcPr>
-        <w:shd w:color="ffffff"/>
-        <w:tcBorders>
-          <w:top w:val="none" w:color="000000" w:sz="4" w:space="0"/>
-          <w:left w:val="none" w:color="000000" w:sz="4" w:space="0"/>
-          <w:bottom w:val="none" w:color="000000" w:sz="4" w:space="0"/>
-          <w:right w:val="none" w:color="000000" w:sz="4" w:space="0"/>
-        </w:tcBorders>
-      </w:tcPr>
-    </w:tblStylePr>
-    <w:tblStylePr w:type="lastRow">
+    <w:tblStylePr w:type="firstRow">
       <w:rPr>
         <w:b/>
         <w:color w:val="404040"/>
@@ -7260,6 +7260,52 @@
         </w:tcBorders>
       </w:tcPr>
     </w:tblStylePr>
+    <w:tblStylePr w:type="lastCol">
+      <w:rPr>
+        <w:i/>
+        <w:color w:val="404040"/>
+      </w:rPr>
+      <w:pPr>
+        <w:pBdr/>
+        <w:spacing/>
+        <w:ind/>
+      </w:pPr>
+      <w:tblPr>
+        <w:tblBorders/>
+      </w:tblPr>
+      <w:tcPr>
+        <w:shd w:val="clear" w:color="ffffff"/>
+        <w:tcBorders>
+          <w:top w:val="none" w:color="000000" w:sz="4" w:space="0"/>
+          <w:left w:val="none" w:color="000000" w:sz="4" w:space="0"/>
+          <w:bottom w:val="none" w:color="000000" w:sz="4" w:space="0"/>
+          <w:right w:val="none" w:color="000000" w:sz="4" w:space="0"/>
+        </w:tcBorders>
+      </w:tcPr>
+    </w:tblStylePr>
+    <w:tblStylePr w:type="lastRow">
+      <w:rPr>
+        <w:b/>
+        <w:color w:val="404040"/>
+      </w:rPr>
+      <w:pPr>
+        <w:pBdr/>
+        <w:spacing/>
+        <w:ind/>
+      </w:pPr>
+      <w:tblPr>
+        <w:tblBorders/>
+      </w:tblPr>
+      <w:tcPr>
+        <w:shd w:val="clear" w:color="ffffff"/>
+        <w:tcBorders>
+          <w:top w:val="none" w:color="000000" w:sz="4" w:space="0"/>
+          <w:left w:val="none" w:color="000000" w:sz="4" w:space="0"/>
+          <w:bottom w:val="none" w:color="000000" w:sz="4" w:space="0"/>
+          <w:right w:val="none" w:color="000000" w:sz="4" w:space="0"/>
+        </w:tcBorders>
+      </w:tcPr>
+    </w:tblStylePr>
     <w:tblStylePr w:type="nwCell">
       <w:pPr>
         <w:pBdr/>
@@ -7326,9 +7372,9 @@
       </w:tcPr>
     </w:tblStylePr>
   </w:style>
-  <w:style w:type="table" w:styleId="34">
+  <w:style w:type="table" w:styleId="733">
     <w:name w:val="Grid Table 3 - Accent 1"/>
-    <w:basedOn w:val="665"/>
+    <w:basedOn w:val="897"/>
     <w:uiPriority w:val="99"/>
     <w:pPr>
       <w:pBdr/>
@@ -7427,29 +7473,6 @@
         <w:tblBorders/>
       </w:tblPr>
       <w:tcPr>
-        <w:shd w:color="ffffff"/>
-        <w:tcBorders>
-          <w:top w:val="none" w:color="000000" w:sz="4" w:space="0"/>
-          <w:left w:val="none" w:color="000000" w:sz="4" w:space="0"/>
-          <w:bottom w:val="none" w:color="000000" w:sz="4" w:space="0"/>
-          <w:right w:val="none" w:color="000000" w:sz="4" w:space="0"/>
-        </w:tcBorders>
-      </w:tcPr>
-    </w:tblStylePr>
-    <w:tblStylePr w:type="firstRow">
-      <w:rPr>
-        <w:b/>
-        <w:color w:val="404040"/>
-      </w:rPr>
-      <w:pPr>
-        <w:pBdr/>
-        <w:spacing/>
-        <w:ind/>
-      </w:pPr>
-      <w:tblPr>
-        <w:tblBorders/>
-      </w:tblPr>
-      <w:tcPr>
         <w:shd w:val="clear" w:color="ffffff"/>
         <w:tcBorders>
           <w:top w:val="none" w:color="000000" w:sz="4" w:space="0"/>
@@ -7459,30 +7482,7 @@
         </w:tcBorders>
       </w:tcPr>
     </w:tblStylePr>
-    <w:tblStylePr w:type="lastCol">
-      <w:rPr>
-        <w:i/>
-        <w:color w:val="404040"/>
-      </w:rPr>
-      <w:pPr>
-        <w:pBdr/>
-        <w:spacing/>
-        <w:ind/>
-      </w:pPr>
-      <w:tblPr>
-        <w:tblBorders/>
-      </w:tblPr>
-      <w:tcPr>
-        <w:shd w:color="ffffff"/>
-        <w:tcBorders>
-          <w:top w:val="none" w:color="000000" w:sz="4" w:space="0"/>
-          <w:left w:val="none" w:color="000000" w:sz="4" w:space="0"/>
-          <w:bottom w:val="none" w:color="000000" w:sz="4" w:space="0"/>
-          <w:right w:val="none" w:color="000000" w:sz="4" w:space="0"/>
-        </w:tcBorders>
-      </w:tcPr>
-    </w:tblStylePr>
-    <w:tblStylePr w:type="lastRow">
+    <w:tblStylePr w:type="firstRow">
       <w:rPr>
         <w:b/>
         <w:color w:val="404040"/>
@@ -7505,6 +7505,52 @@
         </w:tcBorders>
       </w:tcPr>
     </w:tblStylePr>
+    <w:tblStylePr w:type="lastCol">
+      <w:rPr>
+        <w:i/>
+        <w:color w:val="404040"/>
+      </w:rPr>
+      <w:pPr>
+        <w:pBdr/>
+        <w:spacing/>
+        <w:ind/>
+      </w:pPr>
+      <w:tblPr>
+        <w:tblBorders/>
+      </w:tblPr>
+      <w:tcPr>
+        <w:shd w:val="clear" w:color="ffffff"/>
+        <w:tcBorders>
+          <w:top w:val="none" w:color="000000" w:sz="4" w:space="0"/>
+          <w:left w:val="none" w:color="000000" w:sz="4" w:space="0"/>
+          <w:bottom w:val="none" w:color="000000" w:sz="4" w:space="0"/>
+          <w:right w:val="none" w:color="000000" w:sz="4" w:space="0"/>
+        </w:tcBorders>
+      </w:tcPr>
+    </w:tblStylePr>
+    <w:tblStylePr w:type="lastRow">
+      <w:rPr>
+        <w:b/>
+        <w:color w:val="404040"/>
+      </w:rPr>
+      <w:pPr>
+        <w:pBdr/>
+        <w:spacing/>
+        <w:ind/>
+      </w:pPr>
+      <w:tblPr>
+        <w:tblBorders/>
+      </w:tblPr>
+      <w:tcPr>
+        <w:shd w:val="clear" w:color="ffffff"/>
+        <w:tcBorders>
+          <w:top w:val="none" w:color="000000" w:sz="4" w:space="0"/>
+          <w:left w:val="none" w:color="000000" w:sz="4" w:space="0"/>
+          <w:bottom w:val="none" w:color="000000" w:sz="4" w:space="0"/>
+          <w:right w:val="none" w:color="000000" w:sz="4" w:space="0"/>
+        </w:tcBorders>
+      </w:tcPr>
+    </w:tblStylePr>
     <w:tblStylePr w:type="nwCell">
       <w:pPr>
         <w:pBdr/>
@@ -7571,9 +7617,9 @@
       </w:tcPr>
     </w:tblStylePr>
   </w:style>
-  <w:style w:type="table" w:styleId="35">
+  <w:style w:type="table" w:styleId="734">
     <w:name w:val="Grid Table 3 - Accent 2"/>
-    <w:basedOn w:val="665"/>
+    <w:basedOn w:val="897"/>
     <w:uiPriority w:val="99"/>
     <w:pPr>
       <w:pBdr/>
@@ -7672,29 +7718,6 @@
         <w:tblBorders/>
       </w:tblPr>
       <w:tcPr>
-        <w:shd w:color="ffffff"/>
-        <w:tcBorders>
-          <w:top w:val="none" w:color="000000" w:sz="4" w:space="0"/>
-          <w:left w:val="none" w:color="000000" w:sz="4" w:space="0"/>
-          <w:bottom w:val="none" w:color="000000" w:sz="4" w:space="0"/>
-          <w:right w:val="none" w:color="000000" w:sz="4" w:space="0"/>
-        </w:tcBorders>
-      </w:tcPr>
-    </w:tblStylePr>
-    <w:tblStylePr w:type="firstRow">
-      <w:rPr>
-        <w:b/>
-        <w:color w:val="404040"/>
-      </w:rPr>
-      <w:pPr>
-        <w:pBdr/>
-        <w:spacing/>
-        <w:ind/>
-      </w:pPr>
-      <w:tblPr>
-        <w:tblBorders/>
-      </w:tblPr>
-      <w:tcPr>
         <w:shd w:val="clear" w:color="ffffff"/>
         <w:tcBorders>
           <w:top w:val="none" w:color="000000" w:sz="4" w:space="0"/>
@@ -7704,30 +7727,7 @@
         </w:tcBorders>
       </w:tcPr>
     </w:tblStylePr>
-    <w:tblStylePr w:type="lastCol">
-      <w:rPr>
-        <w:i/>
-        <w:color w:val="404040"/>
-      </w:rPr>
-      <w:pPr>
-        <w:pBdr/>
-        <w:spacing/>
-        <w:ind/>
-      </w:pPr>
-      <w:tblPr>
-        <w:tblBorders/>
-      </w:tblPr>
-      <w:tcPr>
-        <w:shd w:color="ffffff"/>
-        <w:tcBorders>
-          <w:top w:val="none" w:color="000000" w:sz="4" w:space="0"/>
-          <w:left w:val="none" w:color="000000" w:sz="4" w:space="0"/>
-          <w:bottom w:val="none" w:color="000000" w:sz="4" w:space="0"/>
-          <w:right w:val="none" w:color="000000" w:sz="4" w:space="0"/>
-        </w:tcBorders>
-      </w:tcPr>
-    </w:tblStylePr>
-    <w:tblStylePr w:type="lastRow">
+    <w:tblStylePr w:type="firstRow">
       <w:rPr>
         <w:b/>
         <w:color w:val="404040"/>
@@ -7750,6 +7750,52 @@
         </w:tcBorders>
       </w:tcPr>
     </w:tblStylePr>
+    <w:tblStylePr w:type="lastCol">
+      <w:rPr>
+        <w:i/>
+        <w:color w:val="404040"/>
+      </w:rPr>
+      <w:pPr>
+        <w:pBdr/>
+        <w:spacing/>
+        <w:ind/>
+      </w:pPr>
+      <w:tblPr>
+        <w:tblBorders/>
+      </w:tblPr>
+      <w:tcPr>
+        <w:shd w:val="clear" w:color="ffffff"/>
+        <w:tcBorders>
+          <w:top w:val="none" w:color="000000" w:sz="4" w:space="0"/>
+          <w:left w:val="none" w:color="000000" w:sz="4" w:space="0"/>
+          <w:bottom w:val="none" w:color="000000" w:sz="4" w:space="0"/>
+          <w:right w:val="none" w:color="000000" w:sz="4" w:space="0"/>
+        </w:tcBorders>
+      </w:tcPr>
+    </w:tblStylePr>
+    <w:tblStylePr w:type="lastRow">
+      <w:rPr>
+        <w:b/>
+        <w:color w:val="404040"/>
+      </w:rPr>
+      <w:pPr>
+        <w:pBdr/>
+        <w:spacing/>
+        <w:ind/>
+      </w:pPr>
+      <w:tblPr>
+        <w:tblBorders/>
+      </w:tblPr>
+      <w:tcPr>
+        <w:shd w:val="clear" w:color="ffffff"/>
+        <w:tcBorders>
+          <w:top w:val="none" w:color="000000" w:sz="4" w:space="0"/>
+          <w:left w:val="none" w:color="000000" w:sz="4" w:space="0"/>
+          <w:bottom w:val="none" w:color="000000" w:sz="4" w:space="0"/>
+          <w:right w:val="none" w:color="000000" w:sz="4" w:space="0"/>
+        </w:tcBorders>
+      </w:tcPr>
+    </w:tblStylePr>
     <w:tblStylePr w:type="nwCell">
       <w:pPr>
         <w:pBdr/>
@@ -7816,9 +7862,9 @@
       </w:tcPr>
     </w:tblStylePr>
   </w:style>
-  <w:style w:type="table" w:styleId="36">
+  <w:style w:type="table" w:styleId="735">
     <w:name w:val="Grid Table 3 - Accent 3"/>
-    <w:basedOn w:val="665"/>
+    <w:basedOn w:val="897"/>
     <w:uiPriority w:val="99"/>
     <w:pPr>
       <w:pBdr/>
@@ -7917,29 +7963,6 @@
         <w:tblBorders/>
       </w:tblPr>
       <w:tcPr>
-        <w:shd w:color="ffffff"/>
-        <w:tcBorders>
-          <w:top w:val="none" w:color="000000" w:sz="4" w:space="0"/>
-          <w:left w:val="none" w:color="000000" w:sz="4" w:space="0"/>
-          <w:bottom w:val="none" w:color="000000" w:sz="4" w:space="0"/>
-          <w:right w:val="none" w:color="000000" w:sz="4" w:space="0"/>
-        </w:tcBorders>
-      </w:tcPr>
-    </w:tblStylePr>
-    <w:tblStylePr w:type="firstRow">
-      <w:rPr>
-        <w:b/>
-        <w:color w:val="404040"/>
-      </w:rPr>
-      <w:pPr>
-        <w:pBdr/>
-        <w:spacing/>
-        <w:ind/>
-      </w:pPr>
-      <w:tblPr>
-        <w:tblBorders/>
-      </w:tblPr>
-      <w:tcPr>
         <w:shd w:val="clear" w:color="ffffff"/>
         <w:tcBorders>
           <w:top w:val="none" w:color="000000" w:sz="4" w:space="0"/>
@@ -7949,30 +7972,7 @@
         </w:tcBorders>
       </w:tcPr>
     </w:tblStylePr>
-    <w:tblStylePr w:type="lastCol">
-      <w:rPr>
-        <w:i/>
-        <w:color w:val="404040"/>
-      </w:rPr>
-      <w:pPr>
-        <w:pBdr/>
-        <w:spacing/>
-        <w:ind/>
-      </w:pPr>
-      <w:tblPr>
-        <w:tblBorders/>
-      </w:tblPr>
-      <w:tcPr>
-        <w:shd w:color="ffffff"/>
-        <w:tcBorders>
-          <w:top w:val="none" w:color="000000" w:sz="4" w:space="0"/>
-          <w:left w:val="none" w:color="000000" w:sz="4" w:space="0"/>
-          <w:bottom w:val="none" w:color="000000" w:sz="4" w:space="0"/>
-          <w:right w:val="none" w:color="000000" w:sz="4" w:space="0"/>
-        </w:tcBorders>
-      </w:tcPr>
-    </w:tblStylePr>
-    <w:tblStylePr w:type="lastRow">
+    <w:tblStylePr w:type="firstRow">
       <w:rPr>
         <w:b/>
         <w:color w:val="404040"/>
@@ -7995,6 +7995,52 @@
         </w:tcBorders>
       </w:tcPr>
     </w:tblStylePr>
+    <w:tblStylePr w:type="lastCol">
+      <w:rPr>
+        <w:i/>
+        <w:color w:val="404040"/>
+      </w:rPr>
+      <w:pPr>
+        <w:pBdr/>
+        <w:spacing/>
+        <w:ind/>
+      </w:pPr>
+      <w:tblPr>
+        <w:tblBorders/>
+      </w:tblPr>
+      <w:tcPr>
+        <w:shd w:val="clear" w:color="ffffff"/>
+        <w:tcBorders>
+          <w:top w:val="none" w:color="000000" w:sz="4" w:space="0"/>
+          <w:left w:val="none" w:color="000000" w:sz="4" w:space="0"/>
+          <w:bottom w:val="none" w:color="000000" w:sz="4" w:space="0"/>
+          <w:right w:val="none" w:color="000000" w:sz="4" w:space="0"/>
+        </w:tcBorders>
+      </w:tcPr>
+    </w:tblStylePr>
+    <w:tblStylePr w:type="lastRow">
+      <w:rPr>
+        <w:b/>
+        <w:color w:val="404040"/>
+      </w:rPr>
+      <w:pPr>
+        <w:pBdr/>
+        <w:spacing/>
+        <w:ind/>
+      </w:pPr>
+      <w:tblPr>
+        <w:tblBorders/>
+      </w:tblPr>
+      <w:tcPr>
+        <w:shd w:val="clear" w:color="ffffff"/>
+        <w:tcBorders>
+          <w:top w:val="none" w:color="000000" w:sz="4" w:space="0"/>
+          <w:left w:val="none" w:color="000000" w:sz="4" w:space="0"/>
+          <w:bottom w:val="none" w:color="000000" w:sz="4" w:space="0"/>
+          <w:right w:val="none" w:color="000000" w:sz="4" w:space="0"/>
+        </w:tcBorders>
+      </w:tcPr>
+    </w:tblStylePr>
     <w:tblStylePr w:type="nwCell">
       <w:pPr>
         <w:pBdr/>
@@ -8061,9 +8107,9 @@
       </w:tcPr>
     </w:tblStylePr>
   </w:style>
-  <w:style w:type="table" w:styleId="37">
+  <w:style w:type="table" w:styleId="736">
     <w:name w:val="Grid Table 3 - Accent 4"/>
-    <w:basedOn w:val="665"/>
+    <w:basedOn w:val="897"/>
     <w:uiPriority w:val="99"/>
     <w:pPr>
       <w:pBdr/>
@@ -8162,29 +8208,6 @@
         <w:tblBorders/>
       </w:tblPr>
       <w:tcPr>
-        <w:shd w:color="ffffff"/>
-        <w:tcBorders>
-          <w:top w:val="none" w:color="000000" w:sz="4" w:space="0"/>
-          <w:left w:val="none" w:color="000000" w:sz="4" w:space="0"/>
-          <w:bottom w:val="none" w:color="000000" w:sz="4" w:space="0"/>
-          <w:right w:val="none" w:color="000000" w:sz="4" w:space="0"/>
-        </w:tcBorders>
-      </w:tcPr>
-    </w:tblStylePr>
-    <w:tblStylePr w:type="firstRow">
-      <w:rPr>
-        <w:b/>
-        <w:color w:val="404040"/>
-      </w:rPr>
-      <w:pPr>
-        <w:pBdr/>
-        <w:spacing/>
-        <w:ind/>
-      </w:pPr>
-      <w:tblPr>
-        <w:tblBorders/>
-      </w:tblPr>
-      <w:tcPr>
         <w:shd w:val="clear" w:color="ffffff"/>
         <w:tcBorders>
           <w:top w:val="none" w:color="000000" w:sz="4" w:space="0"/>
@@ -8194,30 +8217,7 @@
         </w:tcBorders>
       </w:tcPr>
     </w:tblStylePr>
-    <w:tblStylePr w:type="lastCol">
-      <w:rPr>
-        <w:i/>
-        <w:color w:val="404040"/>
-      </w:rPr>
-      <w:pPr>
-        <w:pBdr/>
-        <w:spacing/>
-        <w:ind/>
-      </w:pPr>
-      <w:tblPr>
-        <w:tblBorders/>
-      </w:tblPr>
-      <w:tcPr>
-        <w:shd w:color="ffffff"/>
-        <w:tcBorders>
-          <w:top w:val="none" w:color="000000" w:sz="4" w:space="0"/>
-          <w:left w:val="none" w:color="000000" w:sz="4" w:space="0"/>
-          <w:bottom w:val="none" w:color="000000" w:sz="4" w:space="0"/>
-          <w:right w:val="none" w:color="000000" w:sz="4" w:space="0"/>
-        </w:tcBorders>
-      </w:tcPr>
-    </w:tblStylePr>
-    <w:tblStylePr w:type="lastRow">
+    <w:tblStylePr w:type="firstRow">
       <w:rPr>
         <w:b/>
         <w:color w:val="404040"/>
@@ -8240,6 +8240,52 @@
         </w:tcBorders>
       </w:tcPr>
     </w:tblStylePr>
+    <w:tblStylePr w:type="lastCol">
+      <w:rPr>
+        <w:i/>
+        <w:color w:val="404040"/>
+      </w:rPr>
+      <w:pPr>
+        <w:pBdr/>
+        <w:spacing/>
+        <w:ind/>
+      </w:pPr>
+      <w:tblPr>
+        <w:tblBorders/>
+      </w:tblPr>
+      <w:tcPr>
+        <w:shd w:val="clear" w:color="ffffff"/>
+        <w:tcBorders>
+          <w:top w:val="none" w:color="000000" w:sz="4" w:space="0"/>
+          <w:left w:val="none" w:color="000000" w:sz="4" w:space="0"/>
+          <w:bottom w:val="none" w:color="000000" w:sz="4" w:space="0"/>
+          <w:right w:val="none" w:color="000000" w:sz="4" w:space="0"/>
+        </w:tcBorders>
+      </w:tcPr>
+    </w:tblStylePr>
+    <w:tblStylePr w:type="lastRow">
+      <w:rPr>
+        <w:b/>
+        <w:color w:val="404040"/>
+      </w:rPr>
+      <w:pPr>
+        <w:pBdr/>
+        <w:spacing/>
+        <w:ind/>
+      </w:pPr>
+      <w:tblPr>
+        <w:tblBorders/>
+      </w:tblPr>
+      <w:tcPr>
+        <w:shd w:val="clear" w:color="ffffff"/>
+        <w:tcBorders>
+          <w:top w:val="none" w:color="000000" w:sz="4" w:space="0"/>
+          <w:left w:val="none" w:color="000000" w:sz="4" w:space="0"/>
+          <w:bottom w:val="none" w:color="000000" w:sz="4" w:space="0"/>
+          <w:right w:val="none" w:color="000000" w:sz="4" w:space="0"/>
+        </w:tcBorders>
+      </w:tcPr>
+    </w:tblStylePr>
     <w:tblStylePr w:type="nwCell">
       <w:pPr>
         <w:pBdr/>
@@ -8306,9 +8352,9 @@
       </w:tcPr>
     </w:tblStylePr>
   </w:style>
-  <w:style w:type="table" w:styleId="38">
+  <w:style w:type="table" w:styleId="737">
     <w:name w:val="Grid Table 3 - Accent 5"/>
-    <w:basedOn w:val="665"/>
+    <w:basedOn w:val="897"/>
     <w:uiPriority w:val="99"/>
     <w:pPr>
       <w:pBdr/>
@@ -8407,29 +8453,6 @@
         <w:tblBorders/>
       </w:tblPr>
       <w:tcPr>
-        <w:shd w:color="ffffff"/>
-        <w:tcBorders>
-          <w:top w:val="none" w:color="000000" w:sz="4" w:space="0"/>
-          <w:left w:val="none" w:color="000000" w:sz="4" w:space="0"/>
-          <w:bottom w:val="none" w:color="000000" w:sz="4" w:space="0"/>
-          <w:right w:val="none" w:color="000000" w:sz="4" w:space="0"/>
-        </w:tcBorders>
-      </w:tcPr>
-    </w:tblStylePr>
-    <w:tblStylePr w:type="firstRow">
-      <w:rPr>
-        <w:b/>
-        <w:color w:val="404040"/>
-      </w:rPr>
-      <w:pPr>
-        <w:pBdr/>
-        <w:spacing/>
-        <w:ind/>
-      </w:pPr>
-      <w:tblPr>
-        <w:tblBorders/>
-      </w:tblPr>
-      <w:tcPr>
         <w:shd w:val="clear" w:color="ffffff"/>
         <w:tcBorders>
           <w:top w:val="none" w:color="000000" w:sz="4" w:space="0"/>
@@ -8439,30 +8462,7 @@
         </w:tcBorders>
       </w:tcPr>
     </w:tblStylePr>
-    <w:tblStylePr w:type="lastCol">
-      <w:rPr>
-        <w:i/>
-        <w:color w:val="404040"/>
-      </w:rPr>
-      <w:pPr>
-        <w:pBdr/>
-        <w:spacing/>
-        <w:ind/>
-      </w:pPr>
-      <w:tblPr>
-        <w:tblBorders/>
-      </w:tblPr>
-      <w:tcPr>
-        <w:shd w:color="ffffff"/>
-        <w:tcBorders>
-          <w:top w:val="none" w:color="000000" w:sz="4" w:space="0"/>
-          <w:left w:val="none" w:color="000000" w:sz="4" w:space="0"/>
-          <w:bottom w:val="none" w:color="000000" w:sz="4" w:space="0"/>
-          <w:right w:val="none" w:color="000000" w:sz="4" w:space="0"/>
-        </w:tcBorders>
-      </w:tcPr>
-    </w:tblStylePr>
-    <w:tblStylePr w:type="lastRow">
+    <w:tblStylePr w:type="firstRow">
       <w:rPr>
         <w:b/>
         <w:color w:val="404040"/>
@@ -8485,6 +8485,52 @@
         </w:tcBorders>
       </w:tcPr>
     </w:tblStylePr>
+    <w:tblStylePr w:type="lastCol">
+      <w:rPr>
+        <w:i/>
+        <w:color w:val="404040"/>
+      </w:rPr>
+      <w:pPr>
+        <w:pBdr/>
+        <w:spacing/>
+        <w:ind/>
+      </w:pPr>
+      <w:tblPr>
+        <w:tblBorders/>
+      </w:tblPr>
+      <w:tcPr>
+        <w:shd w:val="clear" w:color="ffffff"/>
+        <w:tcBorders>
+          <w:top w:val="none" w:color="000000" w:sz="4" w:space="0"/>
+          <w:left w:val="none" w:color="000000" w:sz="4" w:space="0"/>
+          <w:bottom w:val="none" w:color="000000" w:sz="4" w:space="0"/>
+          <w:right w:val="none" w:color="000000" w:sz="4" w:space="0"/>
+        </w:tcBorders>
+      </w:tcPr>
+    </w:tblStylePr>
+    <w:tblStylePr w:type="lastRow">
+      <w:rPr>
+        <w:b/>
+        <w:color w:val="404040"/>
+      </w:rPr>
+      <w:pPr>
+        <w:pBdr/>
+        <w:spacing/>
+        <w:ind/>
+      </w:pPr>
+      <w:tblPr>
+        <w:tblBorders/>
+      </w:tblPr>
+      <w:tcPr>
+        <w:shd w:val="clear" w:color="ffffff"/>
+        <w:tcBorders>
+          <w:top w:val="none" w:color="000000" w:sz="4" w:space="0"/>
+          <w:left w:val="none" w:color="000000" w:sz="4" w:space="0"/>
+          <w:bottom w:val="none" w:color="000000" w:sz="4" w:space="0"/>
+          <w:right w:val="none" w:color="000000" w:sz="4" w:space="0"/>
+        </w:tcBorders>
+      </w:tcPr>
+    </w:tblStylePr>
     <w:tblStylePr w:type="nwCell">
       <w:pPr>
         <w:pBdr/>
@@ -8551,9 +8597,9 @@
       </w:tcPr>
     </w:tblStylePr>
   </w:style>
-  <w:style w:type="table" w:styleId="39">
+  <w:style w:type="table" w:styleId="738">
     <w:name w:val="Grid Table 3 - Accent 6"/>
-    <w:basedOn w:val="665"/>
+    <w:basedOn w:val="897"/>
     <w:uiPriority w:val="99"/>
     <w:pPr>
       <w:pBdr/>
@@ -8652,29 +8698,6 @@
         <w:tblBorders/>
       </w:tblPr>
       <w:tcPr>
-        <w:shd w:color="ffffff"/>
-        <w:tcBorders>
-          <w:top w:val="none" w:color="000000" w:sz="4" w:space="0"/>
-          <w:left w:val="none" w:color="000000" w:sz="4" w:space="0"/>
-          <w:bottom w:val="none" w:color="000000" w:sz="4" w:space="0"/>
-          <w:right w:val="none" w:color="000000" w:sz="4" w:space="0"/>
-        </w:tcBorders>
-      </w:tcPr>
-    </w:tblStylePr>
-    <w:tblStylePr w:type="firstRow">
-      <w:rPr>
-        <w:b/>
-        <w:color w:val="404040"/>
-      </w:rPr>
-      <w:pPr>
-        <w:pBdr/>
-        <w:spacing/>
-        <w:ind/>
-      </w:pPr>
-      <w:tblPr>
-        <w:tblBorders/>
-      </w:tblPr>
-      <w:tcPr>
         <w:shd w:val="clear" w:color="ffffff"/>
         <w:tcBorders>
           <w:top w:val="none" w:color="000000" w:sz="4" w:space="0"/>
@@ -8684,30 +8707,7 @@
         </w:tcBorders>
       </w:tcPr>
     </w:tblStylePr>
-    <w:tblStylePr w:type="lastCol">
-      <w:rPr>
-        <w:i/>
-        <w:color w:val="404040"/>
-      </w:rPr>
-      <w:pPr>
-        <w:pBdr/>
-        <w:spacing/>
-        <w:ind/>
-      </w:pPr>
-      <w:tblPr>
-        <w:tblBorders/>
-      </w:tblPr>
-      <w:tcPr>
-        <w:shd w:color="ffffff"/>
-        <w:tcBorders>
-          <w:top w:val="none" w:color="000000" w:sz="4" w:space="0"/>
-          <w:left w:val="none" w:color="000000" w:sz="4" w:space="0"/>
-          <w:bottom w:val="none" w:color="000000" w:sz="4" w:space="0"/>
-          <w:right w:val="none" w:color="000000" w:sz="4" w:space="0"/>
-        </w:tcBorders>
-      </w:tcPr>
-    </w:tblStylePr>
-    <w:tblStylePr w:type="lastRow">
+    <w:tblStylePr w:type="firstRow">
       <w:rPr>
         <w:b/>
         <w:color w:val="404040"/>
@@ -8730,6 +8730,52 @@
         </w:tcBorders>
       </w:tcPr>
     </w:tblStylePr>
+    <w:tblStylePr w:type="lastCol">
+      <w:rPr>
+        <w:i/>
+        <w:color w:val="404040"/>
+      </w:rPr>
+      <w:pPr>
+        <w:pBdr/>
+        <w:spacing/>
+        <w:ind/>
+      </w:pPr>
+      <w:tblPr>
+        <w:tblBorders/>
+      </w:tblPr>
+      <w:tcPr>
+        <w:shd w:val="clear" w:color="ffffff"/>
+        <w:tcBorders>
+          <w:top w:val="none" w:color="000000" w:sz="4" w:space="0"/>
+          <w:left w:val="none" w:color="000000" w:sz="4" w:space="0"/>
+          <w:bottom w:val="none" w:color="000000" w:sz="4" w:space="0"/>
+          <w:right w:val="none" w:color="000000" w:sz="4" w:space="0"/>
+        </w:tcBorders>
+      </w:tcPr>
+    </w:tblStylePr>
+    <w:tblStylePr w:type="lastRow">
+      <w:rPr>
+        <w:b/>
+        <w:color w:val="404040"/>
+      </w:rPr>
+      <w:pPr>
+        <w:pBdr/>
+        <w:spacing/>
+        <w:ind/>
+      </w:pPr>
+      <w:tblPr>
+        <w:tblBorders/>
+      </w:tblPr>
+      <w:tcPr>
+        <w:shd w:val="clear" w:color="ffffff"/>
+        <w:tcBorders>
+          <w:top w:val="none" w:color="000000" w:sz="4" w:space="0"/>
+          <w:left w:val="none" w:color="000000" w:sz="4" w:space="0"/>
+          <w:bottom w:val="none" w:color="000000" w:sz="4" w:space="0"/>
+          <w:right w:val="none" w:color="000000" w:sz="4" w:space="0"/>
+        </w:tcBorders>
+      </w:tcPr>
+    </w:tblStylePr>
     <w:tblStylePr w:type="nwCell">
       <w:pPr>
         <w:pBdr/>
@@ -8796,9 +8842,9 @@
       </w:tcPr>
     </w:tblStylePr>
   </w:style>
-  <w:style w:type="table" w:styleId="40">
+  <w:style w:type="table" w:styleId="739">
     <w:name w:val="Grid Table 4"/>
-    <w:basedOn w:val="665"/>
+    <w:basedOn w:val="897"/>
     <w:uiPriority w:val="59"/>
     <w:pPr>
       <w:pBdr/>
@@ -9029,9 +9075,9 @@
       </w:tcPr>
     </w:tblStylePr>
   </w:style>
-  <w:style w:type="table" w:styleId="41">
+  <w:style w:type="table" w:styleId="740">
     <w:name w:val="Grid Table 4 - Accent 1"/>
-    <w:basedOn w:val="665"/>
+    <w:basedOn w:val="897"/>
     <w:uiPriority w:val="59"/>
     <w:pPr>
       <w:pBdr/>
@@ -9262,9 +9308,9 @@
       </w:tcPr>
     </w:tblStylePr>
   </w:style>
-  <w:style w:type="table" w:styleId="42">
+  <w:style w:type="table" w:styleId="741">
     <w:name w:val="Grid Table 4 - Accent 2"/>
-    <w:basedOn w:val="665"/>
+    <w:basedOn w:val="897"/>
     <w:uiPriority w:val="59"/>
     <w:pPr>
       <w:pBdr/>
@@ -9495,9 +9541,9 @@
       </w:tcPr>
     </w:tblStylePr>
   </w:style>
-  <w:style w:type="table" w:styleId="43">
+  <w:style w:type="table" w:styleId="742">
     <w:name w:val="Grid Table 4 - Accent 3"/>
-    <w:basedOn w:val="665"/>
+    <w:basedOn w:val="897"/>
     <w:uiPriority w:val="59"/>
     <w:pPr>
       <w:pBdr/>
@@ -9728,9 +9774,9 @@
       </w:tcPr>
     </w:tblStylePr>
   </w:style>
-  <w:style w:type="table" w:styleId="44">
+  <w:style w:type="table" w:styleId="743">
     <w:name w:val="Grid Table 4 - Accent 4"/>
-    <w:basedOn w:val="665"/>
+    <w:basedOn w:val="897"/>
     <w:uiPriority w:val="59"/>
     <w:pPr>
       <w:pBdr/>
@@ -9961,9 +10007,9 @@
       </w:tcPr>
     </w:tblStylePr>
   </w:style>
-  <w:style w:type="table" w:styleId="45">
+  <w:style w:type="table" w:styleId="744">
     <w:name w:val="Grid Table 4 - Accent 5"/>
-    <w:basedOn w:val="665"/>
+    <w:basedOn w:val="897"/>
     <w:uiPriority w:val="59"/>
     <w:pPr>
       <w:pBdr/>
@@ -10194,9 +10240,9 @@
       </w:tcPr>
     </w:tblStylePr>
   </w:style>
-  <w:style w:type="table" w:styleId="46">
+  <w:style w:type="table" w:styleId="745">
     <w:name w:val="Grid Table 4 - Accent 6"/>
-    <w:basedOn w:val="665"/>
+    <w:basedOn w:val="897"/>
     <w:uiPriority w:val="59"/>
     <w:pPr>
       <w:pBdr/>
@@ -10427,9 +10473,9 @@
       </w:tcPr>
     </w:tblStylePr>
   </w:style>
-  <w:style w:type="table" w:styleId="47">
+  <w:style w:type="table" w:styleId="746">
     <w:name w:val="Grid Table 5 Dark"/>
-    <w:basedOn w:val="665"/>
+    <w:basedOn w:val="897"/>
     <w:uiPriority w:val="99"/>
     <w:pPr>
       <w:pBdr/>
@@ -10655,9 +10701,9 @@
       </w:tcPr>
     </w:tblStylePr>
   </w:style>
-  <w:style w:type="table" w:styleId="48">
+  <w:style w:type="table" w:styleId="747">
     <w:name w:val="Grid Table 5 Dark- Accent 1"/>
-    <w:basedOn w:val="665"/>
+    <w:basedOn w:val="897"/>
     <w:uiPriority w:val="99"/>
     <w:pPr>
       <w:pBdr/>
@@ -10883,9 +10929,9 @@
       </w:tcPr>
     </w:tblStylePr>
   </w:style>
-  <w:style w:type="table" w:styleId="49">
+  <w:style w:type="table" w:styleId="748">
     <w:name w:val="Grid Table 5 Dark - Accent 2"/>
-    <w:basedOn w:val="665"/>
+    <w:basedOn w:val="897"/>
     <w:uiPriority w:val="99"/>
     <w:pPr>
       <w:pBdr/>
@@ -11111,9 +11157,9 @@
       </w:tcPr>
     </w:tblStylePr>
   </w:style>
-  <w:style w:type="table" w:styleId="50">
+  <w:style w:type="table" w:styleId="749">
     <w:name w:val="Grid Table 5 Dark - Accent 3"/>
-    <w:basedOn w:val="665"/>
+    <w:basedOn w:val="897"/>
     <w:uiPriority w:val="99"/>
     <w:pPr>
       <w:pBdr/>
@@ -11339,9 +11385,9 @@
       </w:tcPr>
     </w:tblStylePr>
   </w:style>
-  <w:style w:type="table" w:styleId="51">
+  <w:style w:type="table" w:styleId="750">
     <w:name w:val="Grid Table 5 Dark- Accent 4"/>
-    <w:basedOn w:val="665"/>
+    <w:basedOn w:val="897"/>
     <w:uiPriority w:val="99"/>
     <w:pPr>
       <w:pBdr/>
@@ -11567,9 +11613,9 @@
       </w:tcPr>
     </w:tblStylePr>
   </w:style>
-  <w:style w:type="table" w:styleId="52">
+  <w:style w:type="table" w:styleId="751">
     <w:name w:val="Grid Table 5 Dark - Accent 5"/>
-    <w:basedOn w:val="665"/>
+    <w:basedOn w:val="897"/>
     <w:uiPriority w:val="99"/>
     <w:pPr>
       <w:pBdr/>
@@ -11795,9 +11841,9 @@
       </w:tcPr>
     </w:tblStylePr>
   </w:style>
-  <w:style w:type="table" w:styleId="53">
+  <w:style w:type="table" w:styleId="752">
     <w:name w:val="Grid Table 5 Dark - Accent 6"/>
-    <w:basedOn w:val="665"/>
+    <w:basedOn w:val="897"/>
     <w:uiPriority w:val="99"/>
     <w:pPr>
       <w:pBdr/>
@@ -12023,9 +12069,9 @@
       </w:tcPr>
     </w:tblStylePr>
   </w:style>
-  <w:style w:type="table" w:styleId="54">
+  <w:style w:type="table" w:styleId="753">
     <w:name w:val="Grid Table 6 Colorful"/>
-    <w:basedOn w:val="665"/>
+    <w:basedOn w:val="897"/>
     <w:uiPriority w:val="99"/>
     <w:pPr>
       <w:pBdr/>
@@ -12253,9 +12299,9 @@
       </w:tcPr>
     </w:tblStylePr>
   </w:style>
-  <w:style w:type="table" w:styleId="55">
+  <w:style w:type="table" w:styleId="754">
     <w:name w:val="Grid Table 6 Colorful - Accent 1"/>
-    <w:basedOn w:val="665"/>
+    <w:basedOn w:val="897"/>
     <w:uiPriority w:val="99"/>
     <w:pPr>
       <w:pBdr/>
@@ -12483,9 +12529,9 @@
       </w:tcPr>
     </w:tblStylePr>
   </w:style>
-  <w:style w:type="table" w:styleId="56">
+  <w:style w:type="table" w:styleId="755">
     <w:name w:val="Grid Table 6 Colorful - Accent 2"/>
-    <w:basedOn w:val="665"/>
+    <w:basedOn w:val="897"/>
     <w:uiPriority w:val="99"/>
     <w:pPr>
       <w:pBdr/>
@@ -12713,9 +12759,9 @@
       </w:tcPr>
     </w:tblStylePr>
   </w:style>
-  <w:style w:type="table" w:styleId="57">
+  <w:style w:type="table" w:styleId="756">
     <w:name w:val="Grid Table 6 Colorful - Accent 3"/>
-    <w:basedOn w:val="665"/>
+    <w:basedOn w:val="897"/>
     <w:uiPriority w:val="99"/>
     <w:pPr>
       <w:pBdr/>
@@ -12943,9 +12989,9 @@
       </w:tcPr>
     </w:tblStylePr>
   </w:style>
-  <w:style w:type="table" w:styleId="58">
+  <w:style w:type="table" w:styleId="757">
     <w:name w:val="Grid Table 6 Colorful - Accent 4"/>
-    <w:basedOn w:val="665"/>
+    <w:basedOn w:val="897"/>
     <w:uiPriority w:val="99"/>
     <w:pPr>
       <w:pBdr/>
@@ -13173,9 +13219,9 @@
       </w:tcPr>
     </w:tblStylePr>
   </w:style>
-  <w:style w:type="table" w:styleId="59">
+  <w:style w:type="table" w:styleId="758">
     <w:name w:val="Grid Table 6 Colorful - Accent 5"/>
-    <w:basedOn w:val="665"/>
+    <w:basedOn w:val="897"/>
     <w:uiPriority w:val="99"/>
     <w:pPr>
       <w:pBdr/>
@@ -13403,9 +13449,9 @@
       </w:tcPr>
     </w:tblStylePr>
   </w:style>
-  <w:style w:type="table" w:styleId="60">
+  <w:style w:type="table" w:styleId="759">
     <w:name w:val="Grid Table 6 Colorful - Accent 6"/>
-    <w:basedOn w:val="665"/>
+    <w:basedOn w:val="897"/>
     <w:uiPriority w:val="99"/>
     <w:pPr>
       <w:pBdr/>
@@ -13633,9 +13679,9 @@
       </w:tcPr>
     </w:tblStylePr>
   </w:style>
-  <w:style w:type="table" w:styleId="61">
+  <w:style w:type="table" w:styleId="760">
     <w:name w:val="Grid Table 7 Colorful"/>
-    <w:basedOn w:val="665"/>
+    <w:basedOn w:val="897"/>
     <w:uiPriority w:val="99"/>
     <w:pPr>
       <w:pBdr/>
@@ -13737,11 +13783,11 @@
         <w:tblBorders/>
       </w:tblPr>
       <w:tcPr>
-        <w:shd w:color="ffffff"/>
+        <w:shd w:val="clear" w:color="ffffff"/>
         <w:tcBorders>
-          <w:top w:val="none"/>
-          <w:left w:val="none"/>
-          <w:bottom w:val="none"/>
+          <w:top w:val="none" w:color="000000" w:sz="4" w:space="0"/>
+          <w:left w:val="none" w:color="000000" w:sz="4" w:space="0"/>
+          <w:bottom w:val="none" w:color="000000" w:sz="4" w:space="0"/>
           <w:right w:val="single" w:color="000000" w:themeColor="text1" w:themeTint="80" w:sz="4" w:space="0"/>
         </w:tcBorders>
       </w:tcPr>
@@ -13764,10 +13810,10 @@
       <w:tcPr>
         <w:shd w:val="clear" w:color="ffffff" w:themeColor="light1" w:fill="ffffff" w:themeFill="light1"/>
         <w:tcBorders>
-          <w:top w:val="none"/>
-          <w:left w:val="none"/>
+          <w:top w:val="none" w:color="000000" w:sz="4" w:space="0"/>
+          <w:left w:val="none" w:color="000000" w:sz="4" w:space="0"/>
           <w:bottom w:val="single" w:color="000000" w:themeColor="text1" w:themeTint="80" w:sz="4" w:space="0"/>
-          <w:right w:val="none"/>
+          <w:right w:val="none" w:color="000000" w:sz="4" w:space="0"/>
         </w:tcBorders>
       </w:tcPr>
     </w:tblStylePr>
@@ -13787,12 +13833,12 @@
         <w:tblBorders/>
       </w:tblPr>
       <w:tcPr>
-        <w:shd w:color="ffffff"/>
+        <w:shd w:val="clear" w:color="ffffff"/>
         <w:tcBorders>
-          <w:top w:val="none"/>
+          <w:top w:val="none" w:color="000000" w:sz="4" w:space="0"/>
           <w:left w:val="single" w:color="000000" w:themeColor="text1" w:themeTint="80" w:sz="4" w:space="0"/>
-          <w:bottom w:val="none"/>
-          <w:right w:val="none"/>
+          <w:bottom w:val="none" w:color="000000" w:sz="4" w:space="0"/>
+          <w:right w:val="none" w:color="000000" w:sz="4" w:space="0"/>
         </w:tcBorders>
       </w:tcPr>
     </w:tblStylePr>
@@ -13815,9 +13861,9 @@
         <w:shd w:val="clear" w:color="ffffff" w:themeColor="light1" w:fill="ffffff" w:themeFill="light1"/>
         <w:tcBorders>
           <w:top w:val="single" w:color="000000" w:themeColor="text1" w:themeTint="80" w:sz="4" w:space="0"/>
-          <w:left w:val="none"/>
-          <w:bottom w:val="none"/>
-          <w:right w:val="none"/>
+          <w:left w:val="none" w:color="000000" w:sz="4" w:space="0"/>
+          <w:bottom w:val="none" w:color="000000" w:sz="4" w:space="0"/>
+          <w:right w:val="none" w:color="000000" w:sz="4" w:space="0"/>
         </w:tcBorders>
       </w:tcPr>
     </w:tblStylePr>
@@ -13887,9 +13933,9 @@
       </w:tcPr>
     </w:tblStylePr>
   </w:style>
-  <w:style w:type="table" w:styleId="62">
+  <w:style w:type="table" w:styleId="761">
     <w:name w:val="Grid Table 7 Colorful - Accent 1"/>
-    <w:basedOn w:val="665"/>
+    <w:basedOn w:val="897"/>
     <w:uiPriority w:val="99"/>
     <w:pPr>
       <w:pBdr/>
@@ -13991,11 +14037,11 @@
         <w:tblBorders/>
       </w:tblPr>
       <w:tcPr>
-        <w:shd w:color="ffffff"/>
+        <w:shd w:val="clear" w:color="ffffff"/>
         <w:tcBorders>
-          <w:top w:val="none"/>
-          <w:left w:val="none"/>
-          <w:bottom w:val="none"/>
+          <w:top w:val="none" w:color="000000" w:sz="4" w:space="0"/>
+          <w:left w:val="none" w:color="000000" w:sz="4" w:space="0"/>
+          <w:bottom w:val="none" w:color="000000" w:sz="4" w:space="0"/>
           <w:right w:val="single" w:color="000000" w:themeColor="accent1" w:themeTint="80" w:sz="4" w:space="0"/>
         </w:tcBorders>
       </w:tcPr>
@@ -14018,10 +14064,10 @@
       <w:tcPr>
         <w:shd w:val="clear" w:color="ffffff" w:themeColor="light1" w:fill="ffffff" w:themeFill="light1"/>
         <w:tcBorders>
-          <w:top w:val="none"/>
-          <w:left w:val="none"/>
+          <w:top w:val="none" w:color="000000" w:sz="4" w:space="0"/>
+          <w:left w:val="none" w:color="000000" w:sz="4" w:space="0"/>
           <w:bottom w:val="single" w:color="000000" w:themeColor="accent1" w:themeTint="80" w:sz="4" w:space="0"/>
-          <w:right w:val="none"/>
+          <w:right w:val="none" w:color="000000" w:sz="4" w:space="0"/>
         </w:tcBorders>
       </w:tcPr>
     </w:tblStylePr>
@@ -14041,12 +14087,12 @@
         <w:tblBorders/>
       </w:tblPr>
       <w:tcPr>
-        <w:shd w:color="ffffff"/>
+        <w:shd w:val="clear" w:color="ffffff"/>
         <w:tcBorders>
-          <w:top w:val="none"/>
+          <w:top w:val="none" w:color="000000" w:sz="4" w:space="0"/>
           <w:left w:val="single" w:color="000000" w:themeColor="accent1" w:themeTint="80" w:sz="4" w:space="0"/>
-          <w:bottom w:val="none"/>
-          <w:right w:val="none"/>
+          <w:bottom w:val="none" w:color="000000" w:sz="4" w:space="0"/>
+          <w:right w:val="none" w:color="000000" w:sz="4" w:space="0"/>
         </w:tcBorders>
       </w:tcPr>
     </w:tblStylePr>
@@ -14069,9 +14115,9 @@
         <w:shd w:val="clear" w:color="ffffff" w:themeColor="light1" w:fill="ffffff" w:themeFill="light1"/>
         <w:tcBorders>
           <w:top w:val="single" w:color="000000" w:themeColor="accent1" w:themeTint="80" w:sz="4" w:space="0"/>
-          <w:left w:val="none"/>
-          <w:bottom w:val="none"/>
-          <w:right w:val="none"/>
+          <w:left w:val="none" w:color="000000" w:sz="4" w:space="0"/>
+          <w:bottom w:val="none" w:color="000000" w:sz="4" w:space="0"/>
+          <w:right w:val="none" w:color="000000" w:sz="4" w:space="0"/>
         </w:tcBorders>
       </w:tcPr>
     </w:tblStylePr>
@@ -14141,9 +14187,9 @@
       </w:tcPr>
     </w:tblStylePr>
   </w:style>
-  <w:style w:type="table" w:styleId="63">
+  <w:style w:type="table" w:styleId="762">
     <w:name w:val="Grid Table 7 Colorful - Accent 2"/>
-    <w:basedOn w:val="665"/>
+    <w:basedOn w:val="897"/>
     <w:uiPriority w:val="99"/>
     <w:pPr>
       <w:pBdr/>
@@ -14245,11 +14291,11 @@
         <w:tblBorders/>
       </w:tblPr>
       <w:tcPr>
-        <w:shd w:color="ffffff"/>
+        <w:shd w:val="clear" w:color="ffffff"/>
         <w:tcBorders>
-          <w:top w:val="none"/>
-          <w:left w:val="none"/>
-          <w:bottom w:val="none"/>
+          <w:top w:val="none" w:color="000000" w:sz="4" w:space="0"/>
+          <w:left w:val="none" w:color="000000" w:sz="4" w:space="0"/>
+          <w:bottom w:val="none" w:color="000000" w:sz="4" w:space="0"/>
           <w:right w:val="single" w:color="000000" w:themeColor="accent2" w:themeTint="97" w:sz="4" w:space="0"/>
         </w:tcBorders>
       </w:tcPr>
@@ -14272,10 +14318,10 @@
       <w:tcPr>
         <w:shd w:val="clear" w:color="ffffff" w:themeColor="light1" w:fill="ffffff" w:themeFill="light1"/>
         <w:tcBorders>
-          <w:top w:val="none"/>
-          <w:left w:val="none"/>
+          <w:top w:val="none" w:color="000000" w:sz="4" w:space="0"/>
+          <w:left w:val="none" w:color="000000" w:sz="4" w:space="0"/>
           <w:bottom w:val="single" w:color="000000" w:themeColor="accent2" w:themeTint="97" w:sz="4" w:space="0"/>
-          <w:right w:val="none"/>
+          <w:right w:val="none" w:color="000000" w:sz="4" w:space="0"/>
         </w:tcBorders>
       </w:tcPr>
     </w:tblStylePr>
@@ -14295,12 +14341,12 @@
         <w:tblBorders/>
       </w:tblPr>
       <w:tcPr>
-        <w:shd w:color="ffffff"/>
+        <w:shd w:val="clear" w:color="ffffff"/>
         <w:tcBorders>
-          <w:top w:val="none"/>
+          <w:top w:val="none" w:color="000000" w:sz="4" w:space="0"/>
           <w:left w:val="single" w:color="000000" w:themeColor="accent2" w:themeTint="97" w:sz="4" w:space="0"/>
-          <w:bottom w:val="none"/>
-          <w:right w:val="none"/>
+          <w:bottom w:val="none" w:color="000000" w:sz="4" w:space="0"/>
+          <w:right w:val="none" w:color="000000" w:sz="4" w:space="0"/>
         </w:tcBorders>
       </w:tcPr>
     </w:tblStylePr>
@@ -14323,9 +14369,9 @@
         <w:shd w:val="clear" w:color="ffffff" w:themeColor="light1" w:fill="ffffff" w:themeFill="light1"/>
         <w:tcBorders>
           <w:top w:val="single" w:color="000000" w:themeColor="accent2" w:themeTint="97" w:sz="4" w:space="0"/>
-          <w:left w:val="none"/>
-          <w:bottom w:val="none"/>
-          <w:right w:val="none"/>
+          <w:left w:val="none" w:color="000000" w:sz="4" w:space="0"/>
+          <w:bottom w:val="none" w:color="000000" w:sz="4" w:space="0"/>
+          <w:right w:val="none" w:color="000000" w:sz="4" w:space="0"/>
         </w:tcBorders>
       </w:tcPr>
     </w:tblStylePr>
@@ -14395,9 +14441,9 @@
       </w:tcPr>
     </w:tblStylePr>
   </w:style>
-  <w:style w:type="table" w:styleId="64">
+  <w:style w:type="table" w:styleId="763">
     <w:name w:val="Grid Table 7 Colorful - Accent 3"/>
-    <w:basedOn w:val="665"/>
+    <w:basedOn w:val="897"/>
     <w:uiPriority w:val="99"/>
     <w:pPr>
       <w:pBdr/>
@@ -14499,11 +14545,11 @@
         <w:tblBorders/>
       </w:tblPr>
       <w:tcPr>
-        <w:shd w:color="ffffff"/>
+        <w:shd w:val="clear" w:color="ffffff"/>
         <w:tcBorders>
-          <w:top w:val="none"/>
-          <w:left w:val="none"/>
-          <w:bottom w:val="none"/>
+          <w:top w:val="none" w:color="000000" w:sz="4" w:space="0"/>
+          <w:left w:val="none" w:color="000000" w:sz="4" w:space="0"/>
+          <w:bottom w:val="none" w:color="000000" w:sz="4" w:space="0"/>
           <w:right w:val="single" w:color="000000" w:themeColor="accent3" w:themeTint="FE" w:sz="4" w:space="0"/>
         </w:tcBorders>
       </w:tcPr>
@@ -14526,10 +14572,10 @@
       <w:tcPr>
         <w:shd w:val="clear" w:color="ffffff" w:themeColor="light1" w:fill="ffffff" w:themeFill="light1"/>
         <w:tcBorders>
-          <w:top w:val="none"/>
-          <w:left w:val="none"/>
+          <w:top w:val="none" w:color="000000" w:sz="4" w:space="0"/>
+          <w:left w:val="none" w:color="000000" w:sz="4" w:space="0"/>
           <w:bottom w:val="single" w:color="000000" w:themeColor="accent3" w:themeTint="FE" w:sz="4" w:space="0"/>
-          <w:right w:val="none"/>
+          <w:right w:val="none" w:color="000000" w:sz="4" w:space="0"/>
         </w:tcBorders>
       </w:tcPr>
     </w:tblStylePr>
@@ -14549,12 +14595,12 @@
         <w:tblBorders/>
       </w:tblPr>
       <w:tcPr>
-        <w:shd w:color="ffffff"/>
+        <w:shd w:val="clear" w:color="ffffff"/>
         <w:tcBorders>
-          <w:top w:val="none"/>
+          <w:top w:val="none" w:color="000000" w:sz="4" w:space="0"/>
           <w:left w:val="single" w:color="000000" w:themeColor="accent3" w:themeTint="FE" w:sz="4" w:space="0"/>
-          <w:bottom w:val="none"/>
-          <w:right w:val="none"/>
+          <w:bottom w:val="none" w:color="000000" w:sz="4" w:space="0"/>
+          <w:right w:val="none" w:color="000000" w:sz="4" w:space="0"/>
         </w:tcBorders>
       </w:tcPr>
     </w:tblStylePr>
@@ -14577,9 +14623,9 @@
         <w:shd w:val="clear" w:color="ffffff" w:themeColor="light1" w:fill="ffffff" w:themeFill="light1"/>
         <w:tcBorders>
           <w:top w:val="single" w:color="000000" w:themeColor="accent3" w:themeTint="FE" w:sz="4" w:space="0"/>
-          <w:left w:val="none"/>
-          <w:bottom w:val="none"/>
-          <w:right w:val="none"/>
+          <w:left w:val="none" w:color="000000" w:sz="4" w:space="0"/>
+          <w:bottom w:val="none" w:color="000000" w:sz="4" w:space="0"/>
+          <w:right w:val="none" w:color="000000" w:sz="4" w:space="0"/>
         </w:tcBorders>
       </w:tcPr>
     </w:tblStylePr>
@@ -14649,9 +14695,9 @@
       </w:tcPr>
     </w:tblStylePr>
   </w:style>
-  <w:style w:type="table" w:styleId="65">
+  <w:style w:type="table" w:styleId="764">
     <w:name w:val="Grid Table 7 Colorful - Accent 4"/>
-    <w:basedOn w:val="665"/>
+    <w:basedOn w:val="897"/>
     <w:uiPriority w:val="99"/>
     <w:pPr>
       <w:pBdr/>
@@ -14753,11 +14799,11 @@
         <w:tblBorders/>
       </w:tblPr>
       <w:tcPr>
-        <w:shd w:color="ffffff"/>
+        <w:shd w:val="clear" w:color="ffffff"/>
         <w:tcBorders>
-          <w:top w:val="none"/>
-          <w:left w:val="none"/>
-          <w:bottom w:val="none"/>
+          <w:top w:val="none" w:color="000000" w:sz="4" w:space="0"/>
+          <w:left w:val="none" w:color="000000" w:sz="4" w:space="0"/>
+          <w:bottom w:val="none" w:color="000000" w:sz="4" w:space="0"/>
           <w:right w:val="single" w:color="000000" w:themeColor="accent4" w:themeTint="9A" w:sz="4" w:space="0"/>
         </w:tcBorders>
       </w:tcPr>
@@ -14780,10 +14826,10 @@
       <w:tcPr>
         <w:shd w:val="clear" w:color="ffffff" w:themeColor="light1" w:fill="ffffff" w:themeFill="light1"/>
         <w:tcBorders>
-          <w:top w:val="none"/>
-          <w:left w:val="none"/>
+          <w:top w:val="none" w:color="000000" w:sz="4" w:space="0"/>
+          <w:left w:val="none" w:color="000000" w:sz="4" w:space="0"/>
           <w:bottom w:val="single" w:color="000000" w:themeColor="accent4" w:themeTint="9A" w:sz="4" w:space="0"/>
-          <w:right w:val="none"/>
+          <w:right w:val="none" w:color="000000" w:sz="4" w:space="0"/>
         </w:tcBorders>
       </w:tcPr>
     </w:tblStylePr>
@@ -14803,12 +14849,12 @@
         <w:tblBorders/>
       </w:tblPr>
       <w:tcPr>
-        <w:shd w:color="ffffff"/>
+        <w:shd w:val="clear" w:color="ffffff"/>
         <w:tcBorders>
-          <w:top w:val="none"/>
+          <w:top w:val="none" w:color="000000" w:sz="4" w:space="0"/>
           <w:left w:val="single" w:color="000000" w:themeColor="accent4" w:themeTint="9A" w:sz="4" w:space="0"/>
-          <w:bottom w:val="none"/>
-          <w:right w:val="none"/>
+          <w:bottom w:val="none" w:color="000000" w:sz="4" w:space="0"/>
+          <w:right w:val="none" w:color="000000" w:sz="4" w:space="0"/>
         </w:tcBorders>
       </w:tcPr>
     </w:tblStylePr>
@@ -14831,9 +14877,9 @@
         <w:shd w:val="clear" w:color="ffffff" w:themeColor="light1" w:fill="ffffff" w:themeFill="light1"/>
         <w:tcBorders>
           <w:top w:val="single" w:color="000000" w:themeColor="accent4" w:themeTint="9A" w:sz="4" w:space="0"/>
-          <w:left w:val="none"/>
-          <w:bottom w:val="none"/>
-          <w:right w:val="none"/>
+          <w:left w:val="none" w:color="000000" w:sz="4" w:space="0"/>
+          <w:bottom w:val="none" w:color="000000" w:sz="4" w:space="0"/>
+          <w:right w:val="none" w:color="000000" w:sz="4" w:space="0"/>
         </w:tcBorders>
       </w:tcPr>
     </w:tblStylePr>
@@ -14903,9 +14949,9 @@
       </w:tcPr>
     </w:tblStylePr>
   </w:style>
-  <w:style w:type="table" w:styleId="66">
+  <w:style w:type="table" w:styleId="765">
     <w:name w:val="Grid Table 7 Colorful - Accent 5"/>
-    <w:basedOn w:val="665"/>
+    <w:basedOn w:val="897"/>
     <w:uiPriority w:val="99"/>
     <w:pPr>
       <w:pBdr/>
@@ -15007,11 +15053,11 @@
         <w:tblBorders/>
       </w:tblPr>
       <w:tcPr>
-        <w:shd w:color="ffffff"/>
+        <w:shd w:val="clear" w:color="ffffff"/>
         <w:tcBorders>
-          <w:top w:val="none"/>
-          <w:left w:val="none"/>
-          <w:bottom w:val="none"/>
+          <w:top w:val="none" w:color="000000" w:sz="4" w:space="0"/>
+          <w:left w:val="none" w:color="000000" w:sz="4" w:space="0"/>
+          <w:bottom w:val="none" w:color="000000" w:sz="4" w:space="0"/>
           <w:right w:val="single" w:color="000000" w:themeColor="accent5" w:themeTint="90" w:sz="4" w:space="0"/>
         </w:tcBorders>
       </w:tcPr>
@@ -15034,10 +15080,10 @@
       <w:tcPr>
         <w:shd w:val="clear" w:color="ffffff" w:themeColor="light1" w:fill="ffffff" w:themeFill="light1"/>
         <w:tcBorders>
-          <w:top w:val="none"/>
-          <w:left w:val="none"/>
+          <w:top w:val="none" w:color="000000" w:sz="4" w:space="0"/>
+          <w:left w:val="none" w:color="000000" w:sz="4" w:space="0"/>
           <w:bottom w:val="single" w:color="000000" w:themeColor="accent5" w:themeTint="90" w:sz="4" w:space="0"/>
-          <w:right w:val="none"/>
+          <w:right w:val="none" w:color="000000" w:sz="4" w:space="0"/>
         </w:tcBorders>
       </w:tcPr>
     </w:tblStylePr>
@@ -15057,12 +15103,12 @@
         <w:tblBorders/>
       </w:tblPr>
       <w:tcPr>
-        <w:shd w:color="ffffff"/>
+        <w:shd w:val="clear" w:color="ffffff"/>
         <w:tcBorders>
-          <w:top w:val="none"/>
+          <w:top w:val="none" w:color="000000" w:sz="4" w:space="0"/>
           <w:left w:val="single" w:color="000000" w:themeColor="accent5" w:themeTint="90" w:sz="4" w:space="0"/>
-          <w:bottom w:val="none"/>
-          <w:right w:val="none"/>
+          <w:bottom w:val="none" w:color="000000" w:sz="4" w:space="0"/>
+          <w:right w:val="none" w:color="000000" w:sz="4" w:space="0"/>
         </w:tcBorders>
       </w:tcPr>
     </w:tblStylePr>
@@ -15085,9 +15131,9 @@
         <w:shd w:val="clear" w:color="ffffff" w:themeColor="light1" w:fill="ffffff" w:themeFill="light1"/>
         <w:tcBorders>
           <w:top w:val="single" w:color="000000" w:themeColor="accent5" w:themeTint="90" w:sz="4" w:space="0"/>
-          <w:left w:val="none"/>
-          <w:bottom w:val="none"/>
-          <w:right w:val="none"/>
+          <w:left w:val="none" w:color="000000" w:sz="4" w:space="0"/>
+          <w:bottom w:val="none" w:color="000000" w:sz="4" w:space="0"/>
+          <w:right w:val="none" w:color="000000" w:sz="4" w:space="0"/>
         </w:tcBorders>
       </w:tcPr>
     </w:tblStylePr>
@@ -15157,9 +15203,9 @@
       </w:tcPr>
     </w:tblStylePr>
   </w:style>
-  <w:style w:type="table" w:styleId="67">
+  <w:style w:type="table" w:styleId="766">
     <w:name w:val="Grid Table 7 Colorful - Accent 6"/>
-    <w:basedOn w:val="665"/>
+    <w:basedOn w:val="897"/>
     <w:uiPriority w:val="99"/>
     <w:pPr>
       <w:pBdr/>
@@ -15261,11 +15307,11 @@
         <w:tblBorders/>
       </w:tblPr>
       <w:tcPr>
-        <w:shd w:color="ffffff"/>
+        <w:shd w:val="clear" w:color="ffffff"/>
         <w:tcBorders>
-          <w:top w:val="none"/>
-          <w:left w:val="none"/>
-          <w:bottom w:val="none"/>
+          <w:top w:val="none" w:color="000000" w:sz="4" w:space="0"/>
+          <w:left w:val="none" w:color="000000" w:sz="4" w:space="0"/>
+          <w:bottom w:val="none" w:color="000000" w:sz="4" w:space="0"/>
           <w:right w:val="single" w:color="000000" w:themeColor="accent6" w:themeTint="90" w:sz="4" w:space="0"/>
         </w:tcBorders>
       </w:tcPr>
@@ -15288,10 +15334,10 @@
       <w:tcPr>
         <w:shd w:val="clear" w:color="ffffff" w:themeColor="light1" w:fill="ffffff" w:themeFill="light1"/>
         <w:tcBorders>
-          <w:top w:val="none"/>
-          <w:left w:val="none"/>
+          <w:top w:val="none" w:color="000000" w:sz="4" w:space="0"/>
+          <w:left w:val="none" w:color="000000" w:sz="4" w:space="0"/>
           <w:bottom w:val="single" w:color="000000" w:themeColor="accent6" w:themeTint="90" w:sz="4" w:space="0"/>
-          <w:right w:val="none"/>
+          <w:right w:val="none" w:color="000000" w:sz="4" w:space="0"/>
         </w:tcBorders>
       </w:tcPr>
     </w:tblStylePr>
@@ -15311,12 +15357,12 @@
         <w:tblBorders/>
       </w:tblPr>
       <w:tcPr>
-        <w:shd w:color="ffffff"/>
+        <w:shd w:val="clear" w:color="ffffff"/>
         <w:tcBorders>
-          <w:top w:val="none"/>
+          <w:top w:val="none" w:color="000000" w:sz="4" w:space="0"/>
           <w:left w:val="single" w:color="000000" w:themeColor="accent6" w:themeTint="90" w:sz="4" w:space="0"/>
-          <w:bottom w:val="none"/>
-          <w:right w:val="none"/>
+          <w:bottom w:val="none" w:color="000000" w:sz="4" w:space="0"/>
+          <w:right w:val="none" w:color="000000" w:sz="4" w:space="0"/>
         </w:tcBorders>
       </w:tcPr>
     </w:tblStylePr>
@@ -15339,9 +15385,9 @@
         <w:shd w:val="clear" w:color="ffffff" w:themeColor="light1" w:fill="ffffff" w:themeFill="light1"/>
         <w:tcBorders>
           <w:top w:val="single" w:color="000000" w:themeColor="accent6" w:themeTint="90" w:sz="4" w:space="0"/>
-          <w:left w:val="none"/>
-          <w:bottom w:val="none"/>
-          <w:right w:val="none"/>
+          <w:left w:val="none" w:color="000000" w:sz="4" w:space="0"/>
+          <w:bottom w:val="none" w:color="000000" w:sz="4" w:space="0"/>
+          <w:right w:val="none" w:color="000000" w:sz="4" w:space="0"/>
         </w:tcBorders>
       </w:tcPr>
     </w:tblStylePr>
@@ -15411,9 +15457,9 @@
       </w:tcPr>
     </w:tblStylePr>
   </w:style>
-  <w:style w:type="table" w:styleId="68">
+  <w:style w:type="table" w:styleId="767">
     <w:name w:val="List Table 1 Light"/>
-    <w:basedOn w:val="665"/>
+    <w:basedOn w:val="897"/>
     <w:uiPriority w:val="99"/>
     <w:pPr>
       <w:pBdr/>
@@ -15627,9 +15673,9 @@
       </w:tcPr>
     </w:tblStylePr>
   </w:style>
-  <w:style w:type="table" w:styleId="69">
+  <w:style w:type="table" w:styleId="768">
     <w:name w:val="List Table 1 Light - Accent 1"/>
-    <w:basedOn w:val="665"/>
+    <w:basedOn w:val="897"/>
     <w:uiPriority w:val="99"/>
     <w:pPr>
       <w:pBdr/>
@@ -15843,9 +15889,9 @@
       </w:tcPr>
     </w:tblStylePr>
   </w:style>
-  <w:style w:type="table" w:styleId="70">
+  <w:style w:type="table" w:styleId="769">
     <w:name w:val="List Table 1 Light - Accent 2"/>
-    <w:basedOn w:val="665"/>
+    <w:basedOn w:val="897"/>
     <w:uiPriority w:val="99"/>
     <w:pPr>
       <w:pBdr/>
@@ -16059,9 +16105,9 @@
       </w:tcPr>
     </w:tblStylePr>
   </w:style>
-  <w:style w:type="table" w:styleId="71">
+  <w:style w:type="table" w:styleId="770">
     <w:name w:val="List Table 1 Light - Accent 3"/>
-    <w:basedOn w:val="665"/>
+    <w:basedOn w:val="897"/>
     <w:uiPriority w:val="99"/>
     <w:pPr>
       <w:pBdr/>
@@ -16275,9 +16321,9 @@
       </w:tcPr>
     </w:tblStylePr>
   </w:style>
-  <w:style w:type="table" w:styleId="72">
+  <w:style w:type="table" w:styleId="771">
     <w:name w:val="List Table 1 Light - Accent 4"/>
-    <w:basedOn w:val="665"/>
+    <w:basedOn w:val="897"/>
     <w:uiPriority w:val="99"/>
     <w:pPr>
       <w:pBdr/>
@@ -16491,9 +16537,9 @@
       </w:tcPr>
     </w:tblStylePr>
   </w:style>
-  <w:style w:type="table" w:styleId="73">
+  <w:style w:type="table" w:styleId="772">
     <w:name w:val="List Table 1 Light - Accent 5"/>
-    <w:basedOn w:val="665"/>
+    <w:basedOn w:val="897"/>
     <w:uiPriority w:val="99"/>
     <w:pPr>
       <w:pBdr/>
@@ -16707,9 +16753,9 @@
       </w:tcPr>
     </w:tblStylePr>
   </w:style>
-  <w:style w:type="table" w:styleId="74">
+  <w:style w:type="table" w:styleId="773">
     <w:name w:val="List Table 1 Light - Accent 6"/>
-    <w:basedOn w:val="665"/>
+    <w:basedOn w:val="897"/>
     <w:uiPriority w:val="99"/>
     <w:pPr>
       <w:pBdr/>
@@ -16923,9 +16969,9 @@
       </w:tcPr>
     </w:tblStylePr>
   </w:style>
-  <w:style w:type="table" w:styleId="75">
+  <w:style w:type="table" w:styleId="774">
     <w:name w:val="List Table 2"/>
-    <w:basedOn w:val="665"/>
+    <w:basedOn w:val="897"/>
     <w:uiPriority w:val="99"/>
     <w:pPr>
       <w:pBdr/>
@@ -17161,9 +17207,9 @@
       </w:tcPr>
     </w:tblStylePr>
   </w:style>
-  <w:style w:type="table" w:styleId="76">
+  <w:style w:type="table" w:styleId="775">
     <w:name w:val="List Table 2 - Accent 1"/>
-    <w:basedOn w:val="665"/>
+    <w:basedOn w:val="897"/>
     <w:uiPriority w:val="99"/>
     <w:pPr>
       <w:pBdr/>
@@ -17399,9 +17445,9 @@
       </w:tcPr>
     </w:tblStylePr>
   </w:style>
-  <w:style w:type="table" w:styleId="77">
+  <w:style w:type="table" w:styleId="776">
     <w:name w:val="List Table 2 - Accent 2"/>
-    <w:basedOn w:val="665"/>
+    <w:basedOn w:val="897"/>
     <w:uiPriority w:val="99"/>
     <w:pPr>
       <w:pBdr/>
@@ -17637,9 +17683,9 @@
       </w:tcPr>
     </w:tblStylePr>
   </w:style>
-  <w:style w:type="table" w:styleId="78">
+  <w:style w:type="table" w:styleId="777">
     <w:name w:val="List Table 2 - Accent 3"/>
-    <w:basedOn w:val="665"/>
+    <w:basedOn w:val="897"/>
     <w:uiPriority w:val="99"/>
     <w:pPr>
       <w:pBdr/>
@@ -17875,9 +17921,9 @@
       </w:tcPr>
     </w:tblStylePr>
   </w:style>
-  <w:style w:type="table" w:styleId="79">
+  <w:style w:type="table" w:styleId="778">
     <w:name w:val="List Table 2 - Accent 4"/>
-    <w:basedOn w:val="665"/>
+    <w:basedOn w:val="897"/>
     <w:uiPriority w:val="99"/>
     <w:pPr>
       <w:pBdr/>
@@ -18113,9 +18159,9 @@
       </w:tcPr>
     </w:tblStylePr>
   </w:style>
-  <w:style w:type="table" w:styleId="80">
+  <w:style w:type="table" w:styleId="779">
     <w:name w:val="List Table 2 - Accent 5"/>
-    <w:basedOn w:val="665"/>
+    <w:basedOn w:val="897"/>
     <w:uiPriority w:val="99"/>
     <w:pPr>
       <w:pBdr/>
@@ -18351,9 +18397,9 @@
       </w:tcPr>
     </w:tblStylePr>
   </w:style>
-  <w:style w:type="table" w:styleId="81">
+  <w:style w:type="table" w:styleId="780">
     <w:name w:val="List Table 2 - Accent 6"/>
-    <w:basedOn w:val="665"/>
+    <w:basedOn w:val="897"/>
     <w:uiPriority w:val="99"/>
     <w:pPr>
       <w:pBdr/>
@@ -18589,9 +18635,9 @@
       </w:tcPr>
     </w:tblStylePr>
   </w:style>
-  <w:style w:type="table" w:styleId="82">
+  <w:style w:type="table" w:styleId="781">
     <w:name w:val="List Table 3"/>
-    <w:basedOn w:val="665"/>
+    <w:basedOn w:val="897"/>
     <w:uiPriority w:val="99"/>
     <w:pPr>
       <w:pBdr/>
@@ -18817,9 +18863,9 @@
       </w:tcPr>
     </w:tblStylePr>
   </w:style>
-  <w:style w:type="table" w:styleId="83">
+  <w:style w:type="table" w:styleId="782">
     <w:name w:val="List Table 3 - Accent 1"/>
-    <w:basedOn w:val="665"/>
+    <w:basedOn w:val="897"/>
     <w:uiPriority w:val="99"/>
     <w:pPr>
       <w:pBdr/>
@@ -19045,9 +19091,9 @@
       </w:tcPr>
     </w:tblStylePr>
   </w:style>
-  <w:style w:type="table" w:styleId="84">
+  <w:style w:type="table" w:styleId="783">
     <w:name w:val="List Table 3 - Accent 2"/>
-    <w:basedOn w:val="665"/>
+    <w:basedOn w:val="897"/>
     <w:uiPriority w:val="99"/>
     <w:pPr>
       <w:pBdr/>
@@ -19273,9 +19319,9 @@
       </w:tcPr>
     </w:tblStylePr>
   </w:style>
-  <w:style w:type="table" w:styleId="85">
+  <w:style w:type="table" w:styleId="784">
     <w:name w:val="List Table 3 - Accent 3"/>
-    <w:basedOn w:val="665"/>
+    <w:basedOn w:val="897"/>
     <w:uiPriority w:val="99"/>
     <w:pPr>
       <w:pBdr/>
@@ -19501,9 +19547,9 @@
       </w:tcPr>
     </w:tblStylePr>
   </w:style>
-  <w:style w:type="table" w:styleId="86">
+  <w:style w:type="table" w:styleId="785">
     <w:name w:val="List Table 3 - Accent 4"/>
-    <w:basedOn w:val="665"/>
+    <w:basedOn w:val="897"/>
     <w:uiPriority w:val="99"/>
     <w:pPr>
       <w:pBdr/>
@@ -19729,9 +19775,9 @@
       </w:tcPr>
     </w:tblStylePr>
   </w:style>
-  <w:style w:type="table" w:styleId="87">
+  <w:style w:type="table" w:styleId="786">
     <w:name w:val="List Table 3 - Accent 5"/>
-    <w:basedOn w:val="665"/>
+    <w:basedOn w:val="897"/>
     <w:uiPriority w:val="99"/>
     <w:pPr>
       <w:pBdr/>
@@ -19957,9 +20003,9 @@
       </w:tcPr>
     </w:tblStylePr>
   </w:style>
-  <w:style w:type="table" w:styleId="88">
+  <w:style w:type="table" w:styleId="787">
     <w:name w:val="List Table 3 - Accent 6"/>
-    <w:basedOn w:val="665"/>
+    <w:basedOn w:val="897"/>
     <w:uiPriority w:val="99"/>
     <w:pPr>
       <w:pBdr/>
@@ -20185,9 +20231,9 @@
       </w:tcPr>
     </w:tblStylePr>
   </w:style>
-  <w:style w:type="table" w:styleId="89">
+  <w:style w:type="table" w:styleId="788">
     <w:name w:val="List Table 4"/>
-    <w:basedOn w:val="665"/>
+    <w:basedOn w:val="897"/>
     <w:uiPriority w:val="99"/>
     <w:pPr>
       <w:pBdr/>
@@ -20410,9 +20456,9 @@
       </w:tcPr>
     </w:tblStylePr>
   </w:style>
-  <w:style w:type="table" w:styleId="90">
+  <w:style w:type="table" w:styleId="789">
     <w:name w:val="List Table 4 - Accent 1"/>
-    <w:basedOn w:val="665"/>
+    <w:basedOn w:val="897"/>
     <w:uiPriority w:val="99"/>
     <w:pPr>
       <w:pBdr/>
@@ -20635,9 +20681,9 @@
       </w:tcPr>
     </w:tblStylePr>
   </w:style>
-  <w:style w:type="table" w:styleId="91">
+  <w:style w:type="table" w:styleId="790">
     <w:name w:val="List Table 4 - Accent 2"/>
-    <w:basedOn w:val="665"/>
+    <w:basedOn w:val="897"/>
     <w:uiPriority w:val="99"/>
     <w:pPr>
       <w:pBdr/>
@@ -20860,9 +20906,9 @@
       </w:tcPr>
     </w:tblStylePr>
   </w:style>
-  <w:style w:type="table" w:styleId="92">
+  <w:style w:type="table" w:styleId="791">
     <w:name w:val="List Table 4 - Accent 3"/>
-    <w:basedOn w:val="665"/>
+    <w:basedOn w:val="897"/>
     <w:uiPriority w:val="99"/>
     <w:pPr>
       <w:pBdr/>
@@ -21085,9 +21131,9 @@
       </w:tcPr>
     </w:tblStylePr>
   </w:style>
-  <w:style w:type="table" w:styleId="93">
+  <w:style w:type="table" w:styleId="792">
     <w:name w:val="List Table 4 - Accent 4"/>
-    <w:basedOn w:val="665"/>
+    <w:basedOn w:val="897"/>
     <w:uiPriority w:val="99"/>
     <w:pPr>
       <w:pBdr/>
@@ -21310,9 +21356,9 @@
       </w:tcPr>
     </w:tblStylePr>
   </w:style>
-  <w:style w:type="table" w:styleId="94">
+  <w:style w:type="table" w:styleId="793">
     <w:name w:val="List Table 4 - Accent 5"/>
-    <w:basedOn w:val="665"/>
+    <w:basedOn w:val="897"/>
     <w:uiPriority w:val="99"/>
     <w:pPr>
       <w:pBdr/>
@@ -21535,9 +21581,9 @@
       </w:tcPr>
     </w:tblStylePr>
   </w:style>
-  <w:style w:type="table" w:styleId="95">
+  <w:style w:type="table" w:styleId="794">
     <w:name w:val="List Table 4 - Accent 6"/>
-    <w:basedOn w:val="665"/>
+    <w:basedOn w:val="897"/>
     <w:uiPriority w:val="99"/>
     <w:pPr>
       <w:pBdr/>
@@ -21760,9 +21806,9 @@
       </w:tcPr>
     </w:tblStylePr>
   </w:style>
-  <w:style w:type="table" w:styleId="96">
+  <w:style w:type="table" w:styleId="795">
     <w:name w:val="List Table 5 Dark"/>
-    <w:basedOn w:val="665"/>
+    <w:basedOn w:val="897"/>
     <w:uiPriority w:val="99"/>
     <w:pPr>
       <w:pBdr/>
@@ -22002,9 +22048,9 @@
       </w:tcPr>
     </w:tblStylePr>
   </w:style>
-  <w:style w:type="table" w:styleId="97">
+  <w:style w:type="table" w:styleId="796">
     <w:name w:val="List Table 5 Dark - Accent 1"/>
-    <w:basedOn w:val="665"/>
+    <w:basedOn w:val="897"/>
     <w:uiPriority w:val="99"/>
     <w:pPr>
       <w:pBdr/>
@@ -22244,9 +22290,9 @@
       </w:tcPr>
     </w:tblStylePr>
   </w:style>
-  <w:style w:type="table" w:styleId="98">
+  <w:style w:type="table" w:styleId="797">
     <w:name w:val="List Table 5 Dark - Accent 2"/>
-    <w:basedOn w:val="665"/>
+    <w:basedOn w:val="897"/>
     <w:uiPriority w:val="99"/>
     <w:pPr>
       <w:pBdr/>
@@ -22486,9 +22532,9 @@
       </w:tcPr>
     </w:tblStylePr>
   </w:style>
-  <w:style w:type="table" w:styleId="99">
+  <w:style w:type="table" w:styleId="798">
     <w:name w:val="List Table 5 Dark - Accent 3"/>
-    <w:basedOn w:val="665"/>
+    <w:basedOn w:val="897"/>
     <w:uiPriority w:val="99"/>
     <w:pPr>
       <w:pBdr/>
@@ -22728,9 +22774,9 @@
       </w:tcPr>
     </w:tblStylePr>
   </w:style>
-  <w:style w:type="table" w:styleId="100">
+  <w:style w:type="table" w:styleId="799">
     <w:name w:val="List Table 5 Dark - Accent 4"/>
-    <w:basedOn w:val="665"/>
+    <w:basedOn w:val="897"/>
     <w:uiPriority w:val="99"/>
     <w:pPr>
       <w:pBdr/>
@@ -22970,9 +23016,9 @@
       </w:tcPr>
     </w:tblStylePr>
   </w:style>
-  <w:style w:type="table" w:styleId="101">
+  <w:style w:type="table" w:styleId="800">
     <w:name w:val="List Table 5 Dark - Accent 5"/>
-    <w:basedOn w:val="665"/>
+    <w:basedOn w:val="897"/>
     <w:uiPriority w:val="99"/>
     <w:pPr>
       <w:pBdr/>
@@ -23212,9 +23258,9 @@
       </w:tcPr>
     </w:tblStylePr>
   </w:style>
-  <w:style w:type="table" w:styleId="102">
+  <w:style w:type="table" w:styleId="801">
     <w:name w:val="List Table 5 Dark - Accent 6"/>
-    <w:basedOn w:val="665"/>
+    <w:basedOn w:val="897"/>
     <w:uiPriority w:val="99"/>
     <w:pPr>
       <w:pBdr/>
@@ -23454,9 +23500,9 @@
       </w:tcPr>
     </w:tblStylePr>
   </w:style>
-  <w:style w:type="table" w:styleId="103">
+  <w:style w:type="table" w:styleId="802">
     <w:name w:val="List Table 6 Colorful"/>
-    <w:basedOn w:val="665"/>
+    <w:basedOn w:val="897"/>
     <w:uiPriority w:val="99"/>
     <w:pPr>
       <w:pBdr/>
@@ -23677,9 +23723,9 @@
       </w:tcPr>
     </w:tblStylePr>
   </w:style>
-  <w:style w:type="table" w:styleId="104">
+  <w:style w:type="table" w:styleId="803">
     <w:name w:val="List Table 6 Colorful - Accent 1"/>
-    <w:basedOn w:val="665"/>
+    <w:basedOn w:val="897"/>
     <w:uiPriority w:val="99"/>
     <w:pPr>
       <w:pBdr/>
@@ -23900,9 +23946,9 @@
       </w:tcPr>
     </w:tblStylePr>
   </w:style>
-  <w:style w:type="table" w:styleId="105">
+  <w:style w:type="table" w:styleId="804">
     <w:name w:val="List Table 6 Colorful - Accent 2"/>
-    <w:basedOn w:val="665"/>
+    <w:basedOn w:val="897"/>
     <w:uiPriority w:val="99"/>
     <w:pPr>
       <w:pBdr/>
@@ -24123,9 +24169,9 @@
       </w:tcPr>
     </w:tblStylePr>
   </w:style>
-  <w:style w:type="table" w:styleId="106">
+  <w:style w:type="table" w:styleId="805">
     <w:name w:val="List Table 6 Colorful - Accent 3"/>
-    <w:basedOn w:val="665"/>
+    <w:basedOn w:val="897"/>
     <w:uiPriority w:val="99"/>
     <w:pPr>
       <w:pBdr/>
@@ -24346,9 +24392,9 @@
       </w:tcPr>
     </w:tblStylePr>
   </w:style>
-  <w:style w:type="table" w:styleId="107">
+  <w:style w:type="table" w:styleId="806">
     <w:name w:val="List Table 6 Colorful - Accent 4"/>
-    <w:basedOn w:val="665"/>
+    <w:basedOn w:val="897"/>
     <w:uiPriority w:val="99"/>
     <w:pPr>
       <w:pBdr/>
@@ -24569,9 +24615,9 @@
       </w:tcPr>
     </w:tblStylePr>
   </w:style>
-  <w:style w:type="table" w:styleId="108">
+  <w:style w:type="table" w:styleId="807">
     <w:name w:val="List Table 6 Colorful - Accent 5"/>
-    <w:basedOn w:val="665"/>
+    <w:basedOn w:val="897"/>
     <w:uiPriority w:val="99"/>
     <w:pPr>
       <w:pBdr/>
@@ -24792,9 +24838,9 @@
       </w:tcPr>
     </w:tblStylePr>
   </w:style>
-  <w:style w:type="table" w:styleId="109">
+  <w:style w:type="table" w:styleId="808">
     <w:name w:val="List Table 6 Colorful - Accent 6"/>
-    <w:basedOn w:val="665"/>
+    <w:basedOn w:val="897"/>
     <w:uiPriority w:val="99"/>
     <w:pPr>
       <w:pBdr/>
@@ -25015,9 +25061,9 @@
       </w:tcPr>
     </w:tblStylePr>
   </w:style>
-  <w:style w:type="table" w:styleId="110">
+  <w:style w:type="table" w:styleId="809">
     <w:name w:val="List Table 7 Colorful"/>
-    <w:basedOn w:val="665"/>
+    <w:basedOn w:val="897"/>
     <w:uiPriority w:val="99"/>
     <w:pPr>
       <w:pBdr/>
@@ -25116,11 +25162,11 @@
         <w:tblBorders/>
       </w:tblPr>
       <w:tcPr>
-        <w:shd w:color="ffffff"/>
+        <w:shd w:val="clear" w:color="ffffff"/>
         <w:tcBorders>
-          <w:top w:val="none"/>
-          <w:left w:val="none"/>
-          <w:bottom w:val="none"/>
+          <w:top w:val="none" w:color="000000" w:sz="4" w:space="0"/>
+          <w:left w:val="none" w:color="000000" w:sz="4" w:space="0"/>
+          <w:bottom w:val="none" w:color="000000" w:sz="4" w:space="0"/>
           <w:right w:val="single" w:color="000000" w:themeColor="text1" w:themeTint="80" w:sz="4" w:space="0"/>
         </w:tcBorders>
       </w:tcPr>
@@ -25143,10 +25189,10 @@
       <w:tcPr>
         <w:shd w:val="clear" w:color="ffffff" w:themeColor="light1" w:fill="ffffff" w:themeFill="light1"/>
         <w:tcBorders>
-          <w:top w:val="none"/>
-          <w:left w:val="none"/>
+          <w:top w:val="none" w:color="000000" w:sz="4" w:space="0"/>
+          <w:left w:val="none" w:color="000000" w:sz="4" w:space="0"/>
           <w:bottom w:val="single" w:color="000000" w:themeColor="text1" w:themeTint="80" w:sz="4" w:space="0"/>
-          <w:right w:val="none"/>
+          <w:right w:val="none" w:color="000000" w:sz="4" w:space="0"/>
         </w:tcBorders>
       </w:tcPr>
     </w:tblStylePr>
@@ -25166,12 +25212,12 @@
         <w:tblBorders/>
       </w:tblPr>
       <w:tcPr>
-        <w:shd w:color="ffffff"/>
+        <w:shd w:val="clear" w:color="ffffff"/>
         <w:tcBorders>
-          <w:top w:val="none"/>
+          <w:top w:val="none" w:color="000000" w:sz="4" w:space="0"/>
           <w:left w:val="single" w:color="000000" w:themeColor="text1" w:themeTint="80" w:sz="4" w:space="0"/>
-          <w:bottom w:val="none"/>
-          <w:right w:val="none"/>
+          <w:bottom w:val="none" w:color="000000" w:sz="4" w:space="0"/>
+          <w:right w:val="none" w:color="000000" w:sz="4" w:space="0"/>
         </w:tcBorders>
       </w:tcPr>
     </w:tblStylePr>
@@ -25194,9 +25240,9 @@
         <w:shd w:val="clear" w:color="ffffff" w:themeColor="light1" w:fill="ffffff" w:themeFill="light1"/>
         <w:tcBorders>
           <w:top w:val="single" w:color="000000" w:themeColor="text1" w:themeTint="80" w:sz="4" w:space="0"/>
-          <w:left w:val="none"/>
-          <w:bottom w:val="none"/>
-          <w:right w:val="none"/>
+          <w:left w:val="none" w:color="000000" w:sz="4" w:space="0"/>
+          <w:bottom w:val="none" w:color="000000" w:sz="4" w:space="0"/>
+          <w:right w:val="none" w:color="000000" w:sz="4" w:space="0"/>
         </w:tcBorders>
       </w:tcPr>
     </w:tblStylePr>
@@ -25271,9 +25317,9 @@
       </w:tcPr>
     </w:tblStylePr>
   </w:style>
-  <w:style w:type="table" w:styleId="111">
+  <w:style w:type="table" w:styleId="810">
     <w:name w:val="List Table 7 Colorful - Accent 1"/>
-    <w:basedOn w:val="665"/>
+    <w:basedOn w:val="897"/>
     <w:uiPriority w:val="99"/>
     <w:pPr>
       <w:pBdr/>
@@ -25372,11 +25418,11 @@
         <w:tblBorders/>
       </w:tblPr>
       <w:tcPr>
-        <w:shd w:color="ffffff"/>
+        <w:shd w:val="clear" w:color="ffffff"/>
         <w:tcBorders>
-          <w:top w:val="none"/>
-          <w:left w:val="none"/>
-          <w:bottom w:val="none"/>
+          <w:top w:val="none" w:color="000000" w:sz="4" w:space="0"/>
+          <w:left w:val="none" w:color="000000" w:sz="4" w:space="0"/>
+          <w:bottom w:val="none" w:color="000000" w:sz="4" w:space="0"/>
           <w:right w:val="single" w:color="000000" w:themeColor="accent1" w:sz="4" w:space="0"/>
         </w:tcBorders>
       </w:tcPr>
@@ -25399,10 +25445,10 @@
       <w:tcPr>
         <w:shd w:val="clear" w:color="ffffff" w:themeColor="light1" w:fill="ffffff" w:themeFill="light1"/>
         <w:tcBorders>
-          <w:top w:val="none"/>
-          <w:left w:val="none"/>
+          <w:top w:val="none" w:color="000000" w:sz="4" w:space="0"/>
+          <w:left w:val="none" w:color="000000" w:sz="4" w:space="0"/>
           <w:bottom w:val="single" w:color="000000" w:themeColor="accent1" w:sz="4" w:space="0"/>
-          <w:right w:val="none"/>
+          <w:right w:val="none" w:color="000000" w:sz="4" w:space="0"/>
         </w:tcBorders>
       </w:tcPr>
     </w:tblStylePr>
@@ -25422,12 +25468,12 @@
         <w:tblBorders/>
       </w:tblPr>
       <w:tcPr>
-        <w:shd w:color="ffffff"/>
+        <w:shd w:val="clear" w:color="ffffff"/>
         <w:tcBorders>
-          <w:top w:val="none"/>
+          <w:top w:val="none" w:color="000000" w:sz="4" w:space="0"/>
           <w:left w:val="single" w:color="000000" w:themeColor="accent1" w:sz="4" w:space="0"/>
-          <w:bottom w:val="none"/>
-          <w:right w:val="none"/>
+          <w:bottom w:val="none" w:color="000000" w:sz="4" w:space="0"/>
+          <w:right w:val="none" w:color="000000" w:sz="4" w:space="0"/>
         </w:tcBorders>
       </w:tcPr>
     </w:tblStylePr>
@@ -25450,9 +25496,9 @@
         <w:shd w:val="clear" w:color="ffffff" w:themeColor="light1" w:fill="ffffff" w:themeFill="light1"/>
         <w:tcBorders>
           <w:top w:val="single" w:color="000000" w:themeColor="accent1" w:sz="4" w:space="0"/>
-          <w:left w:val="none"/>
-          <w:bottom w:val="none"/>
-          <w:right w:val="none"/>
+          <w:left w:val="none" w:color="000000" w:sz="4" w:space="0"/>
+          <w:bottom w:val="none" w:color="000000" w:sz="4" w:space="0"/>
+          <w:right w:val="none" w:color="000000" w:sz="4" w:space="0"/>
         </w:tcBorders>
       </w:tcPr>
     </w:tblStylePr>
@@ -25527,9 +25573,9 @@
       </w:tcPr>
     </w:tblStylePr>
   </w:style>
-  <w:style w:type="table" w:styleId="112">
+  <w:style w:type="table" w:styleId="811">
     <w:name w:val="List Table 7 Colorful - Accent 2"/>
-    <w:basedOn w:val="665"/>
+    <w:basedOn w:val="897"/>
     <w:uiPriority w:val="99"/>
     <w:pPr>
       <w:pBdr/>
@@ -25628,11 +25674,11 @@
         <w:tblBorders/>
       </w:tblPr>
       <w:tcPr>
-        <w:shd w:color="ffffff"/>
+        <w:shd w:val="clear" w:color="ffffff"/>
         <w:tcBorders>
-          <w:top w:val="none"/>
-          <w:left w:val="none"/>
-          <w:bottom w:val="none"/>
+          <w:top w:val="none" w:color="000000" w:sz="4" w:space="0"/>
+          <w:left w:val="none" w:color="000000" w:sz="4" w:space="0"/>
+          <w:bottom w:val="none" w:color="000000" w:sz="4" w:space="0"/>
           <w:right w:val="single" w:color="000000" w:themeColor="accent2" w:themeTint="97" w:sz="4" w:space="0"/>
         </w:tcBorders>
       </w:tcPr>
@@ -25655,10 +25701,10 @@
       <w:tcPr>
         <w:shd w:val="clear" w:color="ffffff" w:themeColor="light1" w:fill="ffffff" w:themeFill="light1"/>
         <w:tcBorders>
-          <w:top w:val="none"/>
-          <w:left w:val="none"/>
+          <w:top w:val="none" w:color="000000" w:sz="4" w:space="0"/>
+          <w:left w:val="none" w:color="000000" w:sz="4" w:space="0"/>
           <w:bottom w:val="single" w:color="000000" w:themeColor="accent2" w:themeTint="97" w:sz="4" w:space="0"/>
-          <w:right w:val="none"/>
+          <w:right w:val="none" w:color="000000" w:sz="4" w:space="0"/>
         </w:tcBorders>
       </w:tcPr>
     </w:tblStylePr>
@@ -25678,12 +25724,12 @@
         <w:tblBorders/>
       </w:tblPr>
       <w:tcPr>
-        <w:shd w:color="ffffff"/>
+        <w:shd w:val="clear" w:color="ffffff"/>
         <w:tcBorders>
-          <w:top w:val="none"/>
+          <w:top w:val="none" w:color="000000" w:sz="4" w:space="0"/>
           <w:left w:val="single" w:color="000000" w:themeColor="accent2" w:themeTint="97" w:sz="4" w:space="0"/>
-          <w:bottom w:val="none"/>
-          <w:right w:val="none"/>
+          <w:bottom w:val="none" w:color="000000" w:sz="4" w:space="0"/>
+          <w:right w:val="none" w:color="000000" w:sz="4" w:space="0"/>
         </w:tcBorders>
       </w:tcPr>
     </w:tblStylePr>
@@ -25706,9 +25752,9 @@
         <w:shd w:val="clear" w:color="ffffff" w:themeColor="light1" w:fill="ffffff" w:themeFill="light1"/>
         <w:tcBorders>
           <w:top w:val="single" w:color="000000" w:themeColor="accent2" w:themeTint="97" w:sz="4" w:space="0"/>
-          <w:left w:val="none"/>
-          <w:bottom w:val="none"/>
-          <w:right w:val="none"/>
+          <w:left w:val="none" w:color="000000" w:sz="4" w:space="0"/>
+          <w:bottom w:val="none" w:color="000000" w:sz="4" w:space="0"/>
+          <w:right w:val="none" w:color="000000" w:sz="4" w:space="0"/>
         </w:tcBorders>
       </w:tcPr>
     </w:tblStylePr>
@@ -25783,9 +25829,9 @@
       </w:tcPr>
     </w:tblStylePr>
   </w:style>
-  <w:style w:type="table" w:styleId="113">
+  <w:style w:type="table" w:styleId="812">
     <w:name w:val="List Table 7 Colorful - Accent 3"/>
-    <w:basedOn w:val="665"/>
+    <w:basedOn w:val="897"/>
     <w:uiPriority w:val="99"/>
     <w:pPr>
       <w:pBdr/>
@@ -25884,11 +25930,11 @@
         <w:tblBorders/>
       </w:tblPr>
       <w:tcPr>
-        <w:shd w:color="ffffff"/>
+        <w:shd w:val="clear" w:color="ffffff"/>
         <w:tcBorders>
-          <w:top w:val="none"/>
-          <w:left w:val="none"/>
-          <w:bottom w:val="none"/>
+          <w:top w:val="none" w:color="000000" w:sz="4" w:space="0"/>
+          <w:left w:val="none" w:color="000000" w:sz="4" w:space="0"/>
+          <w:bottom w:val="none" w:color="000000" w:sz="4" w:space="0"/>
           <w:right w:val="single" w:color="000000" w:themeColor="accent3" w:themeTint="98" w:sz="4" w:space="0"/>
         </w:tcBorders>
       </w:tcPr>
@@ -25911,10 +25957,10 @@
       <w:tcPr>
         <w:shd w:val="clear" w:color="ffffff" w:themeColor="light1" w:fill="ffffff" w:themeFill="light1"/>
         <w:tcBorders>
-          <w:top w:val="none"/>
-          <w:left w:val="none"/>
+          <w:top w:val="none" w:color="000000" w:sz="4" w:space="0"/>
+          <w:left w:val="none" w:color="000000" w:sz="4" w:space="0"/>
           <w:bottom w:val="single" w:color="000000" w:themeColor="accent3" w:themeTint="98" w:sz="4" w:space="0"/>
-          <w:right w:val="none"/>
+          <w:right w:val="none" w:color="000000" w:sz="4" w:space="0"/>
         </w:tcBorders>
       </w:tcPr>
     </w:tblStylePr>
@@ -25934,12 +25980,12 @@
         <w:tblBorders/>
       </w:tblPr>
       <w:tcPr>
-        <w:shd w:color="ffffff"/>
+        <w:shd w:val="clear" w:color="ffffff"/>
         <w:tcBorders>
-          <w:top w:val="none"/>
+          <w:top w:val="none" w:color="000000" w:sz="4" w:space="0"/>
           <w:left w:val="single" w:color="000000" w:themeColor="accent3" w:themeTint="98" w:sz="4" w:space="0"/>
-          <w:bottom w:val="none"/>
-          <w:right w:val="none"/>
+          <w:bottom w:val="none" w:color="000000" w:sz="4" w:space="0"/>
+          <w:right w:val="none" w:color="000000" w:sz="4" w:space="0"/>
         </w:tcBorders>
       </w:tcPr>
     </w:tblStylePr>
@@ -25962,9 +26008,9 @@
         <w:shd w:val="clear" w:color="ffffff" w:themeColor="light1" w:fill="ffffff" w:themeFill="light1"/>
         <w:tcBorders>
           <w:top w:val="single" w:color="000000" w:themeColor="accent3" w:themeTint="98" w:sz="4" w:space="0"/>
-          <w:left w:val="none"/>
-          <w:bottom w:val="none"/>
-          <w:right w:val="none"/>
+          <w:left w:val="none" w:color="000000" w:sz="4" w:space="0"/>
+          <w:bottom w:val="none" w:color="000000" w:sz="4" w:space="0"/>
+          <w:right w:val="none" w:color="000000" w:sz="4" w:space="0"/>
         </w:tcBorders>
       </w:tcPr>
     </w:tblStylePr>
@@ -26039,9 +26085,9 @@
       </w:tcPr>
     </w:tblStylePr>
   </w:style>
-  <w:style w:type="table" w:styleId="114">
+  <w:style w:type="table" w:styleId="813">
     <w:name w:val="List Table 7 Colorful - Accent 4"/>
-    <w:basedOn w:val="665"/>
+    <w:basedOn w:val="897"/>
     <w:uiPriority w:val="99"/>
     <w:pPr>
       <w:pBdr/>
@@ -26140,11 +26186,11 @@
         <w:tblBorders/>
       </w:tblPr>
       <w:tcPr>
-        <w:shd w:color="ffffff"/>
+        <w:shd w:val="clear" w:color="ffffff"/>
         <w:tcBorders>
-          <w:top w:val="none"/>
-          <w:left w:val="none"/>
-          <w:bottom w:val="none"/>
+          <w:top w:val="none" w:color="000000" w:sz="4" w:space="0"/>
+          <w:left w:val="none" w:color="000000" w:sz="4" w:space="0"/>
+          <w:bottom w:val="none" w:color="000000" w:sz="4" w:space="0"/>
           <w:right w:val="single" w:color="000000" w:themeColor="accent4" w:themeTint="9A" w:sz="4" w:space="0"/>
         </w:tcBorders>
       </w:tcPr>
@@ -26167,10 +26213,10 @@
       <w:tcPr>
         <w:shd w:val="clear" w:color="ffffff" w:themeColor="light1" w:fill="ffffff" w:themeFill="light1"/>
         <w:tcBorders>
-          <w:top w:val="none"/>
-          <w:left w:val="none"/>
+          <w:top w:val="none" w:color="000000" w:sz="4" w:space="0"/>
+          <w:left w:val="none" w:color="000000" w:sz="4" w:space="0"/>
           <w:bottom w:val="single" w:color="000000" w:themeColor="accent4" w:themeTint="9A" w:sz="4" w:space="0"/>
-          <w:right w:val="none"/>
+          <w:right w:val="none" w:color="000000" w:sz="4" w:space="0"/>
         </w:tcBorders>
       </w:tcPr>
     </w:tblStylePr>
@@ -26190,12 +26236,12 @@
         <w:tblBorders/>
       </w:tblPr>
       <w:tcPr>
-        <w:shd w:color="ffffff"/>
+        <w:shd w:val="clear" w:color="ffffff"/>
         <w:tcBorders>
-          <w:top w:val="none"/>
+          <w:top w:val="none" w:color="000000" w:sz="4" w:space="0"/>
           <w:left w:val="single" w:color="000000" w:themeColor="accent4" w:themeTint="9A" w:sz="4" w:space="0"/>
-          <w:bottom w:val="none"/>
-          <w:right w:val="none"/>
+          <w:bottom w:val="none" w:color="000000" w:sz="4" w:space="0"/>
+          <w:right w:val="none" w:color="000000" w:sz="4" w:space="0"/>
         </w:tcBorders>
       </w:tcPr>
     </w:tblStylePr>
@@ -26218,9 +26264,9 @@
         <w:shd w:val="clear" w:color="ffffff" w:themeColor="light1" w:fill="ffffff" w:themeFill="light1"/>
         <w:tcBorders>
           <w:top w:val="single" w:color="000000" w:themeColor="accent4" w:themeTint="9A" w:sz="4" w:space="0"/>
-          <w:left w:val="none"/>
-          <w:bottom w:val="none"/>
-          <w:right w:val="none"/>
+          <w:left w:val="none" w:color="000000" w:sz="4" w:space="0"/>
+          <w:bottom w:val="none" w:color="000000" w:sz="4" w:space="0"/>
+          <w:right w:val="none" w:color="000000" w:sz="4" w:space="0"/>
         </w:tcBorders>
       </w:tcPr>
     </w:tblStylePr>
@@ -26295,9 +26341,9 @@
       </w:tcPr>
     </w:tblStylePr>
   </w:style>
-  <w:style w:type="table" w:styleId="115">
+  <w:style w:type="table" w:styleId="814">
     <w:name w:val="List Table 7 Colorful - Accent 5"/>
-    <w:basedOn w:val="665"/>
+    <w:basedOn w:val="897"/>
     <w:uiPriority w:val="99"/>
     <w:pPr>
       <w:pBdr/>
@@ -26396,11 +26442,11 @@
         <w:tblBorders/>
       </w:tblPr>
       <w:tcPr>
-        <w:shd w:color="ffffff"/>
+        <w:shd w:val="clear" w:color="ffffff"/>
         <w:tcBorders>
-          <w:top w:val="none"/>
-          <w:left w:val="none"/>
-          <w:bottom w:val="none"/>
+          <w:top w:val="none" w:color="000000" w:sz="4" w:space="0"/>
+          <w:left w:val="none" w:color="000000" w:sz="4" w:space="0"/>
+          <w:bottom w:val="none" w:color="000000" w:sz="4" w:space="0"/>
           <w:right w:val="single" w:color="000000" w:themeColor="accent5" w:themeTint="9A" w:sz="4" w:space="0"/>
         </w:tcBorders>
       </w:tcPr>
@@ -26423,10 +26469,10 @@
       <w:tcPr>
         <w:shd w:val="clear" w:color="ffffff" w:themeColor="light1" w:fill="ffffff" w:themeFill="light1"/>
         <w:tcBorders>
-          <w:top w:val="none"/>
-          <w:left w:val="none"/>
+          <w:top w:val="none" w:color="000000" w:sz="4" w:space="0"/>
+          <w:left w:val="none" w:color="000000" w:sz="4" w:space="0"/>
           <w:bottom w:val="single" w:color="000000" w:themeColor="accent5" w:themeTint="9A" w:sz="4" w:space="0"/>
-          <w:right w:val="none"/>
+          <w:right w:val="none" w:color="000000" w:sz="4" w:space="0"/>
         </w:tcBorders>
       </w:tcPr>
     </w:tblStylePr>
@@ -26446,12 +26492,12 @@
         <w:tblBorders/>
       </w:tblPr>
       <w:tcPr>
-        <w:shd w:color="ffffff"/>
+        <w:shd w:val="clear" w:color="ffffff"/>
         <w:tcBorders>
-          <w:top w:val="none"/>
+          <w:top w:val="none" w:color="000000" w:sz="4" w:space="0"/>
           <w:left w:val="single" w:color="000000" w:themeColor="accent5" w:themeTint="9A" w:sz="4" w:space="0"/>
-          <w:bottom w:val="none"/>
-          <w:right w:val="none"/>
+          <w:bottom w:val="none" w:color="000000" w:sz="4" w:space="0"/>
+          <w:right w:val="none" w:color="000000" w:sz="4" w:space="0"/>
         </w:tcBorders>
       </w:tcPr>
     </w:tblStylePr>
@@ -26474,9 +26520,9 @@
         <w:shd w:val="clear" w:color="ffffff" w:themeColor="light1" w:fill="ffffff" w:themeFill="light1"/>
         <w:tcBorders>
           <w:top w:val="single" w:color="000000" w:themeColor="accent5" w:themeTint="9A" w:sz="4" w:space="0"/>
-          <w:left w:val="none"/>
-          <w:bottom w:val="none"/>
-          <w:right w:val="none"/>
+          <w:left w:val="none" w:color="000000" w:sz="4" w:space="0"/>
+          <w:bottom w:val="none" w:color="000000" w:sz="4" w:space="0"/>
+          <w:right w:val="none" w:color="000000" w:sz="4" w:space="0"/>
         </w:tcBorders>
       </w:tcPr>
     </w:tblStylePr>
@@ -26551,9 +26597,9 @@
       </w:tcPr>
     </w:tblStylePr>
   </w:style>
-  <w:style w:type="table" w:styleId="116">
+  <w:style w:type="table" w:styleId="815">
     <w:name w:val="List Table 7 Colorful - Accent 6"/>
-    <w:basedOn w:val="665"/>
+    <w:basedOn w:val="897"/>
     <w:uiPriority w:val="99"/>
     <w:pPr>
       <w:pBdr/>
@@ -26652,11 +26698,11 @@
         <w:tblBorders/>
       </w:tblPr>
       <w:tcPr>
-        <w:shd w:color="ffffff"/>
+        <w:shd w:val="clear" w:color="ffffff"/>
         <w:tcBorders>
-          <w:top w:val="none"/>
-          <w:left w:val="none"/>
-          <w:bottom w:val="none"/>
+          <w:top w:val="none" w:color="000000" w:sz="4" w:space="0"/>
+          <w:left w:val="none" w:color="000000" w:sz="4" w:space="0"/>
+          <w:bottom w:val="none" w:color="000000" w:sz="4" w:space="0"/>
           <w:right w:val="single" w:color="000000" w:themeColor="accent6" w:themeTint="98" w:sz="4" w:space="0"/>
         </w:tcBorders>
       </w:tcPr>
@@ -26679,10 +26725,10 @@
       <w:tcPr>
         <w:shd w:val="clear" w:color="ffffff" w:themeColor="light1" w:fill="ffffff" w:themeFill="light1"/>
         <w:tcBorders>
-          <w:top w:val="none"/>
-          <w:left w:val="none"/>
+          <w:top w:val="none" w:color="000000" w:sz="4" w:space="0"/>
+          <w:left w:val="none" w:color="000000" w:sz="4" w:space="0"/>
           <w:bottom w:val="single" w:color="000000" w:themeColor="accent6" w:themeTint="98" w:sz="4" w:space="0"/>
-          <w:right w:val="none"/>
+          <w:right w:val="none" w:color="000000" w:sz="4" w:space="0"/>
         </w:tcBorders>
       </w:tcPr>
     </w:tblStylePr>
@@ -26702,12 +26748,12 @@
         <w:tblBorders/>
       </w:tblPr>
       <w:tcPr>
-        <w:shd w:color="ffffff"/>
+        <w:shd w:val="clear" w:color="ffffff"/>
         <w:tcBorders>
-          <w:top w:val="none"/>
+          <w:top w:val="none" w:color="000000" w:sz="4" w:space="0"/>
           <w:left w:val="single" w:color="000000" w:themeColor="accent6" w:themeTint="98" w:sz="4" w:space="0"/>
-          <w:bottom w:val="none"/>
-          <w:right w:val="none"/>
+          <w:bottom w:val="none" w:color="000000" w:sz="4" w:space="0"/>
+          <w:right w:val="none" w:color="000000" w:sz="4" w:space="0"/>
         </w:tcBorders>
       </w:tcPr>
     </w:tblStylePr>
@@ -26730,9 +26776,9 @@
         <w:shd w:val="clear" w:color="ffffff" w:themeColor="light1" w:fill="ffffff" w:themeFill="light1"/>
         <w:tcBorders>
           <w:top w:val="single" w:color="000000" w:themeColor="accent6" w:themeTint="98" w:sz="4" w:space="0"/>
-          <w:left w:val="none"/>
-          <w:bottom w:val="none"/>
-          <w:right w:val="none"/>
+          <w:left w:val="none" w:color="000000" w:sz="4" w:space="0"/>
+          <w:bottom w:val="none" w:color="000000" w:sz="4" w:space="0"/>
+          <w:right w:val="none" w:color="000000" w:sz="4" w:space="0"/>
         </w:tcBorders>
       </w:tcPr>
     </w:tblStylePr>
@@ -26807,9 +26853,9 @@
       </w:tcPr>
     </w:tblStylePr>
   </w:style>
-  <w:style w:type="table" w:styleId="117">
+  <w:style w:type="table" w:styleId="816">
     <w:name w:val="Lined - Accent"/>
-    <w:basedOn w:val="665"/>
+    <w:basedOn w:val="897"/>
     <w:uiPriority w:val="99"/>
     <w:pPr>
       <w:pBdr/>
@@ -27044,9 +27090,9 @@
       </w:tcPr>
     </w:tblStylePr>
   </w:style>
-  <w:style w:type="table" w:styleId="118">
+  <w:style w:type="table" w:styleId="817">
     <w:name w:val="Lined - Accent 1"/>
-    <w:basedOn w:val="665"/>
+    <w:basedOn w:val="897"/>
     <w:uiPriority w:val="99"/>
     <w:pPr>
       <w:pBdr/>
@@ -27281,9 +27327,9 @@
       </w:tcPr>
     </w:tblStylePr>
   </w:style>
-  <w:style w:type="table" w:styleId="119">
+  <w:style w:type="table" w:styleId="818">
     <w:name w:val="Lined - Accent 2"/>
-    <w:basedOn w:val="665"/>
+    <w:basedOn w:val="897"/>
     <w:uiPriority w:val="99"/>
     <w:pPr>
       <w:pBdr/>
@@ -27518,9 +27564,9 @@
       </w:tcPr>
     </w:tblStylePr>
   </w:style>
-  <w:style w:type="table" w:styleId="120">
+  <w:style w:type="table" w:styleId="819">
     <w:name w:val="Lined - Accent 3"/>
-    <w:basedOn w:val="665"/>
+    <w:basedOn w:val="897"/>
     <w:uiPriority w:val="99"/>
     <w:pPr>
       <w:pBdr/>
@@ -27755,9 +27801,9 @@
       </w:tcPr>
     </w:tblStylePr>
   </w:style>
-  <w:style w:type="table" w:styleId="121">
+  <w:style w:type="table" w:styleId="820">
     <w:name w:val="Lined - Accent 4"/>
-    <w:basedOn w:val="665"/>
+    <w:basedOn w:val="897"/>
     <w:uiPriority w:val="99"/>
     <w:pPr>
       <w:pBdr/>
@@ -27992,9 +28038,9 @@
       </w:tcPr>
     </w:tblStylePr>
   </w:style>
-  <w:style w:type="table" w:styleId="122">
+  <w:style w:type="table" w:styleId="821">
     <w:name w:val="Lined - Accent 5"/>
-    <w:basedOn w:val="665"/>
+    <w:basedOn w:val="897"/>
     <w:uiPriority w:val="99"/>
     <w:pPr>
       <w:pBdr/>
@@ -28229,9 +28275,9 @@
       </w:tcPr>
     </w:tblStylePr>
   </w:style>
-  <w:style w:type="table" w:styleId="123">
+  <w:style w:type="table" w:styleId="822">
     <w:name w:val="Lined - Accent 6"/>
-    <w:basedOn w:val="665"/>
+    <w:basedOn w:val="897"/>
     <w:uiPriority w:val="99"/>
     <w:pPr>
       <w:pBdr/>
@@ -28466,9 +28512,9 @@
       </w:tcPr>
     </w:tblStylePr>
   </w:style>
-  <w:style w:type="table" w:styleId="124">
+  <w:style w:type="table" w:styleId="823">
     <w:name w:val="Bordered &amp; Lined - Accent"/>
-    <w:basedOn w:val="665"/>
+    <w:basedOn w:val="897"/>
     <w:uiPriority w:val="99"/>
     <w:pPr>
       <w:pBdr/>
@@ -28710,9 +28756,9 @@
       </w:tcPr>
     </w:tblStylePr>
   </w:style>
-  <w:style w:type="table" w:styleId="125">
+  <w:style w:type="table" w:styleId="824">
     <w:name w:val="Bordered &amp; Lined - Accent 1"/>
-    <w:basedOn w:val="665"/>
+    <w:basedOn w:val="897"/>
     <w:uiPriority w:val="99"/>
     <w:pPr>
       <w:pBdr/>
@@ -28954,9 +29000,9 @@
       </w:tcPr>
     </w:tblStylePr>
   </w:style>
-  <w:style w:type="table" w:styleId="126">
+  <w:style w:type="table" w:styleId="825">
     <w:name w:val="Bordered &amp; Lined - Accent 2"/>
-    <w:basedOn w:val="665"/>
+    <w:basedOn w:val="897"/>
     <w:uiPriority w:val="99"/>
     <w:pPr>
       <w:pBdr/>
@@ -29198,9 +29244,9 @@
       </w:tcPr>
     </w:tblStylePr>
   </w:style>
-  <w:style w:type="table" w:styleId="127">
+  <w:style w:type="table" w:styleId="826">
     <w:name w:val="Bordered &amp; Lined - Accent 3"/>
-    <w:basedOn w:val="665"/>
+    <w:basedOn w:val="897"/>
     <w:uiPriority w:val="99"/>
     <w:pPr>
       <w:pBdr/>
@@ -29442,9 +29488,9 @@
       </w:tcPr>
     </w:tblStylePr>
   </w:style>
-  <w:style w:type="table" w:styleId="128">
+  <w:style w:type="table" w:styleId="827">
     <w:name w:val="Bordered &amp; Lined - Accent 4"/>
-    <w:basedOn w:val="665"/>
+    <w:basedOn w:val="897"/>
     <w:uiPriority w:val="99"/>
     <w:pPr>
       <w:pBdr/>
@@ -29686,9 +29732,9 @@
       </w:tcPr>
     </w:tblStylePr>
   </w:style>
-  <w:style w:type="table" w:styleId="129">
+  <w:style w:type="table" w:styleId="828">
     <w:name w:val="Bordered &amp; Lined - Accent 5"/>
-    <w:basedOn w:val="665"/>
+    <w:basedOn w:val="897"/>
     <w:uiPriority w:val="99"/>
     <w:pPr>
       <w:pBdr/>
@@ -29930,9 +29976,9 @@
       </w:tcPr>
     </w:tblStylePr>
   </w:style>
-  <w:style w:type="table" w:styleId="130">
+  <w:style w:type="table" w:styleId="829">
     <w:name w:val="Bordered &amp; Lined - Accent 6"/>
-    <w:basedOn w:val="665"/>
+    <w:basedOn w:val="897"/>
     <w:uiPriority w:val="99"/>
     <w:pPr>
       <w:pBdr/>
@@ -30174,9 +30220,9 @@
       </w:tcPr>
     </w:tblStylePr>
   </w:style>
-  <w:style w:type="table" w:styleId="131">
+  <w:style w:type="table" w:styleId="830">
     <w:name w:val="Bordered"/>
-    <w:basedOn w:val="665"/>
+    <w:basedOn w:val="897"/>
     <w:uiPriority w:val="99"/>
     <w:pPr>
       <w:pBdr/>
@@ -30405,9 +30451,9 @@
       </w:tcPr>
     </w:tblStylePr>
   </w:style>
-  <w:style w:type="table" w:styleId="132">
+  <w:style w:type="table" w:styleId="831">
     <w:name w:val="Bordered - Accent 1"/>
-    <w:basedOn w:val="665"/>
+    <w:basedOn w:val="897"/>
     <w:uiPriority w:val="99"/>
     <w:pPr>
       <w:pBdr/>
@@ -30636,9 +30682,9 @@
       </w:tcPr>
     </w:tblStylePr>
   </w:style>
-  <w:style w:type="table" w:styleId="133">
+  <w:style w:type="table" w:styleId="832">
     <w:name w:val="Bordered - Accent 2"/>
-    <w:basedOn w:val="665"/>
+    <w:basedOn w:val="897"/>
     <w:uiPriority w:val="99"/>
     <w:pPr>
       <w:pBdr/>
@@ -30867,9 +30913,9 @@
       </w:tcPr>
     </w:tblStylePr>
   </w:style>
-  <w:style w:type="table" w:styleId="134">
+  <w:style w:type="table" w:styleId="833">
     <w:name w:val="Bordered - Accent 3"/>
-    <w:basedOn w:val="665"/>
+    <w:basedOn w:val="897"/>
     <w:uiPriority w:val="99"/>
     <w:pPr>
       <w:pBdr/>
@@ -31098,9 +31144,9 @@
       </w:tcPr>
     </w:tblStylePr>
   </w:style>
-  <w:style w:type="table" w:styleId="135">
+  <w:style w:type="table" w:styleId="834">
     <w:name w:val="Bordered - Accent 4"/>
-    <w:basedOn w:val="665"/>
+    <w:basedOn w:val="897"/>
     <w:uiPriority w:val="99"/>
     <w:pPr>
       <w:pBdr/>
@@ -31329,9 +31375,9 @@
       </w:tcPr>
     </w:tblStylePr>
   </w:style>
-  <w:style w:type="table" w:styleId="136">
+  <w:style w:type="table" w:styleId="835">
     <w:name w:val="Bordered - Accent 5"/>
-    <w:basedOn w:val="665"/>
+    <w:basedOn w:val="897"/>
     <w:uiPriority w:val="99"/>
     <w:pPr>
       <w:pBdr/>
@@ -31560,9 +31606,9 @@
       </w:tcPr>
     </w:tblStylePr>
   </w:style>
-  <w:style w:type="table" w:styleId="137">
+  <w:style w:type="table" w:styleId="836">
     <w:name w:val="Bordered - Accent 6"/>
-    <w:basedOn w:val="665"/>
+    <w:basedOn w:val="897"/>
     <w:uiPriority w:val="99"/>
     <w:pPr>
       <w:pBdr/>
@@ -31791,11 +31837,11 @@
       </w:tcPr>
     </w:tblStylePr>
   </w:style>
-  <w:style w:type="paragraph" w:styleId="139">
+  <w:style w:type="paragraph" w:styleId="837">
     <w:name w:val="Heading 1"/>
-    <w:basedOn w:val="664"/>
-    <w:next w:val="664"/>
-    <w:link w:val="150"/>
+    <w:basedOn w:val="896"/>
+    <w:next w:val="896"/>
+    <w:link w:val="847"/>
     <w:uiPriority w:val="9"/>
     <w:qFormat/>
     <w:pPr>
@@ -31813,11 +31859,11 @@
       <w:szCs w:val="40"/>
     </w:rPr>
   </w:style>
-  <w:style w:type="paragraph" w:styleId="140">
+  <w:style w:type="paragraph" w:styleId="838">
     <w:name w:val="Heading 2"/>
-    <w:basedOn w:val="664"/>
-    <w:next w:val="664"/>
-    <w:link w:val="151"/>
+    <w:basedOn w:val="896"/>
+    <w:next w:val="896"/>
+    <w:link w:val="848"/>
     <w:uiPriority w:val="9"/>
     <w:unhideWhenUsed/>
     <w:qFormat/>
@@ -31836,11 +31882,11 @@
       <w:szCs w:val="32"/>
     </w:rPr>
   </w:style>
-  <w:style w:type="paragraph" w:styleId="141">
+  <w:style w:type="paragraph" w:styleId="839">
     <w:name w:val="Heading 3"/>
-    <w:basedOn w:val="664"/>
-    <w:next w:val="664"/>
-    <w:link w:val="152"/>
+    <w:basedOn w:val="896"/>
+    <w:next w:val="896"/>
+    <w:link w:val="849"/>
     <w:uiPriority w:val="9"/>
     <w:unhideWhenUsed/>
     <w:qFormat/>
@@ -31859,11 +31905,11 @@
       <w:szCs w:val="28"/>
     </w:rPr>
   </w:style>
-  <w:style w:type="paragraph" w:styleId="142">
+  <w:style w:type="paragraph" w:styleId="840">
     <w:name w:val="Heading 4"/>
-    <w:basedOn w:val="664"/>
-    <w:next w:val="664"/>
-    <w:link w:val="153"/>
+    <w:basedOn w:val="896"/>
+    <w:next w:val="896"/>
+    <w:link w:val="850"/>
     <w:uiPriority w:val="9"/>
     <w:unhideWhenUsed/>
     <w:qFormat/>
@@ -31882,11 +31928,11 @@
       <w:color w:val="0f4761" w:themeColor="accent1" w:themeShade="BF"/>
     </w:rPr>
   </w:style>
-  <w:style w:type="paragraph" w:styleId="143">
+  <w:style w:type="paragraph" w:styleId="841">
     <w:name w:val="Heading 5"/>
-    <w:basedOn w:val="664"/>
-    <w:next w:val="664"/>
-    <w:link w:val="154"/>
+    <w:basedOn w:val="896"/>
+    <w:next w:val="896"/>
+    <w:link w:val="851"/>
     <w:uiPriority w:val="9"/>
     <w:unhideWhenUsed/>
     <w:qFormat/>
@@ -31903,11 +31949,11 @@
       <w:color w:val="0f4761" w:themeColor="accent1" w:themeShade="BF"/>
     </w:rPr>
   </w:style>
-  <w:style w:type="paragraph" w:styleId="144">
+  <w:style w:type="paragraph" w:styleId="842">
     <w:name w:val="Heading 6"/>
-    <w:basedOn w:val="664"/>
-    <w:next w:val="664"/>
-    <w:link w:val="155"/>
+    <w:basedOn w:val="896"/>
+    <w:next w:val="896"/>
+    <w:link w:val="852"/>
     <w:uiPriority w:val="9"/>
     <w:unhideWhenUsed/>
     <w:qFormat/>
@@ -31926,11 +31972,11 @@
       <w:color w:val="595959" w:themeColor="text1" w:themeTint="A6"/>
     </w:rPr>
   </w:style>
-  <w:style w:type="paragraph" w:styleId="145">
+  <w:style w:type="paragraph" w:styleId="843">
     <w:name w:val="Heading 7"/>
-    <w:basedOn w:val="664"/>
-    <w:next w:val="664"/>
-    <w:link w:val="156"/>
+    <w:basedOn w:val="896"/>
+    <w:next w:val="896"/>
+    <w:link w:val="853"/>
     <w:uiPriority w:val="9"/>
     <w:unhideWhenUsed/>
     <w:qFormat/>
@@ -31947,11 +31993,11 @@
       <w:color w:val="595959" w:themeColor="text1" w:themeTint="A6"/>
     </w:rPr>
   </w:style>
-  <w:style w:type="paragraph" w:styleId="146">
+  <w:style w:type="paragraph" w:styleId="844">
     <w:name w:val="Heading 8"/>
-    <w:basedOn w:val="664"/>
-    <w:next w:val="664"/>
-    <w:link w:val="157"/>
+    <w:basedOn w:val="896"/>
+    <w:next w:val="896"/>
+    <w:link w:val="854"/>
     <w:uiPriority w:val="9"/>
     <w:unhideWhenUsed/>
     <w:qFormat/>
@@ -31970,11 +32016,11 @@
       <w:color w:val="272727" w:themeColor="text1" w:themeTint="D8"/>
     </w:rPr>
   </w:style>
-  <w:style w:type="paragraph" w:styleId="147">
+  <w:style w:type="paragraph" w:styleId="845">
     <w:name w:val="Heading 9"/>
-    <w:basedOn w:val="664"/>
-    <w:next w:val="664"/>
-    <w:link w:val="158"/>
+    <w:basedOn w:val="896"/>
+    <w:next w:val="896"/>
+    <w:link w:val="855"/>
     <w:uiPriority w:val="9"/>
     <w:unhideWhenUsed/>
     <w:qFormat/>
@@ -31993,7 +32039,7 @@
       <w:color w:val="272727" w:themeColor="text1" w:themeTint="D8"/>
     </w:rPr>
   </w:style>
-  <w:style w:type="character" w:styleId="148" w:default="1">
+  <w:style w:type="character" w:styleId="846" w:default="1">
     <w:name w:val="Default Paragraph Font"/>
     <w:uiPriority w:val="1"/>
     <w:semiHidden/>
@@ -32004,10 +32050,10 @@
       <w:ind/>
     </w:pPr>
   </w:style>
-  <w:style w:type="character" w:styleId="150">
+  <w:style w:type="character" w:styleId="847">
     <w:name w:val="Heading 1 Char"/>
-    <w:basedOn w:val="148"/>
-    <w:link w:val="139"/>
+    <w:basedOn w:val="846"/>
+    <w:link w:val="837"/>
     <w:uiPriority w:val="9"/>
     <w:pPr>
       <w:pBdr/>
@@ -32021,10 +32067,10 @@
       <w:szCs w:val="40"/>
     </w:rPr>
   </w:style>
-  <w:style w:type="character" w:styleId="151">
+  <w:style w:type="character" w:styleId="848">
     <w:name w:val="Heading 2 Char"/>
-    <w:basedOn w:val="148"/>
-    <w:link w:val="140"/>
+    <w:basedOn w:val="846"/>
+    <w:link w:val="838"/>
     <w:uiPriority w:val="9"/>
     <w:pPr>
       <w:pBdr/>
@@ -32038,10 +32084,10 @@
       <w:szCs w:val="32"/>
     </w:rPr>
   </w:style>
-  <w:style w:type="character" w:styleId="152">
+  <w:style w:type="character" w:styleId="849">
     <w:name w:val="Heading 3 Char"/>
-    <w:basedOn w:val="148"/>
-    <w:link w:val="141"/>
+    <w:basedOn w:val="846"/>
+    <w:link w:val="839"/>
     <w:uiPriority w:val="9"/>
     <w:pPr>
       <w:pBdr/>
@@ -32055,10 +32101,10 @@
       <w:szCs w:val="28"/>
     </w:rPr>
   </w:style>
-  <w:style w:type="character" w:styleId="153">
+  <w:style w:type="character" w:styleId="850">
     <w:name w:val="Heading 4 Char"/>
-    <w:basedOn w:val="148"/>
-    <w:link w:val="142"/>
+    <w:basedOn w:val="846"/>
+    <w:link w:val="840"/>
     <w:uiPriority w:val="9"/>
     <w:pPr>
       <w:pBdr/>
@@ -32072,10 +32118,10 @@
       <w:color w:val="0f4761" w:themeColor="accent1" w:themeShade="BF"/>
     </w:rPr>
   </w:style>
-  <w:style w:type="character" w:styleId="154">
+  <w:style w:type="character" w:styleId="851">
     <w:name w:val="Heading 5 Char"/>
-    <w:basedOn w:val="148"/>
-    <w:link w:val="143"/>
+    <w:basedOn w:val="846"/>
+    <w:link w:val="841"/>
     <w:uiPriority w:val="9"/>
     <w:pPr>
       <w:pBdr/>
@@ -32087,10 +32133,10 @@
       <w:color w:val="0f4761" w:themeColor="accent1" w:themeShade="BF"/>
     </w:rPr>
   </w:style>
-  <w:style w:type="character" w:styleId="155">
+  <w:style w:type="character" w:styleId="852">
     <w:name w:val="Heading 6 Char"/>
-    <w:basedOn w:val="148"/>
-    <w:link w:val="144"/>
+    <w:basedOn w:val="846"/>
+    <w:link w:val="842"/>
     <w:uiPriority w:val="9"/>
     <w:pPr>
       <w:pBdr/>
@@ -32104,10 +32150,10 @@
       <w:color w:val="595959" w:themeColor="text1" w:themeTint="A6"/>
     </w:rPr>
   </w:style>
-  <w:style w:type="character" w:styleId="156">
+  <w:style w:type="character" w:styleId="853">
     <w:name w:val="Heading 7 Char"/>
-    <w:basedOn w:val="148"/>
-    <w:link w:val="145"/>
+    <w:basedOn w:val="846"/>
+    <w:link w:val="843"/>
     <w:uiPriority w:val="9"/>
     <w:pPr>
       <w:pBdr/>
@@ -32119,10 +32165,10 @@
       <w:color w:val="595959" w:themeColor="text1" w:themeTint="A6"/>
     </w:rPr>
   </w:style>
-  <w:style w:type="character" w:styleId="157">
+  <w:style w:type="character" w:styleId="854">
     <w:name w:val="Heading 8 Char"/>
-    <w:basedOn w:val="148"/>
-    <w:link w:val="146"/>
+    <w:basedOn w:val="846"/>
+    <w:link w:val="844"/>
     <w:uiPriority w:val="9"/>
     <w:pPr>
       <w:pBdr/>
@@ -32136,10 +32182,10 @@
       <w:color w:val="272727" w:themeColor="text1" w:themeTint="D8"/>
     </w:rPr>
   </w:style>
-  <w:style w:type="character" w:styleId="158">
+  <w:style w:type="character" w:styleId="855">
     <w:name w:val="Heading 9 Char"/>
-    <w:basedOn w:val="148"/>
-    <w:link w:val="147"/>
+    <w:basedOn w:val="846"/>
+    <w:link w:val="845"/>
     <w:uiPriority w:val="9"/>
     <w:pPr>
       <w:pBdr/>
@@ -32153,11 +32199,11 @@
       <w:color w:val="272727" w:themeColor="text1" w:themeTint="D8"/>
     </w:rPr>
   </w:style>
-  <w:style w:type="paragraph" w:styleId="159">
+  <w:style w:type="paragraph" w:styleId="856">
     <w:name w:val="Title"/>
-    <w:basedOn w:val="664"/>
-    <w:next w:val="664"/>
-    <w:link w:val="160"/>
+    <w:basedOn w:val="896"/>
+    <w:next w:val="896"/>
+    <w:link w:val="857"/>
     <w:uiPriority w:val="10"/>
     <w:qFormat/>
     <w:pPr>
@@ -32173,10 +32219,10 @@
       <w:szCs w:val="56"/>
     </w:rPr>
   </w:style>
-  <w:style w:type="character" w:styleId="160">
+  <w:style w:type="character" w:styleId="857">
     <w:name w:val="Title Char"/>
-    <w:basedOn w:val="148"/>
-    <w:link w:val="159"/>
+    <w:basedOn w:val="846"/>
+    <w:link w:val="856"/>
     <w:uiPriority w:val="10"/>
     <w:pPr>
       <w:pBdr/>
@@ -32190,11 +32236,11 @@
       <w:szCs w:val="56"/>
     </w:rPr>
   </w:style>
-  <w:style w:type="paragraph" w:styleId="161">
+  <w:style w:type="paragraph" w:styleId="858">
     <w:name w:val="Subtitle"/>
-    <w:basedOn w:val="664"/>
-    <w:next w:val="664"/>
-    <w:link w:val="162"/>
+    <w:basedOn w:val="896"/>
+    <w:next w:val="896"/>
+    <w:link w:val="859"/>
     <w:uiPriority w:val="11"/>
     <w:qFormat/>
     <w:pPr>
@@ -32212,10 +32258,10 @@
       <w:szCs w:val="28"/>
     </w:rPr>
   </w:style>
-  <w:style w:type="character" w:styleId="162">
+  <w:style w:type="character" w:styleId="859">
     <w:name w:val="Subtitle Char"/>
-    <w:basedOn w:val="148"/>
-    <w:link w:val="161"/>
+    <w:basedOn w:val="846"/>
+    <w:link w:val="858"/>
     <w:uiPriority w:val="11"/>
     <w:pPr>
       <w:pBdr/>
@@ -32229,11 +32275,11 @@
       <w:szCs w:val="28"/>
     </w:rPr>
   </w:style>
-  <w:style w:type="paragraph" w:styleId="163">
+  <w:style w:type="paragraph" w:styleId="860">
     <w:name w:val="Quote"/>
-    <w:basedOn w:val="664"/>
-    <w:next w:val="664"/>
-    <w:link w:val="164"/>
+    <w:basedOn w:val="896"/>
+    <w:next w:val="896"/>
+    <w:link w:val="861"/>
     <w:uiPriority w:val="29"/>
     <w:qFormat/>
     <w:pPr>
@@ -32248,10 +32294,10 @@
       <w:color w:val="404040" w:themeColor="text1" w:themeTint="BF"/>
     </w:rPr>
   </w:style>
-  <w:style w:type="character" w:styleId="164">
+  <w:style w:type="character" w:styleId="861">
     <w:name w:val="Quote Char"/>
-    <w:basedOn w:val="148"/>
-    <w:link w:val="163"/>
+    <w:basedOn w:val="846"/>
+    <w:link w:val="860"/>
     <w:uiPriority w:val="29"/>
     <w:pPr>
       <w:pBdr/>
@@ -32264,9 +32310,9 @@
       <w:color w:val="404040" w:themeColor="text1" w:themeTint="BF"/>
     </w:rPr>
   </w:style>
-  <w:style w:type="character" w:styleId="166">
+  <w:style w:type="character" w:styleId="862">
     <w:name w:val="Intense Emphasis"/>
-    <w:basedOn w:val="148"/>
+    <w:basedOn w:val="846"/>
     <w:uiPriority w:val="21"/>
     <w:qFormat/>
     <w:pPr>
@@ -32280,11 +32326,11 @@
       <w:color w:val="0f4761" w:themeColor="accent1" w:themeShade="BF"/>
     </w:rPr>
   </w:style>
-  <w:style w:type="paragraph" w:styleId="167">
+  <w:style w:type="paragraph" w:styleId="863">
     <w:name w:val="Intense Quote"/>
-    <w:basedOn w:val="664"/>
-    <w:next w:val="664"/>
-    <w:link w:val="168"/>
+    <w:basedOn w:val="896"/>
+    <w:next w:val="896"/>
+    <w:link w:val="864"/>
     <w:uiPriority w:val="30"/>
     <w:qFormat/>
     <w:pPr>
@@ -32302,10 +32348,10 @@
       <w:color w:val="0f4761" w:themeColor="accent1" w:themeShade="BF"/>
     </w:rPr>
   </w:style>
-  <w:style w:type="character" w:styleId="168">
+  <w:style w:type="character" w:styleId="864">
     <w:name w:val="Intense Quote Char"/>
-    <w:basedOn w:val="148"/>
-    <w:link w:val="167"/>
+    <w:basedOn w:val="846"/>
+    <w:link w:val="863"/>
     <w:uiPriority w:val="30"/>
     <w:pPr>
       <w:pBdr/>
@@ -32318,9 +32364,9 @@
       <w:color w:val="0f4761" w:themeColor="accent1" w:themeShade="BF"/>
     </w:rPr>
   </w:style>
-  <w:style w:type="character" w:styleId="169">
+  <w:style w:type="character" w:styleId="865">
     <w:name w:val="Intense Reference"/>
-    <w:basedOn w:val="148"/>
+    <w:basedOn w:val="846"/>
     <w:uiPriority w:val="32"/>
     <w:qFormat/>
     <w:pPr>
@@ -32336,9 +32382,9 @@
       <w:spacing w:val="5"/>
     </w:rPr>
   </w:style>
-  <w:style w:type="character" w:styleId="171">
+  <w:style w:type="character" w:styleId="866">
     <w:name w:val="Subtle Emphasis"/>
-    <w:basedOn w:val="148"/>
+    <w:basedOn w:val="846"/>
     <w:uiPriority w:val="19"/>
     <w:qFormat/>
     <w:pPr>
@@ -32352,9 +32398,9 @@
       <w:color w:val="404040" w:themeColor="text1" w:themeTint="BF"/>
     </w:rPr>
   </w:style>
-  <w:style w:type="character" w:styleId="172">
+  <w:style w:type="character" w:styleId="867">
     <w:name w:val="Emphasis"/>
-    <w:basedOn w:val="148"/>
+    <w:basedOn w:val="846"/>
     <w:uiPriority w:val="20"/>
     <w:qFormat/>
     <w:pPr>
@@ -32367,9 +32413,9 @@
       <w:iCs/>
     </w:rPr>
   </w:style>
-  <w:style w:type="character" w:styleId="173">
+  <w:style w:type="character" w:styleId="868">
     <w:name w:val="Strong"/>
-    <w:basedOn w:val="148"/>
+    <w:basedOn w:val="846"/>
     <w:uiPriority w:val="22"/>
     <w:qFormat/>
     <w:pPr>
@@ -32382,9 +32428,9 @@
       <w:bCs/>
     </w:rPr>
   </w:style>
-  <w:style w:type="character" w:styleId="174">
+  <w:style w:type="character" w:styleId="869">
     <w:name w:val="Subtle Reference"/>
-    <w:basedOn w:val="148"/>
+    <w:basedOn w:val="846"/>
     <w:uiPriority w:val="31"/>
     <w:qFormat/>
     <w:pPr>
@@ -32397,9 +32443,9 @@
       <w:color w:val="5a5a5a" w:themeColor="text1" w:themeTint="A5"/>
     </w:rPr>
   </w:style>
-  <w:style w:type="character" w:styleId="175">
+  <w:style w:type="character" w:styleId="870">
     <w:name w:val="Book Title"/>
-    <w:basedOn w:val="148"/>
+    <w:basedOn w:val="846"/>
     <w:uiPriority w:val="33"/>
     <w:qFormat/>
     <w:pPr>
@@ -32415,10 +32461,10 @@
       <w:spacing w:val="5"/>
     </w:rPr>
   </w:style>
-  <w:style w:type="paragraph" w:styleId="176">
+  <w:style w:type="paragraph" w:styleId="871">
     <w:name w:val="Header"/>
-    <w:basedOn w:val="664"/>
-    <w:link w:val="177"/>
+    <w:basedOn w:val="896"/>
+    <w:link w:val="872"/>
     <w:uiPriority w:val="99"/>
     <w:unhideWhenUsed/>
     <w:pPr>
@@ -32431,10 +32477,10 @@
       <w:ind/>
     </w:pPr>
   </w:style>
-  <w:style w:type="character" w:styleId="177">
+  <w:style w:type="character" w:styleId="872">
     <w:name w:val="Header Char"/>
-    <w:basedOn w:val="148"/>
-    <w:link w:val="176"/>
+    <w:basedOn w:val="846"/>
+    <w:link w:val="871"/>
     <w:uiPriority w:val="99"/>
     <w:pPr>
       <w:pBdr/>
@@ -32442,10 +32488,10 @@
       <w:ind/>
     </w:pPr>
   </w:style>
-  <w:style w:type="paragraph" w:styleId="178">
+  <w:style w:type="paragraph" w:styleId="873">
     <w:name w:val="Footer"/>
-    <w:basedOn w:val="664"/>
-    <w:link w:val="179"/>
+    <w:basedOn w:val="896"/>
+    <w:link w:val="874"/>
     <w:uiPriority w:val="99"/>
     <w:unhideWhenUsed/>
     <w:pPr>
@@ -32458,10 +32504,10 @@
       <w:ind/>
     </w:pPr>
   </w:style>
-  <w:style w:type="character" w:styleId="179">
+  <w:style w:type="character" w:styleId="874">
     <w:name w:val="Footer Char"/>
-    <w:basedOn w:val="148"/>
-    <w:link w:val="178"/>
+    <w:basedOn w:val="846"/>
+    <w:link w:val="873"/>
     <w:uiPriority w:val="99"/>
     <w:pPr>
       <w:pBdr/>
@@ -32469,10 +32515,10 @@
       <w:ind/>
     </w:pPr>
   </w:style>
-  <w:style w:type="paragraph" w:styleId="180">
+  <w:style w:type="paragraph" w:styleId="875">
     <w:name w:val="Caption"/>
-    <w:basedOn w:val="664"/>
-    <w:next w:val="664"/>
+    <w:basedOn w:val="896"/>
+    <w:next w:val="896"/>
     <w:uiPriority w:val="35"/>
     <w:unhideWhenUsed/>
     <w:qFormat/>
@@ -32489,10 +32535,10 @@
       <w:szCs w:val="18"/>
     </w:rPr>
   </w:style>
-  <w:style w:type="paragraph" w:styleId="181">
+  <w:style w:type="paragraph" w:styleId="876">
     <w:name w:val="footnote text"/>
-    <w:basedOn w:val="664"/>
-    <w:link w:val="182"/>
+    <w:basedOn w:val="896"/>
+    <w:link w:val="877"/>
     <w:uiPriority w:val="99"/>
     <w:semiHidden/>
     <w:unhideWhenUsed/>
@@ -32506,10 +32552,10 @@
       <w:szCs w:val="20"/>
     </w:rPr>
   </w:style>
-  <w:style w:type="character" w:styleId="182">
+  <w:style w:type="character" w:styleId="877">
     <w:name w:val="Footnote Text Char"/>
-    <w:basedOn w:val="148"/>
-    <w:link w:val="181"/>
+    <w:basedOn w:val="846"/>
+    <w:link w:val="876"/>
     <w:uiPriority w:val="99"/>
     <w:semiHidden/>
     <w:pPr>
@@ -32522,9 +32568,9 @@
       <w:szCs w:val="20"/>
     </w:rPr>
   </w:style>
-  <w:style w:type="character" w:styleId="183">
+  <w:style w:type="character" w:styleId="878">
     <w:name w:val="footnote reference"/>
-    <w:basedOn w:val="148"/>
+    <w:basedOn w:val="846"/>
     <w:uiPriority w:val="99"/>
     <w:semiHidden/>
     <w:unhideWhenUsed/>
@@ -32537,10 +32583,10 @@
       <w:vertAlign w:val="superscript"/>
     </w:rPr>
   </w:style>
-  <w:style w:type="paragraph" w:styleId="184">
+  <w:style w:type="paragraph" w:styleId="879">
     <w:name w:val="endnote text"/>
-    <w:basedOn w:val="664"/>
-    <w:link w:val="185"/>
+    <w:basedOn w:val="896"/>
+    <w:link w:val="880"/>
     <w:uiPriority w:val="99"/>
     <w:semiHidden/>
     <w:unhideWhenUsed/>
@@ -32554,10 +32600,10 @@
       <w:szCs w:val="20"/>
     </w:rPr>
   </w:style>
-  <w:style w:type="character" w:styleId="185">
+  <w:style w:type="character" w:styleId="880">
     <w:name w:val="Endnote Text Char"/>
-    <w:basedOn w:val="148"/>
-    <w:link w:val="184"/>
+    <w:basedOn w:val="846"/>
+    <w:link w:val="879"/>
     <w:uiPriority w:val="99"/>
     <w:semiHidden/>
     <w:pPr>
@@ -32570,9 +32616,9 @@
       <w:szCs w:val="20"/>
     </w:rPr>
   </w:style>
-  <w:style w:type="character" w:styleId="186">
+  <w:style w:type="character" w:styleId="881">
     <w:name w:val="endnote reference"/>
-    <w:basedOn w:val="148"/>
+    <w:basedOn w:val="846"/>
     <w:uiPriority w:val="99"/>
     <w:semiHidden/>
     <w:unhideWhenUsed/>
@@ -32585,9 +32631,9 @@
       <w:vertAlign w:val="superscript"/>
     </w:rPr>
   </w:style>
-  <w:style w:type="character" w:styleId="187">
+  <w:style w:type="character" w:styleId="882">
     <w:name w:val="Hyperlink"/>
-    <w:basedOn w:val="148"/>
+    <w:basedOn w:val="846"/>
     <w:uiPriority w:val="99"/>
     <w:unhideWhenUsed/>
     <w:pPr>
@@ -32600,9 +32646,9 @@
       <w:u w:val="single"/>
     </w:rPr>
   </w:style>
-  <w:style w:type="character" w:styleId="188">
+  <w:style w:type="character" w:styleId="883">
     <w:name w:val="FollowedHyperlink"/>
-    <w:basedOn w:val="148"/>
+    <w:basedOn w:val="846"/>
     <w:uiPriority w:val="99"/>
     <w:semiHidden/>
     <w:unhideWhenUsed/>
@@ -32616,10 +32662,10 @@
       <w:u w:val="single"/>
     </w:rPr>
   </w:style>
-  <w:style w:type="paragraph" w:styleId="189">
+  <w:style w:type="paragraph" w:styleId="884">
     <w:name w:val="toc 1"/>
-    <w:basedOn w:val="664"/>
-    <w:next w:val="664"/>
+    <w:basedOn w:val="896"/>
+    <w:next w:val="896"/>
     <w:uiPriority w:val="39"/>
     <w:unhideWhenUsed/>
     <w:pPr>
@@ -32628,10 +32674,10 @@
       <w:ind/>
     </w:pPr>
   </w:style>
-  <w:style w:type="paragraph" w:styleId="190">
+  <w:style w:type="paragraph" w:styleId="885">
     <w:name w:val="toc 2"/>
-    <w:basedOn w:val="664"/>
-    <w:next w:val="664"/>
+    <w:basedOn w:val="896"/>
+    <w:next w:val="896"/>
     <w:uiPriority w:val="39"/>
     <w:unhideWhenUsed/>
     <w:pPr>
@@ -32640,10 +32686,10 @@
       <w:ind w:left="220"/>
     </w:pPr>
   </w:style>
-  <w:style w:type="paragraph" w:styleId="191">
+  <w:style w:type="paragraph" w:styleId="886">
     <w:name w:val="toc 3"/>
-    <w:basedOn w:val="664"/>
-    <w:next w:val="664"/>
+    <w:basedOn w:val="896"/>
+    <w:next w:val="896"/>
     <w:uiPriority w:val="39"/>
     <w:unhideWhenUsed/>
     <w:pPr>
@@ -32652,10 +32698,10 @@
       <w:ind w:left="440"/>
     </w:pPr>
   </w:style>
-  <w:style w:type="paragraph" w:styleId="192">
+  <w:style w:type="paragraph" w:styleId="887">
     <w:name w:val="toc 4"/>
-    <w:basedOn w:val="664"/>
-    <w:next w:val="664"/>
+    <w:basedOn w:val="896"/>
+    <w:next w:val="896"/>
     <w:uiPriority w:val="39"/>
     <w:unhideWhenUsed/>
     <w:pPr>
@@ -32664,10 +32710,10 @@
       <w:ind w:left="660"/>
     </w:pPr>
   </w:style>
-  <w:style w:type="paragraph" w:styleId="193">
+  <w:style w:type="paragraph" w:styleId="888">
     <w:name w:val="toc 5"/>
-    <w:basedOn w:val="664"/>
-    <w:next w:val="664"/>
+    <w:basedOn w:val="896"/>
+    <w:next w:val="896"/>
     <w:uiPriority w:val="39"/>
     <w:unhideWhenUsed/>
     <w:pPr>
@@ -32676,10 +32722,10 @@
       <w:ind w:left="880"/>
     </w:pPr>
   </w:style>
-  <w:style w:type="paragraph" w:styleId="194">
+  <w:style w:type="paragraph" w:styleId="889">
     <w:name w:val="toc 6"/>
-    <w:basedOn w:val="664"/>
-    <w:next w:val="664"/>
+    <w:basedOn w:val="896"/>
+    <w:next w:val="896"/>
     <w:uiPriority w:val="39"/>
     <w:unhideWhenUsed/>
     <w:pPr>
@@ -32688,10 +32734,10 @@
       <w:ind w:left="1100"/>
     </w:pPr>
   </w:style>
-  <w:style w:type="paragraph" w:styleId="195">
+  <w:style w:type="paragraph" w:styleId="890">
     <w:name w:val="toc 7"/>
-    <w:basedOn w:val="664"/>
-    <w:next w:val="664"/>
+    <w:basedOn w:val="896"/>
+    <w:next w:val="896"/>
     <w:uiPriority w:val="39"/>
     <w:unhideWhenUsed/>
     <w:pPr>
@@ -32700,10 +32746,10 @@
       <w:ind w:left="1320"/>
     </w:pPr>
   </w:style>
-  <w:style w:type="paragraph" w:styleId="196">
+  <w:style w:type="paragraph" w:styleId="891">
     <w:name w:val="toc 8"/>
-    <w:basedOn w:val="664"/>
-    <w:next w:val="664"/>
+    <w:basedOn w:val="896"/>
+    <w:next w:val="896"/>
     <w:uiPriority w:val="39"/>
     <w:unhideWhenUsed/>
     <w:pPr>
@@ -32712,10 +32758,10 @@
       <w:ind w:left="1540"/>
     </w:pPr>
   </w:style>
-  <w:style w:type="paragraph" w:styleId="197">
+  <w:style w:type="paragraph" w:styleId="892">
     <w:name w:val="toc 9"/>
-    <w:basedOn w:val="664"/>
-    <w:next w:val="664"/>
+    <w:basedOn w:val="896"/>
+    <w:next w:val="896"/>
     <w:uiPriority w:val="39"/>
     <w:unhideWhenUsed/>
     <w:pPr>
@@ -32724,9 +32770,9 @@
       <w:ind w:left="1760"/>
     </w:pPr>
   </w:style>
-  <w:style w:type="character" w:styleId="198">
+  <w:style w:type="character" w:styleId="893">
     <w:name w:val="Placeholder Text"/>
-    <w:basedOn w:val="148"/>
+    <w:basedOn w:val="846"/>
     <w:uiPriority w:val="99"/>
     <w:semiHidden/>
     <w:pPr>
@@ -32738,7 +32784,7 @@
       <w:color w:val="666666"/>
     </w:rPr>
   </w:style>
-  <w:style w:type="paragraph" w:styleId="208">
+  <w:style w:type="paragraph" w:styleId="894">
     <w:name w:val="TOC Heading"/>
     <w:uiPriority w:val="39"/>
     <w:unhideWhenUsed/>
@@ -32748,10 +32794,10 @@
       <w:ind/>
     </w:pPr>
   </w:style>
-  <w:style w:type="paragraph" w:styleId="209">
+  <w:style w:type="paragraph" w:styleId="895">
     <w:name w:val="table of figures"/>
-    <w:basedOn w:val="664"/>
-    <w:next w:val="664"/>
+    <w:basedOn w:val="896"/>
+    <w:next w:val="896"/>
     <w:uiPriority w:val="99"/>
     <w:unhideWhenUsed/>
     <w:pPr>
@@ -32760,7 +32806,7 @@
       <w:ind/>
     </w:pPr>
   </w:style>
-  <w:style w:type="paragraph" w:styleId="664" w:default="1">
+  <w:style w:type="paragraph" w:styleId="896" w:default="1">
     <w:name w:val="Normal"/>
     <w:qFormat/>
     <w:pPr>
@@ -32769,7 +32815,7 @@
       <w:ind/>
     </w:pPr>
   </w:style>
-  <w:style w:type="table" w:styleId="665" w:default="1">
+  <w:style w:type="table" w:styleId="897" w:default="1">
     <w:name w:val="Normal Table"/>
     <w:uiPriority w:val="99"/>
     <w:semiHidden/>
@@ -32962,7 +33008,7 @@
       </w:tcPr>
     </w:tblStylePr>
   </w:style>
-  <w:style w:type="numbering" w:styleId="666" w:default="1">
+  <w:style w:type="numbering" w:styleId="898" w:default="1">
     <w:name w:val="No List"/>
     <w:uiPriority w:val="99"/>
     <w:semiHidden/>
@@ -32973,9 +33019,9 @@
       <w:ind/>
     </w:pPr>
   </w:style>
-  <w:style w:type="paragraph" w:styleId="667">
+  <w:style w:type="paragraph" w:styleId="899">
     <w:name w:val="No Spacing"/>
-    <w:basedOn w:val="664"/>
+    <w:basedOn w:val="896"/>
     <w:uiPriority w:val="1"/>
     <w:qFormat/>
     <w:pPr>
@@ -32984,9 +33030,9 @@
       <w:ind/>
     </w:pPr>
   </w:style>
-  <w:style w:type="paragraph" w:styleId="668">
+  <w:style w:type="paragraph" w:styleId="900">
     <w:name w:val="List Paragraph"/>
-    <w:basedOn w:val="664"/>
+    <w:basedOn w:val="896"/>
     <w:uiPriority w:val="34"/>
     <w:qFormat/>
     <w:pPr>

</xml_diff>